<commit_message>
Updated environment setup script and design doc
</commit_message>
<xml_diff>
--- a/audio-ML/speak-like-anyone-for-social-media/docs/TTS_Agent_Solution_Design.docx
+++ b/audio-ML/speak-like-anyone-for-social-media/docs/TTS_Agent_Solution_Design.docx
@@ -829,37 +829,12 @@
             <w:vAlign w:val="center"/>
           </w:tcPr>
           <w:p>
-            <w:proofErr w:type="spellStart"/>
-            <w:r>
-              <w:rPr>
-                <w:sz w:val="20"/>
-                <w:szCs w:val="20"/>
-              </w:rPr>
-              <w:t>WaveNet</w:t>
-            </w:r>
-            <w:proofErr w:type="spellEnd"/>
-            <w:r>
-              <w:rPr>
-                <w:sz w:val="20"/>
-                <w:szCs w:val="20"/>
-              </w:rPr>
-              <w:t xml:space="preserve">, </w:t>
-            </w:r>
-            <w:proofErr w:type="spellStart"/>
-            <w:r>
-              <w:rPr>
-                <w:sz w:val="20"/>
-                <w:szCs w:val="20"/>
-              </w:rPr>
-              <w:t>Tacotron</w:t>
-            </w:r>
-            <w:proofErr w:type="spellEnd"/>
-            <w:r>
-              <w:rPr>
-                <w:sz w:val="20"/>
-                <w:szCs w:val="20"/>
-              </w:rPr>
-              <w:t xml:space="preserve"> 2</w:t>
+            <w:r>
+              <w:rPr>
+                <w:sz w:val="20"/>
+                <w:szCs w:val="20"/>
+              </w:rPr>
+              <w:t>WaveNet, Tacotron 2</w:t>
             </w:r>
           </w:p>
         </w:tc>
@@ -970,21 +945,12 @@
             <w:vAlign w:val="center"/>
           </w:tcPr>
           <w:p>
-            <w:proofErr w:type="spellStart"/>
-            <w:r>
-              <w:rPr>
-                <w:sz w:val="20"/>
-                <w:szCs w:val="20"/>
-              </w:rPr>
-              <w:t>FastSpeech</w:t>
-            </w:r>
-            <w:proofErr w:type="spellEnd"/>
-            <w:r>
-              <w:rPr>
-                <w:sz w:val="20"/>
-                <w:szCs w:val="20"/>
-              </w:rPr>
-              <w:t xml:space="preserve"> 2, VITS</w:t>
+            <w:r>
+              <w:rPr>
+                <w:sz w:val="20"/>
+                <w:szCs w:val="20"/>
+              </w:rPr>
+              <w:t>FastSpeech 2, VITS</w:t>
             </w:r>
           </w:p>
         </w:tc>
@@ -1216,17 +1182,8 @@
                 <w:sz w:val="20"/>
                 <w:szCs w:val="20"/>
               </w:rPr>
-              <w:t xml:space="preserve">Grad-TTS, </w:t>
-            </w:r>
-            <w:proofErr w:type="spellStart"/>
-            <w:r>
-              <w:rPr>
-                <w:sz w:val="20"/>
-                <w:szCs w:val="20"/>
-              </w:rPr>
-              <w:t>Voicebox</w:t>
-            </w:r>
-            <w:proofErr w:type="spellEnd"/>
+              <w:t>Grad-TTS, Voicebox</w:t>
+            </w:r>
           </w:p>
         </w:tc>
         <w:tc>
@@ -1341,17 +1298,8 @@
                 <w:sz w:val="20"/>
                 <w:szCs w:val="20"/>
               </w:rPr>
-              <w:t xml:space="preserve">XTTS v2, </w:t>
-            </w:r>
-            <w:proofErr w:type="spellStart"/>
-            <w:r>
-              <w:rPr>
-                <w:sz w:val="20"/>
-                <w:szCs w:val="20"/>
-              </w:rPr>
-              <w:t>YourTTS</w:t>
-            </w:r>
-            <w:proofErr w:type="spellEnd"/>
+              <w:t>XTTS v2, YourTTS</w:t>
+            </w:r>
           </w:p>
         </w:tc>
         <w:tc>
@@ -1911,15 +1859,9 @@
         </w:numPr>
         <w:spacing w:after="80"/>
       </w:pPr>
-      <w:proofErr w:type="spellStart"/>
-      <w:r>
-        <w:t>Resampler</w:t>
-      </w:r>
-      <w:proofErr w:type="spellEnd"/>
-      <w:r>
-        <w:t xml:space="preserve">: </w:t>
-      </w:r>
-      <w:proofErr w:type="spellStart"/>
+      <w:r>
+        <w:t xml:space="preserve">Resampler: </w:t>
+      </w:r>
       <w:r>
         <w:rPr>
           <w:rFonts w:ascii="Courier New" w:eastAsia="Courier New" w:hAnsi="Courier New" w:cs="Courier New"/>
@@ -1928,7 +1870,6 @@
         </w:rPr>
         <w:t>scipy.signal.resample_poly</w:t>
       </w:r>
-      <w:proofErr w:type="spellEnd"/>
       <w:r>
         <w:t xml:space="preserve"> with anti-aliasing</w:t>
       </w:r>
@@ -1945,23 +1886,13 @@
       <w:r>
         <w:t xml:space="preserve">Configurable via API: </w:t>
       </w:r>
-      <w:proofErr w:type="spellStart"/>
-      <w:r>
-        <w:rPr>
-          <w:rFonts w:ascii="Courier New" w:eastAsia="Courier New" w:hAnsi="Courier New" w:cs="Courier New"/>
-          <w:sz w:val="20"/>
-          <w:szCs w:val="20"/>
-        </w:rPr>
-        <w:t>output_format</w:t>
-      </w:r>
-      <w:proofErr w:type="spellEnd"/>
-      <w:r>
-        <w:rPr>
-          <w:rFonts w:ascii="Courier New" w:eastAsia="Courier New" w:hAnsi="Courier New" w:cs="Courier New"/>
-          <w:sz w:val="20"/>
-          <w:szCs w:val="20"/>
-        </w:rPr>
-        <w:t>=wav44 | wav44_24bit | wav</w:t>
+      <w:r>
+        <w:rPr>
+          <w:rFonts w:ascii="Courier New" w:eastAsia="Courier New" w:hAnsi="Courier New" w:cs="Courier New"/>
+          <w:sz w:val="20"/>
+          <w:szCs w:val="20"/>
+        </w:rPr>
+        <w:t>output_format=wav44 | wav44_24bit | wav</w:t>
       </w:r>
       <w:r>
         <w:t xml:space="preserve"> (default 24 kHz mono)</w:t>
@@ -2003,36 +1934,10 @@
           <w:sz w:val="20"/>
           <w:szCs w:val="20"/>
         </w:rPr>
-        <w:t xml:space="preserve">&lt;pause </w:t>
-      </w:r>
-      <w:proofErr w:type="spellStart"/>
-      <w:r>
-        <w:rPr>
-          <w:rFonts w:ascii="Courier New" w:eastAsia="Courier New" w:hAnsi="Courier New" w:cs="Courier New"/>
-          <w:sz w:val="20"/>
-          <w:szCs w:val="20"/>
-        </w:rPr>
-        <w:t>ms</w:t>
-      </w:r>
-      <w:proofErr w:type="spellEnd"/>
-      <w:r>
-        <w:rPr>
-          <w:rFonts w:ascii="Courier New" w:eastAsia="Courier New" w:hAnsi="Courier New" w:cs="Courier New"/>
-          <w:sz w:val="20"/>
-          <w:szCs w:val="20"/>
-        </w:rPr>
-        <w:t>="500"/&gt;</w:t>
-      </w:r>
-      <w:r>
-        <w:t xml:space="preserve"> — insert silence of specified duration (50–5000 </w:t>
-      </w:r>
-      <w:proofErr w:type="spellStart"/>
-      <w:r>
-        <w:t>ms</w:t>
-      </w:r>
-      <w:proofErr w:type="spellEnd"/>
-      <w:r>
-        <w:t>)</w:t>
+        <w:t>&lt;pause ms="500"/&gt;</w:t>
+      </w:r>
+      <w:r>
+        <w:t xml:space="preserve"> — insert silence of specified duration (50–5000 ms)</w:t>
       </w:r>
     </w:p>
     <w:p>
@@ -2095,15 +2000,7 @@
         <w:t>&lt;break strength="paragraph"/&gt;</w:t>
       </w:r>
       <w:r>
-        <w:t xml:space="preserve"> — 800 </w:t>
-      </w:r>
-      <w:proofErr w:type="spellStart"/>
-      <w:r>
-        <w:t>ms</w:t>
-      </w:r>
-      <w:proofErr w:type="spellEnd"/>
-      <w:r>
-        <w:t xml:space="preserve"> pause</w:t>
+        <w:t xml:space="preserve"> — 800 ms pause</w:t>
       </w:r>
     </w:p>
     <w:p>
@@ -2202,7 +2099,6 @@
       <w:r>
         <w:t xml:space="preserve">Long-running jobs return a </w:t>
       </w:r>
-      <w:proofErr w:type="spellStart"/>
       <w:r>
         <w:rPr>
           <w:rFonts w:ascii="Courier New" w:eastAsia="Courier New" w:hAnsi="Courier New" w:cs="Courier New"/>
@@ -2211,7 +2107,6 @@
         </w:rPr>
         <w:t>job_id</w:t>
       </w:r>
-      <w:proofErr w:type="spellEnd"/>
       <w:r>
         <w:t xml:space="preserve">; status polled via </w:t>
       </w:r>
@@ -2221,25 +2116,7 @@
           <w:sz w:val="20"/>
           <w:szCs w:val="20"/>
         </w:rPr>
-        <w:t>GET /batch-status/{</w:t>
-      </w:r>
-      <w:proofErr w:type="spellStart"/>
-      <w:r>
-        <w:rPr>
-          <w:rFonts w:ascii="Courier New" w:eastAsia="Courier New" w:hAnsi="Courier New" w:cs="Courier New"/>
-          <w:sz w:val="20"/>
-          <w:szCs w:val="20"/>
-        </w:rPr>
-        <w:t>job_id</w:t>
-      </w:r>
-      <w:proofErr w:type="spellEnd"/>
-      <w:r>
-        <w:rPr>
-          <w:rFonts w:ascii="Courier New" w:eastAsia="Courier New" w:hAnsi="Courier New" w:cs="Courier New"/>
-          <w:sz w:val="20"/>
-          <w:szCs w:val="20"/>
-        </w:rPr>
-        <w:t>}</w:t>
+        <w:t>GET /batch-status/{job_id}</w:t>
       </w:r>
     </w:p>
     <w:p>
@@ -2280,7 +2157,6 @@
       <w:r>
         <w:t xml:space="preserve">Noise reduction: </w:t>
       </w:r>
-      <w:proofErr w:type="spellStart"/>
       <w:r>
         <w:rPr>
           <w:rFonts w:ascii="Courier New" w:eastAsia="Courier New" w:hAnsi="Courier New" w:cs="Courier New"/>
@@ -2289,7 +2165,6 @@
         </w:rPr>
         <w:t>noisereduce</w:t>
       </w:r>
-      <w:proofErr w:type="spellEnd"/>
       <w:r>
         <w:t xml:space="preserve"> (spectral subtraction)</w:t>
       </w:r>
@@ -2332,7 +2207,6 @@
       <w:r>
         <w:t xml:space="preserve">Loudness measurement: </w:t>
       </w:r>
-      <w:proofErr w:type="spellStart"/>
       <w:r>
         <w:rPr>
           <w:rFonts w:ascii="Courier New" w:eastAsia="Courier New" w:hAnsi="Courier New" w:cs="Courier New"/>
@@ -2341,7 +2215,6 @@
         </w:rPr>
         <w:t>pyloudnorm</w:t>
       </w:r>
-      <w:proofErr w:type="spellEnd"/>
       <w:r>
         <w:t xml:space="preserve"> (EBU R128 / ITU-R BS.1770-4 compliant)</w:t>
       </w:r>
@@ -2430,15 +2303,7 @@
         <w:t xml:space="preserve">Model interchangeability: </w:t>
       </w:r>
       <w:r>
-        <w:t xml:space="preserve">All engines implement a common </w:t>
-      </w:r>
-      <w:proofErr w:type="spellStart"/>
-      <w:r>
-        <w:t>TTSEngine</w:t>
-      </w:r>
-      <w:proofErr w:type="spellEnd"/>
-      <w:r>
-        <w:t xml:space="preserve"> contract — swappable without API changes</w:t>
+        <w:t>All engines implement a common TTSEngine contract — swappable without API changes</w:t>
       </w:r>
     </w:p>
     <w:p>
@@ -2458,23 +2323,7 @@
         <w:t xml:space="preserve">Thread safety: </w:t>
       </w:r>
       <w:r>
-        <w:t xml:space="preserve">XTTS v2 </w:t>
-      </w:r>
-      <w:proofErr w:type="spellStart"/>
-      <w:r>
-        <w:t>model.tts</w:t>
-      </w:r>
-      <w:proofErr w:type="spellEnd"/>
-      <w:r>
-        <w:t xml:space="preserve">() is not thread-safe; a </w:t>
-      </w:r>
-      <w:proofErr w:type="spellStart"/>
-      <w:r>
-        <w:t>threading.Lock</w:t>
-      </w:r>
-      <w:proofErr w:type="spellEnd"/>
-      <w:r>
-        <w:t xml:space="preserve"> serialises concurrent synthesis calls</w:t>
+        <w:t>XTTS v2 model.tts() is not thread-safe; a threading.Lock serialises concurrent synthesis calls</w:t>
       </w:r>
     </w:p>
     <w:p>
@@ -3008,31 +2857,13 @@
             <w:vAlign w:val="center"/>
           </w:tcPr>
           <w:p>
-            <w:proofErr w:type="spellStart"/>
-            <w:r>
-              <w:rPr>
-                <w:sz w:val="20"/>
-                <w:szCs w:val="20"/>
-              </w:rPr>
-              <w:t>FastAPI</w:t>
-            </w:r>
-            <w:proofErr w:type="spellEnd"/>
-            <w:r>
-              <w:rPr>
-                <w:sz w:val="20"/>
-                <w:szCs w:val="20"/>
-              </w:rPr>
-              <w:t xml:space="preserve"> + </w:t>
-            </w:r>
-            <w:proofErr w:type="spellStart"/>
-            <w:r>
-              <w:rPr>
-                <w:sz w:val="20"/>
-                <w:szCs w:val="20"/>
-              </w:rPr>
-              <w:t>Uvicorn</w:t>
-            </w:r>
-            <w:proofErr w:type="spellEnd"/>
+            <w:r>
+              <w:rPr>
+                <w:sz w:val="20"/>
+                <w:szCs w:val="20"/>
+              </w:rPr>
+              <w:t>FastAPI + Uvicorn</w:t>
+            </w:r>
           </w:p>
         </w:tc>
         <w:tc>
@@ -3258,63 +3089,13 @@
             <w:vAlign w:val="center"/>
           </w:tcPr>
           <w:p>
-            <w:proofErr w:type="spellStart"/>
-            <w:r>
-              <w:rPr>
-                <w:sz w:val="20"/>
-                <w:szCs w:val="20"/>
-              </w:rPr>
-              <w:t>soundfile</w:t>
-            </w:r>
-            <w:proofErr w:type="spellEnd"/>
-            <w:r>
-              <w:rPr>
-                <w:sz w:val="20"/>
-                <w:szCs w:val="20"/>
-              </w:rPr>
-              <w:t xml:space="preserve">, </w:t>
-            </w:r>
-            <w:proofErr w:type="spellStart"/>
-            <w:r>
-              <w:rPr>
-                <w:sz w:val="20"/>
-                <w:szCs w:val="20"/>
-              </w:rPr>
-              <w:t>scipy</w:t>
-            </w:r>
-            <w:proofErr w:type="spellEnd"/>
-            <w:r>
-              <w:rPr>
-                <w:sz w:val="20"/>
-                <w:szCs w:val="20"/>
-              </w:rPr>
-              <w:t xml:space="preserve">, </w:t>
-            </w:r>
-            <w:proofErr w:type="spellStart"/>
-            <w:r>
-              <w:rPr>
-                <w:sz w:val="20"/>
-                <w:szCs w:val="20"/>
-              </w:rPr>
-              <w:t>pyloudnorm</w:t>
-            </w:r>
-            <w:proofErr w:type="spellEnd"/>
-            <w:r>
-              <w:rPr>
-                <w:sz w:val="20"/>
-                <w:szCs w:val="20"/>
-              </w:rPr>
-              <w:t xml:space="preserve">, </w:t>
-            </w:r>
-            <w:proofErr w:type="spellStart"/>
-            <w:r>
-              <w:rPr>
-                <w:sz w:val="20"/>
-                <w:szCs w:val="20"/>
-              </w:rPr>
-              <w:t>noisereduce</w:t>
-            </w:r>
-            <w:proofErr w:type="spellEnd"/>
+            <w:r>
+              <w:rPr>
+                <w:sz w:val="20"/>
+                <w:szCs w:val="20"/>
+              </w:rPr>
+              <w:t>soundfile, scipy, pyloudnorm, noisereduce</w:t>
+            </w:r>
           </w:p>
         </w:tc>
         <w:tc>
@@ -3429,33 +3210,8 @@
                 <w:sz w:val="20"/>
                 <w:szCs w:val="20"/>
               </w:rPr>
-              <w:t xml:space="preserve">cutlet, </w:t>
-            </w:r>
-            <w:proofErr w:type="spellStart"/>
-            <w:r>
-              <w:rPr>
-                <w:sz w:val="20"/>
-                <w:szCs w:val="20"/>
-              </w:rPr>
-              <w:t>fugashi</w:t>
-            </w:r>
-            <w:proofErr w:type="spellEnd"/>
-            <w:r>
-              <w:rPr>
-                <w:sz w:val="20"/>
-                <w:szCs w:val="20"/>
-              </w:rPr>
-              <w:t xml:space="preserve">, </w:t>
-            </w:r>
-            <w:proofErr w:type="spellStart"/>
-            <w:r>
-              <w:rPr>
-                <w:sz w:val="20"/>
-                <w:szCs w:val="20"/>
-              </w:rPr>
-              <w:t>unidic</w:t>
-            </w:r>
-            <w:proofErr w:type="spellEnd"/>
+              <w:t>cutlet, fugashi, unidic</w:t>
+            </w:r>
           </w:p>
         </w:tc>
         <w:tc>
@@ -3756,57 +3512,15 @@
         <w:pStyle w:val="Heading2"/>
       </w:pPr>
       <w:r>
-        <w:t xml:space="preserve">6.1 </w:t>
-      </w:r>
-      <w:proofErr w:type="spellStart"/>
-      <w:r>
-        <w:t>FastAPI</w:t>
-      </w:r>
-      <w:proofErr w:type="spellEnd"/>
-      <w:r>
-        <w:t xml:space="preserve"> + </w:t>
-      </w:r>
-      <w:proofErr w:type="spellStart"/>
-      <w:r>
-        <w:t>Uvicorn</w:t>
-      </w:r>
-      <w:proofErr w:type="spellEnd"/>
+        <w:t>6.1 FastAPI + Uvicorn</w:t>
+      </w:r>
     </w:p>
     <w:p>
       <w:pPr>
         <w:spacing w:after="120"/>
       </w:pPr>
-      <w:proofErr w:type="spellStart"/>
-      <w:r>
-        <w:t>FastAPI</w:t>
-      </w:r>
-      <w:proofErr w:type="spellEnd"/>
-      <w:r>
-        <w:t xml:space="preserve"> is a modern Python web framework built on Starlette and </w:t>
-      </w:r>
-      <w:proofErr w:type="spellStart"/>
-      <w:r>
-        <w:t>Pydantic</w:t>
-      </w:r>
-      <w:proofErr w:type="spellEnd"/>
-      <w:r>
-        <w:t xml:space="preserve">. </w:t>
-      </w:r>
-      <w:proofErr w:type="spellStart"/>
-      <w:r>
-        <w:t>Uvicorn</w:t>
-      </w:r>
-      <w:proofErr w:type="spellEnd"/>
-      <w:r>
-        <w:t xml:space="preserve"> is the ASGI server. Together they provide automatic request validation, </w:t>
-      </w:r>
-      <w:proofErr w:type="spellStart"/>
-      <w:r>
-        <w:t>OpenAPI</w:t>
-      </w:r>
-      <w:proofErr w:type="spellEnd"/>
-      <w:r>
-        <w:t xml:space="preserve"> documentation at /docs, and async request handling.</w:t>
+      <w:r>
+        <w:t>FastAPI is a modern Python web framework built on Starlette and Pydantic. Uvicorn is the ASGI server. Together they provide automatic request validation, OpenAPI documentation at /docs, and async request handling.</w:t>
       </w:r>
     </w:p>
     <w:p>
@@ -3833,16 +3547,20 @@
         <w:shd w:val="clear" w:color="auto" w:fill="F5F5F5"/>
         <w:ind w:left="360"/>
       </w:pPr>
-      <w:proofErr w:type="spellStart"/>
-      <w:r>
-        <w:rPr>
-          <w:rFonts w:ascii="Courier New" w:eastAsia="Courier New" w:hAnsi="Courier New" w:cs="Courier New"/>
-          <w:sz w:val="20"/>
-          <w:szCs w:val="20"/>
-        </w:rPr>
-        <w:t>uvicorn</w:t>
-      </w:r>
-      <w:proofErr w:type="spellEnd"/>
+      <w:r>
+        <w:rPr>
+          <w:rFonts w:ascii="Courier New" w:eastAsia="Courier New" w:hAnsi="Courier New" w:cs="Courier New"/>
+          <w:sz w:val="20"/>
+          <w:szCs w:val="20"/>
+        </w:rPr>
+        <w:t>uvicorn backend.app:app --host 0.0.0.0 --port 8000 --reload</w:t>
+      </w:r>
+    </w:p>
+    <w:p>
+      <w:pPr>
+        <w:shd w:val="clear" w:color="auto" w:fill="F5F5F5"/>
+        <w:ind w:left="360"/>
+      </w:pPr>
       <w:r>
         <w:rPr>
           <w:rFonts w:ascii="Courier New" w:eastAsia="Courier New" w:hAnsi="Courier New" w:cs="Courier New"/>
@@ -3851,38 +3569,6 @@
         </w:rPr>
         <w:t xml:space="preserve"> </w:t>
       </w:r>
-      <w:proofErr w:type="spellStart"/>
-      <w:r>
-        <w:rPr>
-          <w:rFonts w:ascii="Courier New" w:eastAsia="Courier New" w:hAnsi="Courier New" w:cs="Courier New"/>
-          <w:sz w:val="20"/>
-          <w:szCs w:val="20"/>
-        </w:rPr>
-        <w:t>backend.app:app</w:t>
-      </w:r>
-      <w:proofErr w:type="spellEnd"/>
-      <w:r>
-        <w:rPr>
-          <w:rFonts w:ascii="Courier New" w:eastAsia="Courier New" w:hAnsi="Courier New" w:cs="Courier New"/>
-          <w:sz w:val="20"/>
-          <w:szCs w:val="20"/>
-        </w:rPr>
-        <w:t xml:space="preserve"> --host 0.0.0.0 --port 8000 --reload</w:t>
-      </w:r>
-    </w:p>
-    <w:p>
-      <w:pPr>
-        <w:shd w:val="clear" w:color="auto" w:fill="F5F5F5"/>
-        <w:ind w:left="360"/>
-      </w:pPr>
-      <w:r>
-        <w:rPr>
-          <w:rFonts w:ascii="Courier New" w:eastAsia="Courier New" w:hAnsi="Courier New" w:cs="Courier New"/>
-          <w:sz w:val="20"/>
-          <w:szCs w:val="20"/>
-        </w:rPr>
-        <w:t xml:space="preserve"> </w:t>
-      </w:r>
     </w:p>
     <w:p>
       <w:pPr>
@@ -3909,61 +3595,7 @@
           <w:sz w:val="20"/>
           <w:szCs w:val="20"/>
         </w:rPr>
-        <w:t xml:space="preserve">make stop   # or: </w:t>
-      </w:r>
-      <w:proofErr w:type="spellStart"/>
-      <w:r>
-        <w:rPr>
-          <w:rFonts w:ascii="Courier New" w:eastAsia="Courier New" w:hAnsi="Courier New" w:cs="Courier New"/>
-          <w:sz w:val="20"/>
-          <w:szCs w:val="20"/>
-        </w:rPr>
-        <w:t>pkill</w:t>
-      </w:r>
-      <w:proofErr w:type="spellEnd"/>
-      <w:r>
-        <w:rPr>
-          <w:rFonts w:ascii="Courier New" w:eastAsia="Courier New" w:hAnsi="Courier New" w:cs="Courier New"/>
-          <w:sz w:val="20"/>
-          <w:szCs w:val="20"/>
-        </w:rPr>
-        <w:t xml:space="preserve"> -f "</w:t>
-      </w:r>
-      <w:proofErr w:type="spellStart"/>
-      <w:r>
-        <w:rPr>
-          <w:rFonts w:ascii="Courier New" w:eastAsia="Courier New" w:hAnsi="Courier New" w:cs="Courier New"/>
-          <w:sz w:val="20"/>
-          <w:szCs w:val="20"/>
-        </w:rPr>
-        <w:t>uvicorn</w:t>
-      </w:r>
-      <w:proofErr w:type="spellEnd"/>
-      <w:r>
-        <w:rPr>
-          <w:rFonts w:ascii="Courier New" w:eastAsia="Courier New" w:hAnsi="Courier New" w:cs="Courier New"/>
-          <w:sz w:val="20"/>
-          <w:szCs w:val="20"/>
-        </w:rPr>
-        <w:t xml:space="preserve"> </w:t>
-      </w:r>
-      <w:proofErr w:type="spellStart"/>
-      <w:r>
-        <w:rPr>
-          <w:rFonts w:ascii="Courier New" w:eastAsia="Courier New" w:hAnsi="Courier New" w:cs="Courier New"/>
-          <w:sz w:val="20"/>
-          <w:szCs w:val="20"/>
-        </w:rPr>
-        <w:t>backend.app</w:t>
-      </w:r>
-      <w:proofErr w:type="spellEnd"/>
-      <w:r>
-        <w:rPr>
-          <w:rFonts w:ascii="Courier New" w:eastAsia="Courier New" w:hAnsi="Courier New" w:cs="Courier New"/>
-          <w:sz w:val="20"/>
-          <w:szCs w:val="20"/>
-        </w:rPr>
-        <w:t>"</w:t>
+        <w:t>make stop   # or: pkill -f "uvicorn backend.app"</w:t>
       </w:r>
     </w:p>
     <w:p>
@@ -4112,25 +3744,7 @@
           <w:sz w:val="20"/>
           <w:szCs w:val="20"/>
         </w:rPr>
-        <w:t xml:space="preserve">│               </w:t>
-      </w:r>
-      <w:proofErr w:type="spellStart"/>
-      <w:r>
-        <w:rPr>
-          <w:rFonts w:ascii="Courier New" w:eastAsia="Courier New" w:hAnsi="Courier New" w:cs="Courier New"/>
-          <w:sz w:val="20"/>
-          <w:szCs w:val="20"/>
-        </w:rPr>
-        <w:t>FastAPI</w:t>
-      </w:r>
-      <w:proofErr w:type="spellEnd"/>
-      <w:r>
-        <w:rPr>
-          <w:rFonts w:ascii="Courier New" w:eastAsia="Courier New" w:hAnsi="Courier New" w:cs="Courier New"/>
-          <w:sz w:val="20"/>
-          <w:szCs w:val="20"/>
-        </w:rPr>
-        <w:t xml:space="preserve"> — routes.py                          │</w:t>
+        <w:t>│               FastAPI — routes.py                          │</w:t>
       </w:r>
     </w:p>
     <w:p>
@@ -4405,7 +4019,6 @@
       <w:r>
         <w:t xml:space="preserve">Requests with voice starting with </w:t>
       </w:r>
-      <w:proofErr w:type="gramStart"/>
       <w:r>
         <w:rPr>
           <w:rFonts w:ascii="Courier New" w:eastAsia="Courier New" w:hAnsi="Courier New" w:cs="Courier New"/>
@@ -4414,7 +4027,6 @@
         </w:rPr>
         <w:t>clone:</w:t>
       </w:r>
-      <w:proofErr w:type="gramEnd"/>
       <w:r>
         <w:t xml:space="preserve"> are routed to XTTS v2. All other voice IDs are routed to Kokoro.</w:t>
       </w:r>
@@ -4432,39 +4044,7 @@
         <w:spacing w:after="120"/>
       </w:pPr>
       <w:r>
-        <w:t xml:space="preserve">XTTS v2's </w:t>
-      </w:r>
-      <w:proofErr w:type="spellStart"/>
-      <w:r>
-        <w:t>model.tts</w:t>
-      </w:r>
-      <w:proofErr w:type="spellEnd"/>
-      <w:r>
-        <w:t xml:space="preserve">() is not </w:t>
-      </w:r>
-      <w:proofErr w:type="gramStart"/>
-      <w:r>
-        <w:t>thread-safe</w:t>
-      </w:r>
-      <w:proofErr w:type="gramEnd"/>
-      <w:r>
-        <w:t xml:space="preserve">. The engine uses a </w:t>
-      </w:r>
-      <w:proofErr w:type="spellStart"/>
-      <w:r>
-        <w:t>threading.Lock</w:t>
-      </w:r>
-      <w:proofErr w:type="spellEnd"/>
-      <w:r>
-        <w:t xml:space="preserve"> (</w:t>
-      </w:r>
-      <w:proofErr w:type="spellStart"/>
-      <w:r>
-        <w:t>inference_lock</w:t>
-      </w:r>
-      <w:proofErr w:type="spellEnd"/>
-      <w:r>
-        <w:t>) to serialise concurrent synthesis calls. When "Run All" tests fire simultaneously, requests queue and are processed one at a time. Model initialisation also uses a separate lock with double-checked locking to prevent duplicate loads.</w:t>
+        <w:t>XTTS v2's model.tts() is not thread-safe. The engine uses a threading.Lock (inference_lock) to serialise concurrent synthesis calls. When "Run All" tests fire simultaneously, requests queue and are processed one at a time. Model initialisation also uses a separate lock with double-checked locking to prevent duplicate loads.</w:t>
       </w:r>
     </w:p>
     <w:p>
@@ -4928,23 +4508,7 @@
         <w:spacing w:after="120"/>
       </w:pPr>
       <w:r>
-        <w:t xml:space="preserve">The built-in </w:t>
-      </w:r>
-      <w:proofErr w:type="spellStart"/>
-      <w:r>
-        <w:t>pysbd</w:t>
-      </w:r>
-      <w:proofErr w:type="spellEnd"/>
-      <w:r>
-        <w:t xml:space="preserve"> sentence splitter does not recognise Devanagari </w:t>
-      </w:r>
-      <w:proofErr w:type="spellStart"/>
-      <w:r>
-        <w:t>danda</w:t>
-      </w:r>
-      <w:proofErr w:type="spellEnd"/>
-      <w:r>
-        <w:t xml:space="preserve"> (।) for Hindi or Japanese punctuation (。！？). The engine pre-splits text before synthesis:</w:t>
+        <w:t>The built-in pysbd sentence splitter does not recognise Devanagari danda (।) for Hindi or Japanese punctuation (。！？). The engine pre-splits text before synthesis:</w:t>
       </w:r>
     </w:p>
     <w:p>
@@ -5004,15 +4568,7 @@
         <w:t>All other languages</w:t>
       </w:r>
       <w:r>
-        <w:t xml:space="preserve">: </w:t>
-      </w:r>
-      <w:proofErr w:type="spellStart"/>
-      <w:r>
-        <w:t>pysbd</w:t>
-      </w:r>
-      <w:proofErr w:type="spellEnd"/>
-      <w:r>
-        <w:t xml:space="preserve"> handles splitting natively</w:t>
+        <w:t>: pysbd handles splitting natively</w:t>
       </w:r>
     </w:p>
     <w:p>
@@ -5025,60 +4581,15 @@
         <w:pStyle w:val="Heading2"/>
       </w:pPr>
       <w:r>
-        <w:t xml:space="preserve">8.4 </w:t>
-      </w:r>
-      <w:proofErr w:type="spellStart"/>
-      <w:r>
-        <w:t>torchaudio</w:t>
-      </w:r>
-      <w:proofErr w:type="spellEnd"/>
-      <w:r>
-        <w:t xml:space="preserve"> Compatibility</w:t>
+        <w:t>8.4 torchaudio Compatibility</w:t>
       </w:r>
     </w:p>
     <w:p>
       <w:pPr>
         <w:spacing w:after="120"/>
       </w:pPr>
-      <w:proofErr w:type="spellStart"/>
-      <w:r>
-        <w:t>torchaudio</w:t>
-      </w:r>
-      <w:proofErr w:type="spellEnd"/>
-      <w:r>
-        <w:t xml:space="preserve"> ≥2.9 replaced its audio backend with </w:t>
-      </w:r>
-      <w:proofErr w:type="spellStart"/>
-      <w:r>
-        <w:t>TorchCodec</w:t>
-      </w:r>
-      <w:proofErr w:type="spellEnd"/>
-      <w:r>
-        <w:t xml:space="preserve">. If </w:t>
-      </w:r>
-      <w:proofErr w:type="spellStart"/>
-      <w:r>
-        <w:t>TorchCodec</w:t>
-      </w:r>
-      <w:proofErr w:type="spellEnd"/>
-      <w:r>
-        <w:t xml:space="preserve"> is not installed (common on macOS MPS environments), the engine automatically patches </w:t>
-      </w:r>
-      <w:proofErr w:type="spellStart"/>
-      <w:r>
-        <w:t>torchaudio.load</w:t>
-      </w:r>
-      <w:proofErr w:type="spellEnd"/>
-      <w:r>
-        <w:t xml:space="preserve"> to use </w:t>
-      </w:r>
-      <w:proofErr w:type="spellStart"/>
-      <w:r>
-        <w:t>soundfile</w:t>
-      </w:r>
-      <w:proofErr w:type="spellEnd"/>
-      <w:r>
-        <w:t>, which provides identical functionality.</w:t>
+      <w:r>
+        <w:t>torchaudio ≥2.9 replaced its audio backend with TorchCodec. If TorchCodec is not installed (common on macOS MPS environments), the engine automatically patches torchaudio.load to use soundfile, which provides identical functionality.</w:t>
       </w:r>
     </w:p>
     <w:p>
@@ -5125,15 +4636,7 @@
         <w:spacing w:after="120"/>
       </w:pPr>
       <w:r>
-        <w:t>Kokoro-82M ships with 54 ready-to-use voices across 9 languages. Each voice is tied to a language pipeline (</w:t>
-      </w:r>
-      <w:proofErr w:type="spellStart"/>
-      <w:r>
-        <w:t>lang_code</w:t>
-      </w:r>
-      <w:proofErr w:type="spellEnd"/>
-      <w:r>
-        <w:t>).</w:t>
+        <w:t>Kokoro-82M ships with 54 ready-to-use voices across 9 languages. Each voice is tied to a language pipeline (lang_code).</w:t>
       </w:r>
     </w:p>
     <w:tbl>
@@ -5187,7 +4690,6 @@
             <w:vAlign w:val="center"/>
           </w:tcPr>
           <w:p>
-            <w:proofErr w:type="spellStart"/>
             <w:r>
               <w:rPr>
                 <w:b/>
@@ -5197,7 +4699,6 @@
               </w:rPr>
               <w:t>lang_code</w:t>
             </w:r>
-            <w:proofErr w:type="spellEnd"/>
           </w:p>
         </w:tc>
         <w:tc>
@@ -5340,69 +4841,12 @@
             <w:vAlign w:val="center"/>
           </w:tcPr>
           <w:p>
-            <w:proofErr w:type="spellStart"/>
-            <w:r>
-              <w:rPr>
-                <w:sz w:val="20"/>
-                <w:szCs w:val="20"/>
-              </w:rPr>
-              <w:t>af_heart</w:t>
-            </w:r>
-            <w:proofErr w:type="spellEnd"/>
-            <w:r>
-              <w:rPr>
-                <w:sz w:val="20"/>
-                <w:szCs w:val="20"/>
-              </w:rPr>
-              <w:t xml:space="preserve"> ★, </w:t>
-            </w:r>
-            <w:proofErr w:type="spellStart"/>
-            <w:r>
-              <w:rPr>
-                <w:sz w:val="20"/>
-                <w:szCs w:val="20"/>
-              </w:rPr>
-              <w:t>af_bella</w:t>
-            </w:r>
-            <w:proofErr w:type="spellEnd"/>
-            <w:r>
-              <w:rPr>
-                <w:sz w:val="20"/>
-                <w:szCs w:val="20"/>
-              </w:rPr>
-              <w:t xml:space="preserve"> ★, </w:t>
-            </w:r>
-            <w:proofErr w:type="spellStart"/>
-            <w:r>
-              <w:rPr>
-                <w:sz w:val="20"/>
-                <w:szCs w:val="20"/>
-              </w:rPr>
-              <w:t>am_fenrir</w:t>
-            </w:r>
-            <w:proofErr w:type="spellEnd"/>
-            <w:r>
-              <w:rPr>
-                <w:sz w:val="20"/>
-                <w:szCs w:val="20"/>
-              </w:rPr>
-              <w:t xml:space="preserve"> ★, </w:t>
-            </w:r>
-            <w:proofErr w:type="spellStart"/>
-            <w:r>
-              <w:rPr>
-                <w:sz w:val="20"/>
-                <w:szCs w:val="20"/>
-              </w:rPr>
-              <w:t>am_puck</w:t>
-            </w:r>
-            <w:proofErr w:type="spellEnd"/>
-            <w:r>
-              <w:rPr>
-                <w:sz w:val="20"/>
-                <w:szCs w:val="20"/>
-              </w:rPr>
-              <w:t xml:space="preserve"> ★</w:t>
+            <w:r>
+              <w:rPr>
+                <w:sz w:val="20"/>
+                <w:szCs w:val="20"/>
+              </w:rPr>
+              <w:t>af_heart ★, af_bella ★, am_fenrir ★, am_puck ★</w:t>
             </w:r>
           </w:p>
         </w:tc>
@@ -5486,37 +4930,12 @@
             <w:vAlign w:val="center"/>
           </w:tcPr>
           <w:p>
-            <w:proofErr w:type="spellStart"/>
-            <w:r>
-              <w:rPr>
-                <w:sz w:val="20"/>
-                <w:szCs w:val="20"/>
-              </w:rPr>
-              <w:t>bf_emma</w:t>
-            </w:r>
-            <w:proofErr w:type="spellEnd"/>
-            <w:r>
-              <w:rPr>
-                <w:sz w:val="20"/>
-                <w:szCs w:val="20"/>
-              </w:rPr>
-              <w:t xml:space="preserve"> ★, </w:t>
-            </w:r>
-            <w:proofErr w:type="spellStart"/>
-            <w:r>
-              <w:rPr>
-                <w:sz w:val="20"/>
-                <w:szCs w:val="20"/>
-              </w:rPr>
-              <w:t>bm_george</w:t>
-            </w:r>
-            <w:proofErr w:type="spellEnd"/>
-            <w:r>
-              <w:rPr>
-                <w:sz w:val="20"/>
-                <w:szCs w:val="20"/>
-              </w:rPr>
-              <w:t xml:space="preserve"> ★</w:t>
+            <w:r>
+              <w:rPr>
+                <w:sz w:val="20"/>
+                <w:szCs w:val="20"/>
+              </w:rPr>
+              <w:t>bf_emma ★, bm_george ★</w:t>
             </w:r>
           </w:p>
         </w:tc>
@@ -5600,63 +5019,13 @@
             <w:vAlign w:val="center"/>
           </w:tcPr>
           <w:p>
-            <w:proofErr w:type="spellStart"/>
-            <w:r>
-              <w:rPr>
-                <w:sz w:val="20"/>
-                <w:szCs w:val="20"/>
-              </w:rPr>
-              <w:t>hf_alpha</w:t>
-            </w:r>
-            <w:proofErr w:type="spellEnd"/>
-            <w:r>
-              <w:rPr>
-                <w:sz w:val="20"/>
-                <w:szCs w:val="20"/>
-              </w:rPr>
-              <w:t xml:space="preserve">, </w:t>
-            </w:r>
-            <w:proofErr w:type="spellStart"/>
-            <w:r>
-              <w:rPr>
-                <w:sz w:val="20"/>
-                <w:szCs w:val="20"/>
-              </w:rPr>
-              <w:t>hf_beta</w:t>
-            </w:r>
-            <w:proofErr w:type="spellEnd"/>
-            <w:r>
-              <w:rPr>
-                <w:sz w:val="20"/>
-                <w:szCs w:val="20"/>
-              </w:rPr>
-              <w:t xml:space="preserve">, </w:t>
-            </w:r>
-            <w:proofErr w:type="spellStart"/>
-            <w:r>
-              <w:rPr>
-                <w:sz w:val="20"/>
-                <w:szCs w:val="20"/>
-              </w:rPr>
-              <w:t>hm_omega</w:t>
-            </w:r>
-            <w:proofErr w:type="spellEnd"/>
-            <w:r>
-              <w:rPr>
-                <w:sz w:val="20"/>
-                <w:szCs w:val="20"/>
-              </w:rPr>
-              <w:t xml:space="preserve">, </w:t>
-            </w:r>
-            <w:proofErr w:type="spellStart"/>
-            <w:r>
-              <w:rPr>
-                <w:sz w:val="20"/>
-                <w:szCs w:val="20"/>
-              </w:rPr>
-              <w:t>hm_psi</w:t>
-            </w:r>
-            <w:proofErr w:type="spellEnd"/>
+            <w:r>
+              <w:rPr>
+                <w:sz w:val="20"/>
+                <w:szCs w:val="20"/>
+              </w:rPr>
+              <w:t>hf_alpha, hf_beta, hm_omega, hm_psi</w:t>
+            </w:r>
           </w:p>
         </w:tc>
       </w:tr>
@@ -5739,31 +5108,13 @@
             <w:vAlign w:val="center"/>
           </w:tcPr>
           <w:p>
-            <w:proofErr w:type="spellStart"/>
-            <w:r>
-              <w:rPr>
-                <w:sz w:val="20"/>
-                <w:szCs w:val="20"/>
-              </w:rPr>
-              <w:t>ef_dora</w:t>
-            </w:r>
-            <w:proofErr w:type="spellEnd"/>
-            <w:r>
-              <w:rPr>
-                <w:sz w:val="20"/>
-                <w:szCs w:val="20"/>
-              </w:rPr>
-              <w:t xml:space="preserve">, </w:t>
-            </w:r>
-            <w:proofErr w:type="spellStart"/>
-            <w:r>
-              <w:rPr>
-                <w:sz w:val="20"/>
-                <w:szCs w:val="20"/>
-              </w:rPr>
-              <w:t>em_alex</w:t>
-            </w:r>
-            <w:proofErr w:type="spellEnd"/>
+            <w:r>
+              <w:rPr>
+                <w:sz w:val="20"/>
+                <w:szCs w:val="20"/>
+              </w:rPr>
+              <w:t>ef_dora, em_alex</w:t>
+            </w:r>
           </w:p>
         </w:tc>
       </w:tr>
@@ -5846,21 +5197,12 @@
             <w:vAlign w:val="center"/>
           </w:tcPr>
           <w:p>
-            <w:proofErr w:type="spellStart"/>
-            <w:r>
-              <w:rPr>
-                <w:sz w:val="20"/>
-                <w:szCs w:val="20"/>
-              </w:rPr>
-              <w:t>ff_siwis</w:t>
-            </w:r>
-            <w:proofErr w:type="spellEnd"/>
-            <w:r>
-              <w:rPr>
-                <w:sz w:val="20"/>
-                <w:szCs w:val="20"/>
-              </w:rPr>
-              <w:t xml:space="preserve"> ★</w:t>
+            <w:r>
+              <w:rPr>
+                <w:sz w:val="20"/>
+                <w:szCs w:val="20"/>
+              </w:rPr>
+              <w:t>ff_siwis ★</w:t>
             </w:r>
           </w:p>
         </w:tc>
@@ -5890,7 +5232,6 @@
             <w:vAlign w:val="center"/>
           </w:tcPr>
           <w:p>
-            <w:proofErr w:type="spellStart"/>
             <w:r>
               <w:rPr>
                 <w:sz w:val="20"/>
@@ -5898,7 +5239,6 @@
               </w:rPr>
               <w:t>i</w:t>
             </w:r>
-            <w:proofErr w:type="spellEnd"/>
           </w:p>
         </w:tc>
         <w:tc>
@@ -5946,31 +5286,13 @@
             <w:vAlign w:val="center"/>
           </w:tcPr>
           <w:p>
-            <w:proofErr w:type="spellStart"/>
-            <w:r>
-              <w:rPr>
-                <w:sz w:val="20"/>
-                <w:szCs w:val="20"/>
-              </w:rPr>
-              <w:t>if_sara</w:t>
-            </w:r>
-            <w:proofErr w:type="spellEnd"/>
-            <w:r>
-              <w:rPr>
-                <w:sz w:val="20"/>
-                <w:szCs w:val="20"/>
-              </w:rPr>
-              <w:t xml:space="preserve">, </w:t>
-            </w:r>
-            <w:proofErr w:type="spellStart"/>
-            <w:r>
-              <w:rPr>
-                <w:sz w:val="20"/>
-                <w:szCs w:val="20"/>
-              </w:rPr>
-              <w:t>im_nicola</w:t>
-            </w:r>
-            <w:proofErr w:type="spellEnd"/>
+            <w:r>
+              <w:rPr>
+                <w:sz w:val="20"/>
+                <w:szCs w:val="20"/>
+              </w:rPr>
+              <w:t>if_sara, im_nicola</w:t>
+            </w:r>
           </w:p>
         </w:tc>
       </w:tr>
@@ -6053,31 +5375,13 @@
             <w:vAlign w:val="center"/>
           </w:tcPr>
           <w:p>
-            <w:proofErr w:type="spellStart"/>
-            <w:r>
-              <w:rPr>
-                <w:sz w:val="20"/>
-                <w:szCs w:val="20"/>
-              </w:rPr>
-              <w:t>pf_dora</w:t>
-            </w:r>
-            <w:proofErr w:type="spellEnd"/>
-            <w:r>
-              <w:rPr>
-                <w:sz w:val="20"/>
-                <w:szCs w:val="20"/>
-              </w:rPr>
-              <w:t xml:space="preserve">, </w:t>
-            </w:r>
-            <w:proofErr w:type="spellStart"/>
-            <w:r>
-              <w:rPr>
-                <w:sz w:val="20"/>
-                <w:szCs w:val="20"/>
-              </w:rPr>
-              <w:t>pm_alex</w:t>
-            </w:r>
-            <w:proofErr w:type="spellEnd"/>
+            <w:r>
+              <w:rPr>
+                <w:sz w:val="20"/>
+                <w:szCs w:val="20"/>
+              </w:rPr>
+              <w:t>pf_dora, pm_alex</w:t>
+            </w:r>
           </w:p>
         </w:tc>
       </w:tr>
@@ -6160,85 +5464,12 @@
             <w:vAlign w:val="center"/>
           </w:tcPr>
           <w:p>
-            <w:proofErr w:type="spellStart"/>
-            <w:r>
-              <w:rPr>
-                <w:sz w:val="20"/>
-                <w:szCs w:val="20"/>
-              </w:rPr>
-              <w:t>jf_alpha</w:t>
-            </w:r>
-            <w:proofErr w:type="spellEnd"/>
-            <w:r>
-              <w:rPr>
-                <w:sz w:val="20"/>
-                <w:szCs w:val="20"/>
-              </w:rPr>
-              <w:t xml:space="preserve">, </w:t>
-            </w:r>
-            <w:proofErr w:type="spellStart"/>
-            <w:r>
-              <w:rPr>
-                <w:sz w:val="20"/>
-                <w:szCs w:val="20"/>
-              </w:rPr>
-              <w:t>jm_kumo</w:t>
-            </w:r>
-            <w:proofErr w:type="spellEnd"/>
-            <w:r>
-              <w:rPr>
-                <w:sz w:val="20"/>
-                <w:szCs w:val="20"/>
-              </w:rPr>
-              <w:t xml:space="preserve"> (</w:t>
-            </w:r>
-            <w:proofErr w:type="gramStart"/>
-            <w:r>
-              <w:rPr>
-                <w:sz w:val="20"/>
-                <w:szCs w:val="20"/>
-              </w:rPr>
-              <w:t>requires:</w:t>
-            </w:r>
-            <w:proofErr w:type="gramEnd"/>
-            <w:r>
-              <w:rPr>
-                <w:sz w:val="20"/>
-                <w:szCs w:val="20"/>
-              </w:rPr>
-              <w:t xml:space="preserve"> pip install </w:t>
-            </w:r>
-            <w:proofErr w:type="spellStart"/>
-            <w:r>
-              <w:rPr>
-                <w:sz w:val="20"/>
-                <w:szCs w:val="20"/>
-              </w:rPr>
-              <w:t>misaki</w:t>
-            </w:r>
-            <w:proofErr w:type="spellEnd"/>
-            <w:r>
-              <w:rPr>
-                <w:sz w:val="20"/>
-                <w:szCs w:val="20"/>
-              </w:rPr>
-              <w:t>[</w:t>
-            </w:r>
-            <w:proofErr w:type="spellStart"/>
-            <w:r>
-              <w:rPr>
-                <w:sz w:val="20"/>
-                <w:szCs w:val="20"/>
-              </w:rPr>
-              <w:t>ja</w:t>
-            </w:r>
-            <w:proofErr w:type="spellEnd"/>
-            <w:r>
-              <w:rPr>
-                <w:sz w:val="20"/>
-                <w:szCs w:val="20"/>
-              </w:rPr>
-              <w:t>])</w:t>
+            <w:r>
+              <w:rPr>
+                <w:sz w:val="20"/>
+                <w:szCs w:val="20"/>
+              </w:rPr>
+              <w:t>jf_alpha, jm_kumo (requires: pip install misaki[ja])</w:t>
             </w:r>
           </w:p>
         </w:tc>
@@ -6322,85 +5553,12 @@
             <w:vAlign w:val="center"/>
           </w:tcPr>
           <w:p>
-            <w:proofErr w:type="spellStart"/>
-            <w:r>
-              <w:rPr>
-                <w:sz w:val="20"/>
-                <w:szCs w:val="20"/>
-              </w:rPr>
-              <w:t>zf_xiaobei</w:t>
-            </w:r>
-            <w:proofErr w:type="spellEnd"/>
-            <w:r>
-              <w:rPr>
-                <w:sz w:val="20"/>
-                <w:szCs w:val="20"/>
-              </w:rPr>
-              <w:t xml:space="preserve">, </w:t>
-            </w:r>
-            <w:proofErr w:type="spellStart"/>
-            <w:r>
-              <w:rPr>
-                <w:sz w:val="20"/>
-                <w:szCs w:val="20"/>
-              </w:rPr>
-              <w:t>zm_yunjian</w:t>
-            </w:r>
-            <w:proofErr w:type="spellEnd"/>
-            <w:r>
-              <w:rPr>
-                <w:sz w:val="20"/>
-                <w:szCs w:val="20"/>
-              </w:rPr>
-              <w:t xml:space="preserve"> (</w:t>
-            </w:r>
-            <w:proofErr w:type="gramStart"/>
-            <w:r>
-              <w:rPr>
-                <w:sz w:val="20"/>
-                <w:szCs w:val="20"/>
-              </w:rPr>
-              <w:t>requires:</w:t>
-            </w:r>
-            <w:proofErr w:type="gramEnd"/>
-            <w:r>
-              <w:rPr>
-                <w:sz w:val="20"/>
-                <w:szCs w:val="20"/>
-              </w:rPr>
-              <w:t xml:space="preserve"> pip install </w:t>
-            </w:r>
-            <w:proofErr w:type="spellStart"/>
-            <w:r>
-              <w:rPr>
-                <w:sz w:val="20"/>
-                <w:szCs w:val="20"/>
-              </w:rPr>
-              <w:t>misaki</w:t>
-            </w:r>
-            <w:proofErr w:type="spellEnd"/>
-            <w:r>
-              <w:rPr>
-                <w:sz w:val="20"/>
-                <w:szCs w:val="20"/>
-              </w:rPr>
-              <w:t>[</w:t>
-            </w:r>
-            <w:proofErr w:type="spellStart"/>
-            <w:r>
-              <w:rPr>
-                <w:sz w:val="20"/>
-                <w:szCs w:val="20"/>
-              </w:rPr>
-              <w:t>zh</w:t>
-            </w:r>
-            <w:proofErr w:type="spellEnd"/>
-            <w:r>
-              <w:rPr>
-                <w:sz w:val="20"/>
-                <w:szCs w:val="20"/>
-              </w:rPr>
-              <w:t>])</w:t>
+            <w:r>
+              <w:rPr>
+                <w:sz w:val="20"/>
+                <w:szCs w:val="20"/>
+              </w:rPr>
+              <w:t>zf_xiaobei, zm_yunjian (requires: pip install misaki[zh])</w:t>
             </w:r>
           </w:p>
         </w:tc>
@@ -6465,7 +5623,6 @@
       <w:r>
         <w:t>Spectral noise reduction (</w:t>
       </w:r>
-      <w:proofErr w:type="spellStart"/>
       <w:r>
         <w:rPr>
           <w:rFonts w:ascii="Courier New" w:eastAsia="Courier New" w:hAnsi="Courier New" w:cs="Courier New"/>
@@ -6474,7 +5631,6 @@
         </w:rPr>
         <w:t>noisereduce</w:t>
       </w:r>
-      <w:proofErr w:type="spellEnd"/>
       <w:r>
         <w:t>)</w:t>
       </w:r>
@@ -6517,7 +5673,6 @@
       <w:r>
         <w:t>EBU R128 integrated loudness measurement (</w:t>
       </w:r>
-      <w:proofErr w:type="spellStart"/>
       <w:r>
         <w:rPr>
           <w:rFonts w:ascii="Courier New" w:eastAsia="Courier New" w:hAnsi="Courier New" w:cs="Courier New"/>
@@ -6526,7 +5681,6 @@
         </w:rPr>
         <w:t>pyloudnorm</w:t>
       </w:r>
-      <w:proofErr w:type="spellEnd"/>
       <w:r>
         <w:t>)</w:t>
       </w:r>
@@ -6554,13 +5708,8 @@
         <w:spacing w:after="80"/>
       </w:pPr>
       <w:r>
-        <w:t>True-peak limiting at −1.0 </w:t>
-      </w:r>
-      <w:proofErr w:type="spellStart"/>
-      <w:r>
-        <w:t>dBTP</w:t>
-      </w:r>
-      <w:proofErr w:type="spellEnd"/>
+        <w:t>True-peak limiting at −1.0 dBTP</w:t>
+      </w:r>
     </w:p>
     <w:p>
       <w:pPr>
@@ -6594,15 +5743,7 @@
         <w:t>wav44_24bit</w:t>
       </w:r>
       <w:r>
-        <w:t xml:space="preserve">): additional mono-to-stereo </w:t>
-      </w:r>
-      <w:proofErr w:type="spellStart"/>
-      <w:r>
-        <w:t>upmix</w:t>
-      </w:r>
-      <w:proofErr w:type="spellEnd"/>
-      <w:r>
-        <w:t xml:space="preserve"> and resample to 44.1 kHz.</w:t>
+        <w:t>): additional mono-to-stereo upmix and resample to 44.1 kHz.</w:t>
       </w:r>
     </w:p>
     <w:p>
@@ -7152,15 +6293,7 @@
         <w:t>Important for WSL2 users:</w:t>
       </w:r>
       <w:r>
-        <w:t xml:space="preserve"> Run setup.sh from the Windows filesystem path (/</w:t>
-      </w:r>
-      <w:proofErr w:type="spellStart"/>
-      <w:r>
-        <w:t>mnt</w:t>
-      </w:r>
-      <w:proofErr w:type="spellEnd"/>
-      <w:r>
-        <w:t>/c/Users/&lt;you&gt;/...) where GitHub Desktop manages the repo — not from a separate WSL clone at ~/. This keeps git changes in sync automatically.</w:t>
+        <w:t xml:space="preserve"> Run setup.sh from the Windows filesystem path (/mnt/c/Users/&lt;you&gt;/...) where GitHub Desktop manages the repo — not from a separate WSL clone at ~/. This keeps git changes in sync automatically.</w:t>
       </w:r>
     </w:p>
     <w:p>
@@ -7277,25 +6410,7 @@
           <w:sz w:val="20"/>
           <w:szCs w:val="20"/>
         </w:rPr>
-        <w:t xml:space="preserve">source </w:t>
-      </w:r>
-      <w:proofErr w:type="spellStart"/>
-      <w:r>
-        <w:rPr>
-          <w:rFonts w:ascii="Courier New" w:eastAsia="Courier New" w:hAnsi="Courier New" w:cs="Courier New"/>
-          <w:sz w:val="20"/>
-          <w:szCs w:val="20"/>
-        </w:rPr>
-        <w:t>venv</w:t>
-      </w:r>
-      <w:proofErr w:type="spellEnd"/>
-      <w:r>
-        <w:rPr>
-          <w:rFonts w:ascii="Courier New" w:eastAsia="Courier New" w:hAnsi="Courier New" w:cs="Courier New"/>
-          <w:sz w:val="20"/>
-          <w:szCs w:val="20"/>
-        </w:rPr>
-        <w:t>/bin/activate</w:t>
+        <w:t>source venv/bin/activate</w:t>
       </w:r>
     </w:p>
     <w:p>
@@ -7379,25 +6494,7 @@
           <w:sz w:val="20"/>
           <w:szCs w:val="20"/>
         </w:rPr>
-        <w:t xml:space="preserve">python -m </w:t>
-      </w:r>
-      <w:proofErr w:type="spellStart"/>
-      <w:r>
-        <w:rPr>
-          <w:rFonts w:ascii="Courier New" w:eastAsia="Courier New" w:hAnsi="Courier New" w:cs="Courier New"/>
-          <w:sz w:val="20"/>
-          <w:szCs w:val="20"/>
-        </w:rPr>
-        <w:t>unidic</w:t>
-      </w:r>
-      <w:proofErr w:type="spellEnd"/>
-      <w:r>
-        <w:rPr>
-          <w:rFonts w:ascii="Courier New" w:eastAsia="Courier New" w:hAnsi="Courier New" w:cs="Courier New"/>
-          <w:sz w:val="20"/>
-          <w:szCs w:val="20"/>
-        </w:rPr>
-        <w:t xml:space="preserve"> download</w:t>
+        <w:t>python -m unidic download</w:t>
       </w:r>
     </w:p>
     <w:p>
@@ -7533,8 +6630,164 @@
         <w:pStyle w:val="Heading2"/>
       </w:pPr>
       <w:r>
+        <w:t>11.3 Starting the Server [Post Initial Set Up]</w:t>
+      </w:r>
+    </w:p>
+    <w:p>
+      <w:pPr>
+        <w:spacing w:after="120"/>
+      </w:pPr>
+      <w:r>
+        <w:t>Once the app is installed, use these steps every time you want to start the server:</w:t>
+      </w:r>
+    </w:p>
+    <w:p>
+      <w:pPr>
+        <w:shd w:val="clear" w:color="auto" w:fill="F5F5F5"/>
+        <w:ind w:left="360"/>
+      </w:pPr>
+      <w:r>
+        <w:rPr>
+          <w:rFonts w:ascii="Courier New" w:eastAsia="Courier New" w:hAnsi="Courier New" w:cs="Courier New"/>
+          <w:sz w:val="20"/>
+          <w:szCs w:val="20"/>
+        </w:rPr>
+        <w:t># Activate the virtual environment</w:t>
+      </w:r>
+    </w:p>
+    <w:p>
+      <w:pPr>
+        <w:shd w:val="clear" w:color="auto" w:fill="F5F5F5"/>
+        <w:ind w:left="360"/>
+      </w:pPr>
+      <w:r>
+        <w:rPr>
+          <w:rFonts w:ascii="Courier New" w:eastAsia="Courier New" w:hAnsi="Courier New" w:cs="Courier New"/>
+          <w:sz w:val="20"/>
+          <w:szCs w:val="20"/>
+        </w:rPr>
+        <w:t>source venv/bin/activate</w:t>
+      </w:r>
+    </w:p>
+    <w:p>
+      <w:pPr>
+        <w:shd w:val="clear" w:color="auto" w:fill="F5F5F5"/>
+        <w:ind w:left="360"/>
+      </w:pPr>
+      <w:r>
+        <w:rPr>
+          <w:rFonts w:ascii="Courier New" w:eastAsia="Courier New" w:hAnsi="Courier New" w:cs="Courier New"/>
+          <w:sz w:val="20"/>
+          <w:szCs w:val="20"/>
+        </w:rPr>
+        <w:t xml:space="preserve"> </w:t>
+      </w:r>
+    </w:p>
+    <w:p>
+      <w:pPr>
+        <w:shd w:val="clear" w:color="auto" w:fill="F5F5F5"/>
+        <w:ind w:left="360"/>
+      </w:pPr>
+      <w:r>
+        <w:rPr>
+          <w:rFonts w:ascii="Courier New" w:eastAsia="Courier New" w:hAnsi="Courier New" w:cs="Courier New"/>
+          <w:sz w:val="20"/>
+          <w:szCs w:val="20"/>
+        </w:rPr>
+        <w:t># Start the server</w:t>
+      </w:r>
+    </w:p>
+    <w:p>
+      <w:pPr>
+        <w:shd w:val="clear" w:color="auto" w:fill="F5F5F5"/>
+        <w:ind w:left="360"/>
+      </w:pPr>
+      <w:r>
+        <w:rPr>
+          <w:rFonts w:ascii="Courier New" w:eastAsia="Courier New" w:hAnsi="Courier New" w:cs="Courier New"/>
+          <w:sz w:val="20"/>
+          <w:szCs w:val="20"/>
+        </w:rPr>
+        <w:t>make run</w:t>
+      </w:r>
+    </w:p>
+    <w:p>
+      <w:pPr>
+        <w:shd w:val="clear" w:color="auto" w:fill="F5F5F5"/>
+        <w:ind w:left="360"/>
+      </w:pPr>
+      <w:r>
+        <w:rPr>
+          <w:rFonts w:ascii="Courier New" w:eastAsia="Courier New" w:hAnsi="Courier New" w:cs="Courier New"/>
+          <w:sz w:val="20"/>
+          <w:szCs w:val="20"/>
+        </w:rPr>
+        <w:t xml:space="preserve"> </w:t>
+      </w:r>
+    </w:p>
+    <w:p>
+      <w:pPr>
+        <w:shd w:val="clear" w:color="auto" w:fill="F5F5F5"/>
+        <w:ind w:left="360"/>
+      </w:pPr>
+      <w:r>
+        <w:rPr>
+          <w:rFonts w:ascii="Courier New" w:eastAsia="Courier New" w:hAnsi="Courier New" w:cs="Courier New"/>
+          <w:sz w:val="20"/>
+          <w:szCs w:val="20"/>
+        </w:rPr>
+        <w:t># Open: http://localhost:8000</w:t>
+      </w:r>
+    </w:p>
+    <w:p>
+      <w:pPr>
+        <w:shd w:val="clear" w:color="auto" w:fill="F5F5F5"/>
+        <w:ind w:left="360"/>
+      </w:pPr>
+      <w:r>
+        <w:rPr>
+          <w:rFonts w:ascii="Courier New" w:eastAsia="Courier New" w:hAnsi="Courier New" w:cs="Courier New"/>
+          <w:sz w:val="20"/>
+          <w:szCs w:val="20"/>
+        </w:rPr>
+        <w:t xml:space="preserve"> </w:t>
+      </w:r>
+    </w:p>
+    <w:p>
+      <w:pPr>
+        <w:shd w:val="clear" w:color="auto" w:fill="F5F5F5"/>
+        <w:ind w:left="360"/>
+      </w:pPr>
+      <w:r>
+        <w:rPr>
+          <w:rFonts w:ascii="Courier New" w:eastAsia="Courier New" w:hAnsi="Courier New" w:cs="Courier New"/>
+          <w:sz w:val="20"/>
+          <w:szCs w:val="20"/>
+        </w:rPr>
+        <w:t># Stop the server</w:t>
+      </w:r>
+    </w:p>
+    <w:p>
+      <w:pPr>
+        <w:shd w:val="clear" w:color="auto" w:fill="F5F5F5"/>
+        <w:ind w:left="360"/>
+      </w:pPr>
+      <w:r>
+        <w:rPr>
+          <w:rFonts w:ascii="Courier New" w:eastAsia="Courier New" w:hAnsi="Courier New" w:cs="Courier New"/>
+          <w:sz w:val="20"/>
+          <w:szCs w:val="20"/>
+        </w:rPr>
+        <w:t>make stop</w:t>
+      </w:r>
+    </w:p>
+    <w:p>
+      <w:pPr>
+        <w:pStyle w:val="Heading2"/>
+      </w:pPr>
+      <w:r>
         <w:lastRenderedPageBreak/>
-        <w:t>11.3 Python Version Constraint</w:t>
+        <w:t>11.4 Python Version Constraint</w:t>
       </w:r>
     </w:p>
     <w:p>
@@ -7568,15 +6821,7 @@
         <w:spacing w:after="80"/>
       </w:pPr>
       <w:r>
-        <w:t xml:space="preserve">Installs Python 3.11 via the </w:t>
-      </w:r>
-      <w:proofErr w:type="spellStart"/>
-      <w:r>
-        <w:t>deadsnakes</w:t>
-      </w:r>
-      <w:proofErr w:type="spellEnd"/>
-      <w:r>
-        <w:t xml:space="preserve"> PPA on Linux/WSL2</w:t>
+        <w:t>Installs Python 3.11 via the deadsnakes PPA on Linux/WSL2</w:t>
       </w:r>
     </w:p>
     <w:p>
@@ -7589,15 +6834,7 @@
         <w:spacing w:after="80"/>
       </w:pPr>
       <w:r>
-        <w:t xml:space="preserve">Creates the </w:t>
-      </w:r>
-      <w:proofErr w:type="spellStart"/>
-      <w:r>
-        <w:t>venv</w:t>
-      </w:r>
-      <w:proofErr w:type="spellEnd"/>
-      <w:r>
-        <w:t xml:space="preserve"> with </w:t>
+        <w:t xml:space="preserve">Creates the venv with </w:t>
       </w:r>
       <w:r>
         <w:rPr>
@@ -7634,7 +6871,7 @@
         <w:pStyle w:val="Heading2"/>
       </w:pPr>
       <w:r>
-        <w:t>11.4 Docker</w:t>
+        <w:t>11.5 Docker</w:t>
       </w:r>
     </w:p>
     <w:p>
@@ -7662,15 +6899,7 @@
         <w:spacing w:after="120"/>
       </w:pPr>
       <w:r>
-        <w:t xml:space="preserve">The </w:t>
-      </w:r>
-      <w:proofErr w:type="spellStart"/>
-      <w:r>
-        <w:t>Dockerfile</w:t>
-      </w:r>
-      <w:proofErr w:type="spellEnd"/>
-      <w:r>
-        <w:t>:</w:t>
+        <w:t>The Dockerfile:</w:t>
       </w:r>
     </w:p>
     <w:p>
@@ -7685,23 +6914,13 @@
       <w:r>
         <w:t xml:space="preserve">Base: </w:t>
       </w:r>
-      <w:proofErr w:type="spellStart"/>
-      <w:r>
-        <w:rPr>
-          <w:rFonts w:ascii="Courier New" w:eastAsia="Courier New" w:hAnsi="Courier New" w:cs="Courier New"/>
-          <w:sz w:val="20"/>
-          <w:szCs w:val="20"/>
-        </w:rPr>
-        <w:t>pytorch</w:t>
-      </w:r>
-      <w:proofErr w:type="spellEnd"/>
-      <w:r>
-        <w:rPr>
-          <w:rFonts w:ascii="Courier New" w:eastAsia="Courier New" w:hAnsi="Courier New" w:cs="Courier New"/>
-          <w:sz w:val="20"/>
-          <w:szCs w:val="20"/>
-        </w:rPr>
-        <w:t>/pytorch:2.3.1-cuda12.1-cudnn8-runtime</w:t>
+      <w:r>
+        <w:rPr>
+          <w:rFonts w:ascii="Courier New" w:eastAsia="Courier New" w:hAnsi="Courier New" w:cs="Courier New"/>
+          <w:sz w:val="20"/>
+          <w:szCs w:val="20"/>
+        </w:rPr>
+        <w:t>pytorch/pytorch:2.3.1-cuda12.1-cudnn8-runtime</w:t>
       </w:r>
     </w:p>
     <w:p>
@@ -7716,28 +6935,17 @@
       <w:r>
         <w:t xml:space="preserve">Installs </w:t>
       </w:r>
-      <w:proofErr w:type="spellStart"/>
-      <w:r>
-        <w:rPr>
-          <w:rFonts w:ascii="Courier New" w:eastAsia="Courier New" w:hAnsi="Courier New" w:cs="Courier New"/>
-          <w:sz w:val="20"/>
-          <w:szCs w:val="20"/>
-        </w:rPr>
-        <w:t>espeak</w:t>
-      </w:r>
-      <w:proofErr w:type="spellEnd"/>
-      <w:r>
-        <w:rPr>
-          <w:rFonts w:ascii="Courier New" w:eastAsia="Courier New" w:hAnsi="Courier New" w:cs="Courier New"/>
-          <w:sz w:val="20"/>
-          <w:szCs w:val="20"/>
-        </w:rPr>
-        <w:t>-ng</w:t>
+      <w:r>
+        <w:rPr>
+          <w:rFonts w:ascii="Courier New" w:eastAsia="Courier New" w:hAnsi="Courier New" w:cs="Courier New"/>
+          <w:sz w:val="20"/>
+          <w:szCs w:val="20"/>
+        </w:rPr>
+        <w:t>espeak-ng</w:t>
       </w:r>
       <w:r>
         <w:t xml:space="preserve"> and </w:t>
       </w:r>
-      <w:proofErr w:type="spellStart"/>
       <w:r>
         <w:rPr>
           <w:rFonts w:ascii="Courier New" w:eastAsia="Courier New" w:hAnsi="Courier New" w:cs="Courier New"/>
@@ -7746,7 +6954,6 @@
         </w:rPr>
         <w:t>ffmpeg</w:t>
       </w:r>
-      <w:proofErr w:type="spellEnd"/>
       <w:r>
         <w:t xml:space="preserve"> via apt</w:t>
       </w:r>
@@ -7769,25 +6976,7 @@
           <w:sz w:val="20"/>
           <w:szCs w:val="20"/>
         </w:rPr>
-        <w:t xml:space="preserve">python -m </w:t>
-      </w:r>
-      <w:proofErr w:type="spellStart"/>
-      <w:r>
-        <w:rPr>
-          <w:rFonts w:ascii="Courier New" w:eastAsia="Courier New" w:hAnsi="Courier New" w:cs="Courier New"/>
-          <w:sz w:val="20"/>
-          <w:szCs w:val="20"/>
-        </w:rPr>
-        <w:t>unidic</w:t>
-      </w:r>
-      <w:proofErr w:type="spellEnd"/>
-      <w:r>
-        <w:rPr>
-          <w:rFonts w:ascii="Courier New" w:eastAsia="Courier New" w:hAnsi="Courier New" w:cs="Courier New"/>
-          <w:sz w:val="20"/>
-          <w:szCs w:val="20"/>
-        </w:rPr>
-        <w:t xml:space="preserve"> download</w:t>
+        <w:t>python -m unidic download</w:t>
       </w:r>
       <w:r>
         <w:t xml:space="preserve"> at build time</w:t>
@@ -7816,15 +7005,7 @@
         <w:pStyle w:val="Heading2"/>
       </w:pPr>
       <w:r>
-        <w:t xml:space="preserve">11.5 </w:t>
-      </w:r>
-      <w:proofErr w:type="spellStart"/>
-      <w:r>
-        <w:t>HuggingFace</w:t>
-      </w:r>
-      <w:proofErr w:type="spellEnd"/>
-      <w:r>
-        <w:t xml:space="preserve"> Token</w:t>
+        <w:t>11.6 HuggingFace Token</w:t>
       </w:r>
     </w:p>
     <w:p>
@@ -7851,18 +7032,8 @@
           <w:sz w:val="20"/>
           <w:szCs w:val="20"/>
         </w:rPr>
-        <w:t>HF_TOKEN=</w:t>
-      </w:r>
-      <w:proofErr w:type="spellStart"/>
-      <w:r>
-        <w:rPr>
-          <w:rFonts w:ascii="Courier New" w:eastAsia="Courier New" w:hAnsi="Courier New" w:cs="Courier New"/>
-          <w:sz w:val="20"/>
-          <w:szCs w:val="20"/>
-        </w:rPr>
-        <w:t>hf_your_token_here</w:t>
-      </w:r>
-      <w:proofErr w:type="spellEnd"/>
+        <w:t>HF_TOKEN=hf_your_token_here</w:t>
+      </w:r>
     </w:p>
     <w:p>
       <w:pPr>
@@ -7874,15 +7045,7 @@
         <w:pStyle w:val="Heading2"/>
       </w:pPr>
       <w:r>
-        <w:t xml:space="preserve">11.6 Troubleshooting: </w:t>
-      </w:r>
-      <w:proofErr w:type="spellStart"/>
-      <w:r>
-        <w:t>espeak</w:t>
-      </w:r>
-      <w:proofErr w:type="spellEnd"/>
-      <w:r>
-        <w:t>-ng on macOS</w:t>
+        <w:t>11.7 Troubleshooting: espeak-ng on macOS</w:t>
       </w:r>
     </w:p>
     <w:p>
@@ -7897,23 +7060,7 @@
         <w:t>Symptom:</w:t>
       </w:r>
       <w:r>
-        <w:t xml:space="preserve"> Error processing file '.../</w:t>
-      </w:r>
-      <w:proofErr w:type="spellStart"/>
-      <w:r>
-        <w:t>espeakng_loader</w:t>
-      </w:r>
-      <w:proofErr w:type="spellEnd"/>
-      <w:r>
-        <w:t>//</w:t>
-      </w:r>
-      <w:proofErr w:type="spellStart"/>
-      <w:r>
-        <w:t>phontab</w:t>
-      </w:r>
-      <w:proofErr w:type="spellEnd"/>
-      <w:r>
-        <w:t>': No such file or directory</w:t>
+        <w:t xml:space="preserve"> Error processing file '.../espeakng_loader//phontab': No such file or directory</w:t>
       </w:r>
     </w:p>
     <w:p>
@@ -7933,23 +7080,7 @@
         <w:t>Root cause:</w:t>
       </w:r>
       <w:r>
-        <w:t xml:space="preserve"> </w:t>
-      </w:r>
-      <w:proofErr w:type="spellStart"/>
-      <w:r>
-        <w:t>espeak_ng_InitializePath</w:t>
-      </w:r>
-      <w:proofErr w:type="spellEnd"/>
-      <w:r>
-        <w:t xml:space="preserve">() has an internal 160-char buffer. Long </w:t>
-      </w:r>
-      <w:proofErr w:type="spellStart"/>
-      <w:r>
-        <w:t>venv</w:t>
-      </w:r>
-      <w:proofErr w:type="spellEnd"/>
-      <w:r>
-        <w:t xml:space="preserve"> paths are silently truncated.</w:t>
+        <w:t xml:space="preserve"> espeak_ng_InitializePath() has an internal 160-char buffer. Long venv paths are silently truncated.</w:t>
       </w:r>
     </w:p>
     <w:p>
@@ -7974,62 +7105,18 @@
           <w:sz w:val="20"/>
           <w:szCs w:val="20"/>
         </w:rPr>
-        <w:t xml:space="preserve">brew install </w:t>
-      </w:r>
-      <w:proofErr w:type="spellStart"/>
-      <w:r>
-        <w:rPr>
-          <w:rFonts w:ascii="Courier New" w:eastAsia="Courier New" w:hAnsi="Courier New" w:cs="Courier New"/>
-          <w:sz w:val="20"/>
-          <w:szCs w:val="20"/>
-        </w:rPr>
-        <w:t>espeak</w:t>
-      </w:r>
-      <w:proofErr w:type="spellEnd"/>
-      <w:r>
-        <w:rPr>
-          <w:rFonts w:ascii="Courier New" w:eastAsia="Courier New" w:hAnsi="Courier New" w:cs="Courier New"/>
-          <w:sz w:val="20"/>
-          <w:szCs w:val="20"/>
-        </w:rPr>
-        <w:t>-ng</w:t>
-      </w:r>
-      <w:r>
-        <w:t xml:space="preserve"> installs data to /opt/homebrew/lib/</w:t>
-      </w:r>
-      <w:proofErr w:type="spellStart"/>
-      <w:r>
-        <w:t>espeak</w:t>
-      </w:r>
-      <w:proofErr w:type="spellEnd"/>
-      <w:r>
-        <w:t xml:space="preserve">-ng-data (34 chars). The kokoro_engine.py </w:t>
-      </w:r>
-      <w:r>
-        <w:rPr>
-          <w:rFonts w:ascii="Courier New" w:eastAsia="Courier New" w:hAnsi="Courier New" w:cs="Courier New"/>
-          <w:sz w:val="20"/>
-          <w:szCs w:val="20"/>
-        </w:rPr>
-        <w:t>_</w:t>
-      </w:r>
-      <w:proofErr w:type="spellStart"/>
-      <w:r>
-        <w:rPr>
-          <w:rFonts w:ascii="Courier New" w:eastAsia="Courier New" w:hAnsi="Courier New" w:cs="Courier New"/>
-          <w:sz w:val="20"/>
-          <w:szCs w:val="20"/>
-        </w:rPr>
-        <w:t>configure_espeak</w:t>
-      </w:r>
-      <w:proofErr w:type="spellEnd"/>
-      <w:r>
-        <w:rPr>
-          <w:rFonts w:ascii="Courier New" w:eastAsia="Courier New" w:hAnsi="Courier New" w:cs="Courier New"/>
-          <w:sz w:val="20"/>
-          <w:szCs w:val="20"/>
-        </w:rPr>
-        <w:t>()</w:t>
+        <w:t>brew install espeak-ng</w:t>
+      </w:r>
+      <w:r>
+        <w:t xml:space="preserve"> installs data to /opt/homebrew/lib/espeak-ng-data (34 chars). The kokoro_engine.py </w:t>
+      </w:r>
+      <w:r>
+        <w:rPr>
+          <w:rFonts w:ascii="Courier New" w:eastAsia="Courier New" w:hAnsi="Courier New" w:cs="Courier New"/>
+          <w:sz w:val="20"/>
+          <w:szCs w:val="20"/>
+        </w:rPr>
+        <w:t>_configure_espeak()</w:t>
       </w:r>
       <w:r>
         <w:t xml:space="preserve"> function automatically finds this path.</w:t>
@@ -8243,17 +7330,8 @@
                 <w:sz w:val="20"/>
                 <w:szCs w:val="20"/>
               </w:rPr>
-              <w:t>/</w:t>
-            </w:r>
-            <w:proofErr w:type="gramStart"/>
-            <w:r>
-              <w:rPr>
-                <w:sz w:val="20"/>
-                <w:szCs w:val="20"/>
-              </w:rPr>
-              <w:t>health</w:t>
-            </w:r>
-            <w:proofErr w:type="gramEnd"/>
+              <w:t>/health</w:t>
+            </w:r>
           </w:p>
         </w:tc>
         <w:tc>
@@ -8341,17 +7419,8 @@
                 <w:sz w:val="20"/>
                 <w:szCs w:val="20"/>
               </w:rPr>
-              <w:t>/</w:t>
-            </w:r>
-            <w:proofErr w:type="gramStart"/>
-            <w:r>
-              <w:rPr>
-                <w:sz w:val="20"/>
-                <w:szCs w:val="20"/>
-              </w:rPr>
-              <w:t>voices</w:t>
-            </w:r>
-            <w:proofErr w:type="gramEnd"/>
+              <w:t>/voices</w:t>
+            </w:r>
           </w:p>
         </w:tc>
         <w:tc>
@@ -8439,17 +7508,8 @@
                 <w:sz w:val="20"/>
                 <w:szCs w:val="20"/>
               </w:rPr>
-              <w:t>/</w:t>
-            </w:r>
-            <w:proofErr w:type="gramStart"/>
-            <w:r>
-              <w:rPr>
-                <w:sz w:val="20"/>
-                <w:szCs w:val="20"/>
-              </w:rPr>
-              <w:t>synthesize</w:t>
-            </w:r>
-            <w:proofErr w:type="gramEnd"/>
+              <w:t>/synthesize</w:t>
+            </w:r>
           </w:p>
         </w:tc>
         <w:tc>
@@ -8626,23 +7686,7 @@
                 <w:sz w:val="20"/>
                 <w:szCs w:val="20"/>
               </w:rPr>
-              <w:t>/</w:t>
-            </w:r>
-            <w:proofErr w:type="gramStart"/>
-            <w:r>
-              <w:rPr>
-                <w:sz w:val="20"/>
-                <w:szCs w:val="20"/>
-              </w:rPr>
-              <w:t>upload</w:t>
-            </w:r>
-            <w:proofErr w:type="gramEnd"/>
-            <w:r>
-              <w:rPr>
-                <w:sz w:val="20"/>
-                <w:szCs w:val="20"/>
-              </w:rPr>
-              <w:t>-voice-sample</w:t>
+              <w:t>/upload-voice-sample</w:t>
             </w:r>
           </w:p>
         </w:tc>
@@ -8731,23 +7775,7 @@
                 <w:sz w:val="20"/>
                 <w:szCs w:val="20"/>
               </w:rPr>
-              <w:t>/</w:t>
-            </w:r>
-            <w:proofErr w:type="gramStart"/>
-            <w:r>
-              <w:rPr>
-                <w:sz w:val="20"/>
-                <w:szCs w:val="20"/>
-              </w:rPr>
-              <w:t>voice</w:t>
-            </w:r>
-            <w:proofErr w:type="gramEnd"/>
-            <w:r>
-              <w:rPr>
-                <w:sz w:val="20"/>
-                <w:szCs w:val="20"/>
-              </w:rPr>
-              <w:t>-samples</w:t>
+              <w:t>/voice-samples</w:t>
             </w:r>
           </w:p>
         </w:tc>
@@ -8836,23 +7864,7 @@
                 <w:sz w:val="20"/>
                 <w:szCs w:val="20"/>
               </w:rPr>
-              <w:t>/</w:t>
-            </w:r>
-            <w:proofErr w:type="gramStart"/>
-            <w:r>
-              <w:rPr>
-                <w:sz w:val="20"/>
-                <w:szCs w:val="20"/>
-              </w:rPr>
-              <w:t>voice</w:t>
-            </w:r>
-            <w:proofErr w:type="gramEnd"/>
-            <w:r>
-              <w:rPr>
-                <w:sz w:val="20"/>
-                <w:szCs w:val="20"/>
-              </w:rPr>
-              <w:t>-samples/{filename}</w:t>
+              <w:t>/voice-samples/{filename}</w:t>
             </w:r>
           </w:p>
         </w:tc>
@@ -8941,23 +7953,7 @@
                 <w:sz w:val="20"/>
                 <w:szCs w:val="20"/>
               </w:rPr>
-              <w:t>/</w:t>
-            </w:r>
-            <w:proofErr w:type="gramStart"/>
-            <w:r>
-              <w:rPr>
-                <w:sz w:val="20"/>
-                <w:szCs w:val="20"/>
-              </w:rPr>
-              <w:t>input</w:t>
-            </w:r>
-            <w:proofErr w:type="gramEnd"/>
-            <w:r>
-              <w:rPr>
-                <w:sz w:val="20"/>
-                <w:szCs w:val="20"/>
-              </w:rPr>
-              <w:t>-samples</w:t>
+              <w:t>/input-samples</w:t>
             </w:r>
           </w:p>
         </w:tc>
@@ -9046,23 +8042,7 @@
                 <w:sz w:val="20"/>
                 <w:szCs w:val="20"/>
               </w:rPr>
-              <w:t>/</w:t>
-            </w:r>
-            <w:proofErr w:type="gramStart"/>
-            <w:r>
-              <w:rPr>
-                <w:sz w:val="20"/>
-                <w:szCs w:val="20"/>
-              </w:rPr>
-              <w:t>batch</w:t>
-            </w:r>
-            <w:proofErr w:type="gramEnd"/>
-            <w:r>
-              <w:rPr>
-                <w:sz w:val="20"/>
-                <w:szCs w:val="20"/>
-              </w:rPr>
-              <w:t>-synthesize</w:t>
+              <w:t>/batch-synthesize</w:t>
             </w:r>
           </w:p>
         </w:tc>
@@ -9151,39 +8131,7 @@
                 <w:sz w:val="20"/>
                 <w:szCs w:val="20"/>
               </w:rPr>
-              <w:t>/</w:t>
-            </w:r>
-            <w:proofErr w:type="gramStart"/>
-            <w:r>
-              <w:rPr>
-                <w:sz w:val="20"/>
-                <w:szCs w:val="20"/>
-              </w:rPr>
-              <w:t>batch</w:t>
-            </w:r>
-            <w:proofErr w:type="gramEnd"/>
-            <w:r>
-              <w:rPr>
-                <w:sz w:val="20"/>
-                <w:szCs w:val="20"/>
-              </w:rPr>
-              <w:t>-status/{</w:t>
-            </w:r>
-            <w:proofErr w:type="spellStart"/>
-            <w:r>
-              <w:rPr>
-                <w:sz w:val="20"/>
-                <w:szCs w:val="20"/>
-              </w:rPr>
-              <w:t>job_id</w:t>
-            </w:r>
-            <w:proofErr w:type="spellEnd"/>
-            <w:r>
-              <w:rPr>
-                <w:sz w:val="20"/>
-                <w:szCs w:val="20"/>
-              </w:rPr>
-              <w:t>}</w:t>
+              <w:t>/batch-status/{job_id}</w:t>
             </w:r>
           </w:p>
         </w:tc>
@@ -9272,17 +8220,8 @@
                 <w:sz w:val="20"/>
                 <w:szCs w:val="20"/>
               </w:rPr>
-              <w:t>/</w:t>
-            </w:r>
-            <w:proofErr w:type="gramStart"/>
-            <w:r>
-              <w:rPr>
-                <w:sz w:val="20"/>
-                <w:szCs w:val="20"/>
-              </w:rPr>
-              <w:t>docs</w:t>
-            </w:r>
-            <w:proofErr w:type="gramEnd"/>
+              <w:t>/docs</w:t>
+            </w:r>
           </w:p>
         </w:tc>
         <w:tc>
@@ -9303,21 +8242,12 @@
             <w:vAlign w:val="center"/>
           </w:tcPr>
           <w:p>
-            <w:proofErr w:type="spellStart"/>
-            <w:r>
-              <w:rPr>
-                <w:sz w:val="20"/>
-                <w:szCs w:val="20"/>
-              </w:rPr>
-              <w:t>FastAPI</w:t>
-            </w:r>
-            <w:proofErr w:type="spellEnd"/>
-            <w:r>
-              <w:rPr>
-                <w:sz w:val="20"/>
-                <w:szCs w:val="20"/>
-              </w:rPr>
-              <w:t xml:space="preserve"> interactive docs (Swagger UI)</w:t>
+            <w:r>
+              <w:rPr>
+                <w:sz w:val="20"/>
+                <w:szCs w:val="20"/>
+              </w:rPr>
+              <w:t>FastAPI interactive docs (Swagger UI)</w:t>
             </w:r>
           </w:p>
         </w:tc>
@@ -9380,57 +8310,21 @@
           <w:sz w:val="20"/>
           <w:szCs w:val="20"/>
         </w:rPr>
-        <w:t xml:space="preserve">  "voice": "</w:t>
-      </w:r>
-      <w:proofErr w:type="spellStart"/>
-      <w:r>
-        <w:rPr>
-          <w:rFonts w:ascii="Courier New" w:eastAsia="Courier New" w:hAnsi="Courier New" w:cs="Courier New"/>
-          <w:sz w:val="20"/>
-          <w:szCs w:val="20"/>
-        </w:rPr>
-        <w:t>af_bella</w:t>
-      </w:r>
-      <w:proofErr w:type="spellEnd"/>
-      <w:r>
-        <w:rPr>
-          <w:rFonts w:ascii="Courier New" w:eastAsia="Courier New" w:hAnsi="Courier New" w:cs="Courier New"/>
-          <w:sz w:val="20"/>
-          <w:szCs w:val="20"/>
-        </w:rPr>
-        <w:t>",</w:t>
-      </w:r>
-    </w:p>
-    <w:p>
-      <w:pPr>
-        <w:shd w:val="clear" w:color="auto" w:fill="F5F5F5"/>
-        <w:ind w:left="360"/>
-      </w:pPr>
-      <w:r>
-        <w:rPr>
-          <w:rFonts w:ascii="Courier New" w:eastAsia="Courier New" w:hAnsi="Courier New" w:cs="Courier New"/>
-          <w:sz w:val="20"/>
-          <w:szCs w:val="20"/>
-        </w:rPr>
-        <w:t xml:space="preserve">  "language": "</w:t>
-      </w:r>
-      <w:proofErr w:type="spellStart"/>
-      <w:r>
-        <w:rPr>
-          <w:rFonts w:ascii="Courier New" w:eastAsia="Courier New" w:hAnsi="Courier New" w:cs="Courier New"/>
-          <w:sz w:val="20"/>
-          <w:szCs w:val="20"/>
-        </w:rPr>
-        <w:t>en</w:t>
-      </w:r>
-      <w:proofErr w:type="spellEnd"/>
-      <w:r>
-        <w:rPr>
-          <w:rFonts w:ascii="Courier New" w:eastAsia="Courier New" w:hAnsi="Courier New" w:cs="Courier New"/>
-          <w:sz w:val="20"/>
-          <w:szCs w:val="20"/>
-        </w:rPr>
-        <w:t>-us",</w:t>
+        <w:t xml:space="preserve">  "voice": "af_bella",</w:t>
+      </w:r>
+    </w:p>
+    <w:p>
+      <w:pPr>
+        <w:shd w:val="clear" w:color="auto" w:fill="F5F5F5"/>
+        <w:ind w:left="360"/>
+      </w:pPr>
+      <w:r>
+        <w:rPr>
+          <w:rFonts w:ascii="Courier New" w:eastAsia="Courier New" w:hAnsi="Courier New" w:cs="Courier New"/>
+          <w:sz w:val="20"/>
+          <w:szCs w:val="20"/>
+        </w:rPr>
+        <w:t xml:space="preserve">  "language": "en-us",</w:t>
       </w:r>
     </w:p>
     <w:p>
@@ -9458,161 +8352,49 @@
           <w:sz w:val="20"/>
           <w:szCs w:val="20"/>
         </w:rPr>
-        <w:t xml:space="preserve">  "</w:t>
-      </w:r>
-      <w:proofErr w:type="spellStart"/>
-      <w:proofErr w:type="gramStart"/>
-      <w:r>
-        <w:rPr>
-          <w:rFonts w:ascii="Courier New" w:eastAsia="Courier New" w:hAnsi="Courier New" w:cs="Courier New"/>
-          <w:sz w:val="20"/>
-          <w:szCs w:val="20"/>
-        </w:rPr>
-        <w:t>use</w:t>
-      </w:r>
-      <w:proofErr w:type="gramEnd"/>
-      <w:r>
-        <w:rPr>
-          <w:rFonts w:ascii="Courier New" w:eastAsia="Courier New" w:hAnsi="Courier New" w:cs="Courier New"/>
-          <w:sz w:val="20"/>
-          <w:szCs w:val="20"/>
-        </w:rPr>
-        <w:t>_ssml</w:t>
-      </w:r>
-      <w:proofErr w:type="spellEnd"/>
-      <w:r>
-        <w:rPr>
-          <w:rFonts w:ascii="Courier New" w:eastAsia="Courier New" w:hAnsi="Courier New" w:cs="Courier New"/>
-          <w:sz w:val="20"/>
-          <w:szCs w:val="20"/>
-        </w:rPr>
-        <w:t>": false,</w:t>
-      </w:r>
-    </w:p>
-    <w:p>
-      <w:pPr>
-        <w:shd w:val="clear" w:color="auto" w:fill="F5F5F5"/>
-        <w:ind w:left="360"/>
-      </w:pPr>
-      <w:r>
-        <w:rPr>
-          <w:rFonts w:ascii="Courier New" w:eastAsia="Courier New" w:hAnsi="Courier New" w:cs="Courier New"/>
-          <w:sz w:val="20"/>
-          <w:szCs w:val="20"/>
-        </w:rPr>
-        <w:t xml:space="preserve">  "</w:t>
-      </w:r>
-      <w:proofErr w:type="spellStart"/>
-      <w:proofErr w:type="gramStart"/>
-      <w:r>
-        <w:rPr>
-          <w:rFonts w:ascii="Courier New" w:eastAsia="Courier New" w:hAnsi="Courier New" w:cs="Courier New"/>
-          <w:sz w:val="20"/>
-          <w:szCs w:val="20"/>
-        </w:rPr>
-        <w:t>output</w:t>
-      </w:r>
-      <w:proofErr w:type="gramEnd"/>
-      <w:r>
-        <w:rPr>
-          <w:rFonts w:ascii="Courier New" w:eastAsia="Courier New" w:hAnsi="Courier New" w:cs="Courier New"/>
-          <w:sz w:val="20"/>
-          <w:szCs w:val="20"/>
-        </w:rPr>
-        <w:t>_format</w:t>
-      </w:r>
-      <w:proofErr w:type="spellEnd"/>
-      <w:r>
-        <w:rPr>
-          <w:rFonts w:ascii="Courier New" w:eastAsia="Courier New" w:hAnsi="Courier New" w:cs="Courier New"/>
-          <w:sz w:val="20"/>
-          <w:szCs w:val="20"/>
-        </w:rPr>
-        <w:t>": "wav",</w:t>
-      </w:r>
-    </w:p>
-    <w:p>
-      <w:pPr>
-        <w:shd w:val="clear" w:color="auto" w:fill="F5F5F5"/>
-        <w:ind w:left="360"/>
-      </w:pPr>
-      <w:r>
-        <w:rPr>
-          <w:rFonts w:ascii="Courier New" w:eastAsia="Courier New" w:hAnsi="Courier New" w:cs="Courier New"/>
-          <w:sz w:val="20"/>
-          <w:szCs w:val="20"/>
-        </w:rPr>
-        <w:t xml:space="preserve">  "</w:t>
-      </w:r>
-      <w:proofErr w:type="spellStart"/>
-      <w:proofErr w:type="gramStart"/>
-      <w:r>
-        <w:rPr>
-          <w:rFonts w:ascii="Courier New" w:eastAsia="Courier New" w:hAnsi="Courier New" w:cs="Courier New"/>
-          <w:sz w:val="20"/>
-          <w:szCs w:val="20"/>
-        </w:rPr>
-        <w:t>loudness</w:t>
-      </w:r>
-      <w:proofErr w:type="gramEnd"/>
-      <w:r>
-        <w:rPr>
-          <w:rFonts w:ascii="Courier New" w:eastAsia="Courier New" w:hAnsi="Courier New" w:cs="Courier New"/>
-          <w:sz w:val="20"/>
-          <w:szCs w:val="20"/>
-        </w:rPr>
-        <w:t>_profile</w:t>
-      </w:r>
-      <w:proofErr w:type="spellEnd"/>
-      <w:r>
-        <w:rPr>
-          <w:rFonts w:ascii="Courier New" w:eastAsia="Courier New" w:hAnsi="Courier New" w:cs="Courier New"/>
-          <w:sz w:val="20"/>
-          <w:szCs w:val="20"/>
-        </w:rPr>
-        <w:t>": "broadcast",</w:t>
-      </w:r>
-    </w:p>
-    <w:p>
-      <w:pPr>
-        <w:shd w:val="clear" w:color="auto" w:fill="F5F5F5"/>
-        <w:ind w:left="360"/>
-      </w:pPr>
-      <w:r>
-        <w:rPr>
-          <w:rFonts w:ascii="Courier New" w:eastAsia="Courier New" w:hAnsi="Courier New" w:cs="Courier New"/>
-          <w:sz w:val="20"/>
-          <w:szCs w:val="20"/>
-        </w:rPr>
-        <w:t xml:space="preserve">  "</w:t>
-      </w:r>
-      <w:proofErr w:type="spellStart"/>
-      <w:proofErr w:type="gramStart"/>
-      <w:r>
-        <w:rPr>
-          <w:rFonts w:ascii="Courier New" w:eastAsia="Courier New" w:hAnsi="Courier New" w:cs="Courier New"/>
-          <w:sz w:val="20"/>
-          <w:szCs w:val="20"/>
-        </w:rPr>
-        <w:t>noise</w:t>
-      </w:r>
-      <w:proofErr w:type="gramEnd"/>
-      <w:r>
-        <w:rPr>
-          <w:rFonts w:ascii="Courier New" w:eastAsia="Courier New" w:hAnsi="Courier New" w:cs="Courier New"/>
-          <w:sz w:val="20"/>
-          <w:szCs w:val="20"/>
-        </w:rPr>
-        <w:t>_reduce</w:t>
-      </w:r>
-      <w:proofErr w:type="spellEnd"/>
-      <w:r>
-        <w:rPr>
-          <w:rFonts w:ascii="Courier New" w:eastAsia="Courier New" w:hAnsi="Courier New" w:cs="Courier New"/>
-          <w:sz w:val="20"/>
-          <w:szCs w:val="20"/>
-        </w:rPr>
-        <w:t>": true,</w:t>
+        <w:t xml:space="preserve">  "use_ssml": false,</w:t>
+      </w:r>
+    </w:p>
+    <w:p>
+      <w:pPr>
+        <w:shd w:val="clear" w:color="auto" w:fill="F5F5F5"/>
+        <w:ind w:left="360"/>
+      </w:pPr>
+      <w:r>
+        <w:rPr>
+          <w:rFonts w:ascii="Courier New" w:eastAsia="Courier New" w:hAnsi="Courier New" w:cs="Courier New"/>
+          <w:sz w:val="20"/>
+          <w:szCs w:val="20"/>
+        </w:rPr>
+        <w:t xml:space="preserve">  "output_format": "wav",</w:t>
+      </w:r>
+    </w:p>
+    <w:p>
+      <w:pPr>
+        <w:shd w:val="clear" w:color="auto" w:fill="F5F5F5"/>
+        <w:ind w:left="360"/>
+      </w:pPr>
+      <w:r>
+        <w:rPr>
+          <w:rFonts w:ascii="Courier New" w:eastAsia="Courier New" w:hAnsi="Courier New" w:cs="Courier New"/>
+          <w:sz w:val="20"/>
+          <w:szCs w:val="20"/>
+        </w:rPr>
+        <w:t xml:space="preserve">  "loudness_profile": "broadcast",</w:t>
+      </w:r>
+    </w:p>
+    <w:p>
+      <w:pPr>
+        <w:shd w:val="clear" w:color="auto" w:fill="F5F5F5"/>
+        <w:ind w:left="360"/>
+      </w:pPr>
+      <w:r>
+        <w:rPr>
+          <w:rFonts w:ascii="Courier New" w:eastAsia="Courier New" w:hAnsi="Courier New" w:cs="Courier New"/>
+          <w:sz w:val="20"/>
+          <w:szCs w:val="20"/>
+        </w:rPr>
+        <w:t xml:space="preserve">  "noise_reduce": true,</w:t>
       </w:r>
     </w:p>
     <w:p>
@@ -9700,25 +8482,7 @@
           <w:sz w:val="20"/>
           <w:szCs w:val="20"/>
         </w:rPr>
-        <w:t xml:space="preserve">  "voice": "</w:t>
-      </w:r>
-      <w:proofErr w:type="spellStart"/>
-      <w:r>
-        <w:rPr>
-          <w:rFonts w:ascii="Courier New" w:eastAsia="Courier New" w:hAnsi="Courier New" w:cs="Courier New"/>
-          <w:sz w:val="20"/>
-          <w:szCs w:val="20"/>
-        </w:rPr>
-        <w:t>clone:myspeaker</w:t>
-      </w:r>
-      <w:proofErr w:type="spellEnd"/>
-      <w:r>
-        <w:rPr>
-          <w:rFonts w:ascii="Courier New" w:eastAsia="Courier New" w:hAnsi="Courier New" w:cs="Courier New"/>
-          <w:sz w:val="20"/>
-          <w:szCs w:val="20"/>
-        </w:rPr>
-        <w:t>",</w:t>
+        <w:t xml:space="preserve">  "voice": "clone:myspeaker",</w:t>
       </w:r>
     </w:p>
     <w:p>
@@ -9746,35 +8510,7 @@
           <w:sz w:val="20"/>
           <w:szCs w:val="20"/>
         </w:rPr>
-        <w:t xml:space="preserve">  "</w:t>
-      </w:r>
-      <w:proofErr w:type="spellStart"/>
-      <w:proofErr w:type="gramStart"/>
-      <w:r>
-        <w:rPr>
-          <w:rFonts w:ascii="Courier New" w:eastAsia="Courier New" w:hAnsi="Courier New" w:cs="Courier New"/>
-          <w:sz w:val="20"/>
-          <w:szCs w:val="20"/>
-        </w:rPr>
-        <w:t>reference</w:t>
-      </w:r>
-      <w:proofErr w:type="gramEnd"/>
-      <w:r>
-        <w:rPr>
-          <w:rFonts w:ascii="Courier New" w:eastAsia="Courier New" w:hAnsi="Courier New" w:cs="Courier New"/>
-          <w:sz w:val="20"/>
-          <w:szCs w:val="20"/>
-        </w:rPr>
-        <w:t>_audio</w:t>
-      </w:r>
-      <w:proofErr w:type="spellEnd"/>
-      <w:r>
-        <w:rPr>
-          <w:rFonts w:ascii="Courier New" w:eastAsia="Courier New" w:hAnsi="Courier New" w:cs="Courier New"/>
-          <w:sz w:val="20"/>
-          <w:szCs w:val="20"/>
-        </w:rPr>
-        <w:t>": "myspeaker.wav"</w:t>
+        <w:t xml:space="preserve">  "reference_audio": "myspeaker.wav"</w:t>
       </w:r>
     </w:p>
     <w:p>
@@ -9834,23 +8570,13 @@
         <w:shd w:val="clear" w:color="auto" w:fill="F5F5F5"/>
         <w:ind w:left="360"/>
       </w:pPr>
-      <w:proofErr w:type="spellStart"/>
-      <w:r>
-        <w:rPr>
-          <w:rFonts w:ascii="Courier New" w:eastAsia="Courier New" w:hAnsi="Courier New" w:cs="Courier New"/>
-          <w:sz w:val="20"/>
-          <w:szCs w:val="20"/>
-        </w:rPr>
-        <w:t>pytest</w:t>
-      </w:r>
-      <w:proofErr w:type="spellEnd"/>
-      <w:r>
-        <w:rPr>
-          <w:rFonts w:ascii="Courier New" w:eastAsia="Courier New" w:hAnsi="Courier New" w:cs="Courier New"/>
-          <w:sz w:val="20"/>
-          <w:szCs w:val="20"/>
-        </w:rPr>
-        <w:t xml:space="preserve"> tests/ -v</w:t>
+      <w:r>
+        <w:rPr>
+          <w:rFonts w:ascii="Courier New" w:eastAsia="Courier New" w:hAnsi="Courier New" w:cs="Courier New"/>
+          <w:sz w:val="20"/>
+          <w:szCs w:val="20"/>
+        </w:rPr>
+        <w:t>pytest tests/ -v</w:t>
       </w:r>
     </w:p>
     <w:p>
@@ -9886,77 +8612,13 @@
         <w:shd w:val="clear" w:color="auto" w:fill="F5F5F5"/>
         <w:ind w:left="360"/>
       </w:pPr>
-      <w:proofErr w:type="spellStart"/>
-      <w:r>
-        <w:rPr>
-          <w:rFonts w:ascii="Courier New" w:eastAsia="Courier New" w:hAnsi="Courier New" w:cs="Courier New"/>
-          <w:sz w:val="20"/>
-          <w:szCs w:val="20"/>
-        </w:rPr>
-        <w:t>pytest</w:t>
-      </w:r>
-      <w:proofErr w:type="spellEnd"/>
-      <w:r>
-        <w:rPr>
-          <w:rFonts w:ascii="Courier New" w:eastAsia="Courier New" w:hAnsi="Courier New" w:cs="Courier New"/>
-          <w:sz w:val="20"/>
-          <w:szCs w:val="20"/>
-        </w:rPr>
-        <w:t xml:space="preserve"> tests/ -v --</w:t>
-      </w:r>
-      <w:proofErr w:type="spellStart"/>
-      <w:r>
-        <w:rPr>
-          <w:rFonts w:ascii="Courier New" w:eastAsia="Courier New" w:hAnsi="Courier New" w:cs="Courier New"/>
-          <w:sz w:val="20"/>
-          <w:szCs w:val="20"/>
-        </w:rPr>
-        <w:t>cov</w:t>
-      </w:r>
-      <w:proofErr w:type="spellEnd"/>
-      <w:r>
-        <w:rPr>
-          <w:rFonts w:ascii="Courier New" w:eastAsia="Courier New" w:hAnsi="Courier New" w:cs="Courier New"/>
-          <w:sz w:val="20"/>
-          <w:szCs w:val="20"/>
-        </w:rPr>
-        <w:t>=backend --</w:t>
-      </w:r>
-      <w:proofErr w:type="spellStart"/>
-      <w:r>
-        <w:rPr>
-          <w:rFonts w:ascii="Courier New" w:eastAsia="Courier New" w:hAnsi="Courier New" w:cs="Courier New"/>
-          <w:sz w:val="20"/>
-          <w:szCs w:val="20"/>
-        </w:rPr>
-        <w:t>cov</w:t>
-      </w:r>
-      <w:proofErr w:type="spellEnd"/>
-      <w:r>
-        <w:rPr>
-          <w:rFonts w:ascii="Courier New" w:eastAsia="Courier New" w:hAnsi="Courier New" w:cs="Courier New"/>
-          <w:sz w:val="20"/>
-          <w:szCs w:val="20"/>
-        </w:rPr>
-        <w:t>=configs --</w:t>
-      </w:r>
-      <w:proofErr w:type="spellStart"/>
-      <w:r>
-        <w:rPr>
-          <w:rFonts w:ascii="Courier New" w:eastAsia="Courier New" w:hAnsi="Courier New" w:cs="Courier New"/>
-          <w:sz w:val="20"/>
-          <w:szCs w:val="20"/>
-        </w:rPr>
-        <w:t>cov</w:t>
-      </w:r>
-      <w:proofErr w:type="spellEnd"/>
-      <w:r>
-        <w:rPr>
-          <w:rFonts w:ascii="Courier New" w:eastAsia="Courier New" w:hAnsi="Courier New" w:cs="Courier New"/>
-          <w:sz w:val="20"/>
-          <w:szCs w:val="20"/>
-        </w:rPr>
-        <w:t>-report=term-missing</w:t>
+      <w:r>
+        <w:rPr>
+          <w:rFonts w:ascii="Courier New" w:eastAsia="Courier New" w:hAnsi="Courier New" w:cs="Courier New"/>
+          <w:sz w:val="20"/>
+          <w:szCs w:val="20"/>
+        </w:rPr>
+        <w:t>pytest tests/ -v --cov=backend --cov=configs --cov-report=term-missing</w:t>
       </w:r>
     </w:p>
     <w:p>
@@ -9992,95 +8654,55 @@
         <w:shd w:val="clear" w:color="auto" w:fill="F5F5F5"/>
         <w:ind w:left="360"/>
       </w:pPr>
-      <w:proofErr w:type="spellStart"/>
-      <w:r>
-        <w:rPr>
-          <w:rFonts w:ascii="Courier New" w:eastAsia="Courier New" w:hAnsi="Courier New" w:cs="Courier New"/>
-          <w:sz w:val="20"/>
-          <w:szCs w:val="20"/>
-        </w:rPr>
-        <w:t>pytest</w:t>
-      </w:r>
-      <w:proofErr w:type="spellEnd"/>
-      <w:r>
-        <w:rPr>
-          <w:rFonts w:ascii="Courier New" w:eastAsia="Courier New" w:hAnsi="Courier New" w:cs="Courier New"/>
-          <w:sz w:val="20"/>
-          <w:szCs w:val="20"/>
-        </w:rPr>
-        <w:t xml:space="preserve"> tests/test_broadcast.py -v   # EBU R128 + audio pipeline</w:t>
-      </w:r>
-    </w:p>
-    <w:p>
-      <w:pPr>
-        <w:shd w:val="clear" w:color="auto" w:fill="F5F5F5"/>
-        <w:ind w:left="360"/>
-      </w:pPr>
-      <w:proofErr w:type="spellStart"/>
-      <w:r>
-        <w:rPr>
-          <w:rFonts w:ascii="Courier New" w:eastAsia="Courier New" w:hAnsi="Courier New" w:cs="Courier New"/>
-          <w:sz w:val="20"/>
-          <w:szCs w:val="20"/>
-        </w:rPr>
-        <w:t>pytest</w:t>
-      </w:r>
-      <w:proofErr w:type="spellEnd"/>
-      <w:r>
-        <w:rPr>
-          <w:rFonts w:ascii="Courier New" w:eastAsia="Courier New" w:hAnsi="Courier New" w:cs="Courier New"/>
-          <w:sz w:val="20"/>
-          <w:szCs w:val="20"/>
-        </w:rPr>
-        <w:t xml:space="preserve"> tests/test_ssml.py -v        # SSML parser</w:t>
-      </w:r>
-    </w:p>
-    <w:p>
-      <w:pPr>
-        <w:shd w:val="clear" w:color="auto" w:fill="F5F5F5"/>
-        <w:ind w:left="360"/>
-      </w:pPr>
-      <w:proofErr w:type="spellStart"/>
-      <w:r>
-        <w:rPr>
-          <w:rFonts w:ascii="Courier New" w:eastAsia="Courier New" w:hAnsi="Courier New" w:cs="Courier New"/>
-          <w:sz w:val="20"/>
-          <w:szCs w:val="20"/>
-        </w:rPr>
-        <w:t>pytest</w:t>
-      </w:r>
-      <w:proofErr w:type="spellEnd"/>
-      <w:r>
-        <w:rPr>
-          <w:rFonts w:ascii="Courier New" w:eastAsia="Courier New" w:hAnsi="Courier New" w:cs="Courier New"/>
-          <w:sz w:val="20"/>
-          <w:szCs w:val="20"/>
-        </w:rPr>
-        <w:t xml:space="preserve"> tests/test_api.py -v         # API integration</w:t>
-      </w:r>
-    </w:p>
-    <w:p>
-      <w:pPr>
-        <w:shd w:val="clear" w:color="auto" w:fill="F5F5F5"/>
-        <w:ind w:left="360"/>
-      </w:pPr>
-      <w:proofErr w:type="spellStart"/>
-      <w:r>
-        <w:rPr>
-          <w:rFonts w:ascii="Courier New" w:eastAsia="Courier New" w:hAnsi="Courier New" w:cs="Courier New"/>
-          <w:sz w:val="20"/>
-          <w:szCs w:val="20"/>
-        </w:rPr>
-        <w:t>pytest</w:t>
-      </w:r>
-      <w:proofErr w:type="spellEnd"/>
-      <w:r>
-        <w:rPr>
-          <w:rFonts w:ascii="Courier New" w:eastAsia="Courier New" w:hAnsi="Courier New" w:cs="Courier New"/>
-          <w:sz w:val="20"/>
-          <w:szCs w:val="20"/>
-        </w:rPr>
-        <w:t xml:space="preserve"> tests/test_engines.py -v     # Engine unit tests</w:t>
+      <w:r>
+        <w:rPr>
+          <w:rFonts w:ascii="Courier New" w:eastAsia="Courier New" w:hAnsi="Courier New" w:cs="Courier New"/>
+          <w:sz w:val="20"/>
+          <w:szCs w:val="20"/>
+        </w:rPr>
+        <w:t>pytest tests/test_broadcast.py -v   # EBU R128 + audio pipeline</w:t>
+      </w:r>
+    </w:p>
+    <w:p>
+      <w:pPr>
+        <w:shd w:val="clear" w:color="auto" w:fill="F5F5F5"/>
+        <w:ind w:left="360"/>
+      </w:pPr>
+      <w:r>
+        <w:rPr>
+          <w:rFonts w:ascii="Courier New" w:eastAsia="Courier New" w:hAnsi="Courier New" w:cs="Courier New"/>
+          <w:sz w:val="20"/>
+          <w:szCs w:val="20"/>
+        </w:rPr>
+        <w:t>pytest tests/test_ssml.py -v        # SSML parser</w:t>
+      </w:r>
+    </w:p>
+    <w:p>
+      <w:pPr>
+        <w:shd w:val="clear" w:color="auto" w:fill="F5F5F5"/>
+        <w:ind w:left="360"/>
+      </w:pPr>
+      <w:r>
+        <w:rPr>
+          <w:rFonts w:ascii="Courier New" w:eastAsia="Courier New" w:hAnsi="Courier New" w:cs="Courier New"/>
+          <w:sz w:val="20"/>
+          <w:szCs w:val="20"/>
+        </w:rPr>
+        <w:t>pytest tests/test_api.py -v         # API integration</w:t>
+      </w:r>
+    </w:p>
+    <w:p>
+      <w:pPr>
+        <w:shd w:val="clear" w:color="auto" w:fill="F5F5F5"/>
+        <w:ind w:left="360"/>
+      </w:pPr>
+      <w:r>
+        <w:rPr>
+          <w:rFonts w:ascii="Courier New" w:eastAsia="Courier New" w:hAnsi="Courier New" w:cs="Courier New"/>
+          <w:sz w:val="20"/>
+          <w:szCs w:val="20"/>
+        </w:rPr>
+        <w:t>pytest tests/test_engines.py -v     # Engine unit tests</w:t>
       </w:r>
     </w:p>
     <w:p>
@@ -10140,15 +8762,7 @@
         <w:spacing w:after="120"/>
       </w:pPr>
       <w:r>
-        <w:t xml:space="preserve">All reference audio files are version-controlled in </w:t>
-      </w:r>
-      <w:proofErr w:type="spellStart"/>
-      <w:r>
-        <w:t>input_samples</w:t>
-      </w:r>
-      <w:proofErr w:type="spellEnd"/>
-      <w:r>
-        <w:t>/ — no manual placement needed.</w:t>
+        <w:t>All reference audio files are version-controlled in input_samples/ — no manual placement needed.</w:t>
       </w:r>
     </w:p>
     <w:p>
@@ -10490,7 +9104,6 @@
             <w:vAlign w:val="center"/>
           </w:tcPr>
           <w:p>
-            <w:proofErr w:type="spellStart"/>
             <w:r>
               <w:rPr>
                 <w:sz w:val="20"/>
@@ -10498,7 +9111,6 @@
               </w:rPr>
               <w:t>pyloudnorm</w:t>
             </w:r>
-            <w:proofErr w:type="spellEnd"/>
           </w:p>
         </w:tc>
         <w:tc>
@@ -10581,7 +9193,6 @@
             <w:vAlign w:val="center"/>
           </w:tcPr>
           <w:p>
-            <w:proofErr w:type="spellStart"/>
             <w:r>
               <w:rPr>
                 <w:sz w:val="20"/>
@@ -10589,7 +9200,6 @@
               </w:rPr>
               <w:t>noisereduce</w:t>
             </w:r>
-            <w:proofErr w:type="spellEnd"/>
           </w:p>
         </w:tc>
         <w:tc>
@@ -10672,31 +9282,13 @@
             <w:vAlign w:val="center"/>
           </w:tcPr>
           <w:p>
-            <w:proofErr w:type="spellStart"/>
-            <w:r>
-              <w:rPr>
-                <w:sz w:val="20"/>
-                <w:szCs w:val="20"/>
-              </w:rPr>
-              <w:t>FastAPI</w:t>
-            </w:r>
-            <w:proofErr w:type="spellEnd"/>
-            <w:r>
-              <w:rPr>
-                <w:sz w:val="20"/>
-                <w:szCs w:val="20"/>
-              </w:rPr>
-              <w:t xml:space="preserve"> / </w:t>
-            </w:r>
-            <w:proofErr w:type="spellStart"/>
-            <w:r>
-              <w:rPr>
-                <w:sz w:val="20"/>
-                <w:szCs w:val="20"/>
-              </w:rPr>
-              <w:t>Uvicorn</w:t>
-            </w:r>
-            <w:proofErr w:type="spellEnd"/>
+            <w:r>
+              <w:rPr>
+                <w:sz w:val="20"/>
+                <w:szCs w:val="20"/>
+              </w:rPr>
+              <w:t>FastAPI / Uvicorn</w:t>
+            </w:r>
           </w:p>
         </w:tc>
         <w:tc>
@@ -10868,31 +9460,13 @@
             <w:vAlign w:val="center"/>
           </w:tcPr>
           <w:p>
-            <w:proofErr w:type="spellStart"/>
-            <w:r>
-              <w:rPr>
-                <w:sz w:val="20"/>
-                <w:szCs w:val="20"/>
-              </w:rPr>
-              <w:t>soundfile</w:t>
-            </w:r>
-            <w:proofErr w:type="spellEnd"/>
-            <w:r>
-              <w:rPr>
-                <w:sz w:val="20"/>
-                <w:szCs w:val="20"/>
-              </w:rPr>
-              <w:t xml:space="preserve"> / </w:t>
-            </w:r>
-            <w:proofErr w:type="spellStart"/>
-            <w:r>
-              <w:rPr>
-                <w:sz w:val="20"/>
-                <w:szCs w:val="20"/>
-              </w:rPr>
-              <w:t>scipy</w:t>
-            </w:r>
-            <w:proofErr w:type="spellEnd"/>
+            <w:r>
+              <w:rPr>
+                <w:sz w:val="20"/>
+                <w:szCs w:val="20"/>
+              </w:rPr>
+              <w:t>soundfile / scipy</w:t>
+            </w:r>
           </w:p>
         </w:tc>
         <w:tc>
@@ -11003,23 +9577,13 @@
         <w:shd w:val="clear" w:color="auto" w:fill="F5F5F5"/>
         <w:ind w:left="360"/>
       </w:pPr>
-      <w:proofErr w:type="spellStart"/>
-      <w:r>
-        <w:rPr>
-          <w:rFonts w:ascii="Courier New" w:eastAsia="Courier New" w:hAnsi="Courier New" w:cs="Courier New"/>
-          <w:sz w:val="20"/>
-          <w:szCs w:val="20"/>
-        </w:rPr>
-        <w:t>Custom_TTS_Model</w:t>
-      </w:r>
-      <w:proofErr w:type="spellEnd"/>
-      <w:r>
-        <w:rPr>
-          <w:rFonts w:ascii="Courier New" w:eastAsia="Courier New" w:hAnsi="Courier New" w:cs="Courier New"/>
-          <w:sz w:val="20"/>
-          <w:szCs w:val="20"/>
-        </w:rPr>
-        <w:t>/</w:t>
+      <w:r>
+        <w:rPr>
+          <w:rFonts w:ascii="Courier New" w:eastAsia="Courier New" w:hAnsi="Courier New" w:cs="Courier New"/>
+          <w:sz w:val="20"/>
+          <w:szCs w:val="20"/>
+        </w:rPr>
+        <w:t>Custom_TTS_Model/</w:t>
       </w:r>
     </w:p>
     <w:p>
@@ -11061,25 +9625,7 @@
           <w:sz w:val="20"/>
           <w:szCs w:val="20"/>
         </w:rPr>
-        <w:t xml:space="preserve">└── </w:t>
-      </w:r>
-      <w:proofErr w:type="spellStart"/>
-      <w:r>
-        <w:rPr>
-          <w:rFonts w:ascii="Courier New" w:eastAsia="Courier New" w:hAnsi="Courier New" w:cs="Courier New"/>
-          <w:sz w:val="20"/>
-          <w:szCs w:val="20"/>
-        </w:rPr>
-        <w:t>tts</w:t>
-      </w:r>
-      <w:proofErr w:type="spellEnd"/>
-      <w:r>
-        <w:rPr>
-          <w:rFonts w:ascii="Courier New" w:eastAsia="Courier New" w:hAnsi="Courier New" w:cs="Courier New"/>
-          <w:sz w:val="20"/>
-          <w:szCs w:val="20"/>
-        </w:rPr>
-        <w:t>-agent/</w:t>
+        <w:t>└── tts-agent/</w:t>
       </w:r>
     </w:p>
     <w:p>
@@ -11107,57 +9653,21 @@
           <w:sz w:val="20"/>
           <w:szCs w:val="20"/>
         </w:rPr>
-        <w:t xml:space="preserve">    │   ├── app.py                   # </w:t>
-      </w:r>
-      <w:proofErr w:type="spellStart"/>
-      <w:r>
-        <w:rPr>
-          <w:rFonts w:ascii="Courier New" w:eastAsia="Courier New" w:hAnsi="Courier New" w:cs="Courier New"/>
-          <w:sz w:val="20"/>
-          <w:szCs w:val="20"/>
-        </w:rPr>
-        <w:t>FastAPI</w:t>
-      </w:r>
-      <w:proofErr w:type="spellEnd"/>
-      <w:r>
-        <w:rPr>
-          <w:rFonts w:ascii="Courier New" w:eastAsia="Courier New" w:hAnsi="Courier New" w:cs="Courier New"/>
-          <w:sz w:val="20"/>
-          <w:szCs w:val="20"/>
-        </w:rPr>
-        <w:t xml:space="preserve"> factory (v3.0.0)</w:t>
-      </w:r>
-    </w:p>
-    <w:p>
-      <w:pPr>
-        <w:shd w:val="clear" w:color="auto" w:fill="F5F5F5"/>
-        <w:ind w:left="360"/>
-      </w:pPr>
-      <w:r>
-        <w:rPr>
-          <w:rFonts w:ascii="Courier New" w:eastAsia="Courier New" w:hAnsi="Courier New" w:cs="Courier New"/>
-          <w:sz w:val="20"/>
-          <w:szCs w:val="20"/>
-        </w:rPr>
-        <w:t xml:space="preserve">    │   ├── </w:t>
-      </w:r>
-      <w:proofErr w:type="spellStart"/>
-      <w:r>
-        <w:rPr>
-          <w:rFonts w:ascii="Courier New" w:eastAsia="Courier New" w:hAnsi="Courier New" w:cs="Courier New"/>
-          <w:sz w:val="20"/>
-          <w:szCs w:val="20"/>
-        </w:rPr>
-        <w:t>api</w:t>
-      </w:r>
-      <w:proofErr w:type="spellEnd"/>
-      <w:r>
-        <w:rPr>
-          <w:rFonts w:ascii="Courier New" w:eastAsia="Courier New" w:hAnsi="Courier New" w:cs="Courier New"/>
-          <w:sz w:val="20"/>
-          <w:szCs w:val="20"/>
-        </w:rPr>
-        <w:t>/</w:t>
+        <w:t xml:space="preserve">    │   ├── app.py                   # FastAPI factory (v3.0.0)</w:t>
+      </w:r>
+    </w:p>
+    <w:p>
+      <w:pPr>
+        <w:shd w:val="clear" w:color="auto" w:fill="F5F5F5"/>
+        <w:ind w:left="360"/>
+      </w:pPr>
+      <w:r>
+        <w:rPr>
+          <w:rFonts w:ascii="Courier New" w:eastAsia="Courier New" w:hAnsi="Courier New" w:cs="Courier New"/>
+          <w:sz w:val="20"/>
+          <w:szCs w:val="20"/>
+        </w:rPr>
+        <w:t xml:space="preserve">    │   ├── api/</w:t>
       </w:r>
     </w:p>
     <w:p>
@@ -11185,25 +9695,7 @@
           <w:sz w:val="20"/>
           <w:szCs w:val="20"/>
         </w:rPr>
-        <w:t xml:space="preserve">    │   │   └── schemas.py           # </w:t>
-      </w:r>
-      <w:proofErr w:type="spellStart"/>
-      <w:r>
-        <w:rPr>
-          <w:rFonts w:ascii="Courier New" w:eastAsia="Courier New" w:hAnsi="Courier New" w:cs="Courier New"/>
-          <w:sz w:val="20"/>
-          <w:szCs w:val="20"/>
-        </w:rPr>
-        <w:t>Pydantic</w:t>
-      </w:r>
-      <w:proofErr w:type="spellEnd"/>
-      <w:r>
-        <w:rPr>
-          <w:rFonts w:ascii="Courier New" w:eastAsia="Courier New" w:hAnsi="Courier New" w:cs="Courier New"/>
-          <w:sz w:val="20"/>
-          <w:szCs w:val="20"/>
-        </w:rPr>
-        <w:t xml:space="preserve"> request/response models</w:t>
+        <w:t xml:space="preserve">    │   │   └── schemas.py           # Pydantic request/response models</w:t>
       </w:r>
     </w:p>
     <w:p>
@@ -11231,25 +9723,7 @@
           <w:sz w:val="20"/>
           <w:szCs w:val="20"/>
         </w:rPr>
-        <w:t xml:space="preserve">    │   │   ├── base.py              # Abstract </w:t>
-      </w:r>
-      <w:proofErr w:type="spellStart"/>
-      <w:r>
-        <w:rPr>
-          <w:rFonts w:ascii="Courier New" w:eastAsia="Courier New" w:hAnsi="Courier New" w:cs="Courier New"/>
-          <w:sz w:val="20"/>
-          <w:szCs w:val="20"/>
-        </w:rPr>
-        <w:t>TTSEngine</w:t>
-      </w:r>
-      <w:proofErr w:type="spellEnd"/>
-      <w:r>
-        <w:rPr>
-          <w:rFonts w:ascii="Courier New" w:eastAsia="Courier New" w:hAnsi="Courier New" w:cs="Courier New"/>
-          <w:sz w:val="20"/>
-          <w:szCs w:val="20"/>
-        </w:rPr>
-        <w:t xml:space="preserve"> contract</w:t>
+        <w:t xml:space="preserve">    │   │   ├── base.py              # Abstract TTSEngine contract</w:t>
       </w:r>
     </w:p>
     <w:p>
@@ -11417,107 +9891,35 @@
           <w:sz w:val="20"/>
           <w:szCs w:val="20"/>
         </w:rPr>
-        <w:t xml:space="preserve">    │   └── static/{</w:t>
-      </w:r>
-      <w:proofErr w:type="spellStart"/>
-      <w:r>
-        <w:rPr>
-          <w:rFonts w:ascii="Courier New" w:eastAsia="Courier New" w:hAnsi="Courier New" w:cs="Courier New"/>
-          <w:sz w:val="20"/>
-          <w:szCs w:val="20"/>
-        </w:rPr>
-        <w:t>css,js</w:t>
-      </w:r>
-      <w:proofErr w:type="spellEnd"/>
-      <w:r>
-        <w:rPr>
-          <w:rFonts w:ascii="Courier New" w:eastAsia="Courier New" w:hAnsi="Courier New" w:cs="Courier New"/>
-          <w:sz w:val="20"/>
-          <w:szCs w:val="20"/>
-        </w:rPr>
-        <w:t>}/</w:t>
-      </w:r>
-    </w:p>
-    <w:p>
-      <w:pPr>
-        <w:shd w:val="clear" w:color="auto" w:fill="F5F5F5"/>
-        <w:ind w:left="360"/>
-      </w:pPr>
-      <w:r>
-        <w:rPr>
-          <w:rFonts w:ascii="Courier New" w:eastAsia="Courier New" w:hAnsi="Courier New" w:cs="Courier New"/>
-          <w:sz w:val="20"/>
-          <w:szCs w:val="20"/>
-        </w:rPr>
-        <w:t xml:space="preserve">    ├── configs/settings.py          # </w:t>
-      </w:r>
-      <w:proofErr w:type="spellStart"/>
-      <w:r>
-        <w:rPr>
-          <w:rFonts w:ascii="Courier New" w:eastAsia="Courier New" w:hAnsi="Courier New" w:cs="Courier New"/>
-          <w:sz w:val="20"/>
-          <w:szCs w:val="20"/>
-        </w:rPr>
-        <w:t>Pydantic</w:t>
-      </w:r>
-      <w:proofErr w:type="spellEnd"/>
-      <w:r>
-        <w:rPr>
-          <w:rFonts w:ascii="Courier New" w:eastAsia="Courier New" w:hAnsi="Courier New" w:cs="Courier New"/>
-          <w:sz w:val="20"/>
-          <w:szCs w:val="20"/>
-        </w:rPr>
-        <w:t xml:space="preserve"> settings from .env</w:t>
-      </w:r>
-    </w:p>
-    <w:p>
-      <w:pPr>
-        <w:shd w:val="clear" w:color="auto" w:fill="F5F5F5"/>
-        <w:ind w:left="360"/>
-      </w:pPr>
-      <w:r>
-        <w:rPr>
-          <w:rFonts w:ascii="Courier New" w:eastAsia="Courier New" w:hAnsi="Courier New" w:cs="Courier New"/>
-          <w:sz w:val="20"/>
-          <w:szCs w:val="20"/>
-        </w:rPr>
-        <w:t xml:space="preserve">    ├── </w:t>
-      </w:r>
-      <w:proofErr w:type="spellStart"/>
-      <w:r>
-        <w:rPr>
-          <w:rFonts w:ascii="Courier New" w:eastAsia="Courier New" w:hAnsi="Courier New" w:cs="Courier New"/>
-          <w:sz w:val="20"/>
-          <w:szCs w:val="20"/>
-        </w:rPr>
-        <w:t>input_samples</w:t>
-      </w:r>
-      <w:proofErr w:type="spellEnd"/>
-      <w:r>
-        <w:rPr>
-          <w:rFonts w:ascii="Courier New" w:eastAsia="Courier New" w:hAnsi="Courier New" w:cs="Courier New"/>
-          <w:sz w:val="20"/>
-          <w:szCs w:val="20"/>
-        </w:rPr>
-        <w:t xml:space="preserve">/               # </w:t>
-      </w:r>
-      <w:proofErr w:type="gramStart"/>
-      <w:r>
-        <w:rPr>
-          <w:rFonts w:ascii="Courier New" w:eastAsia="Courier New" w:hAnsi="Courier New" w:cs="Courier New"/>
-          <w:sz w:val="20"/>
-          <w:szCs w:val="20"/>
-        </w:rPr>
-        <w:t>Pre-packaged</w:t>
-      </w:r>
-      <w:proofErr w:type="gramEnd"/>
-      <w:r>
-        <w:rPr>
-          <w:rFonts w:ascii="Courier New" w:eastAsia="Courier New" w:hAnsi="Courier New" w:cs="Courier New"/>
-          <w:sz w:val="20"/>
-          <w:szCs w:val="20"/>
-        </w:rPr>
-        <w:t xml:space="preserve"> test reference clips (version-controlled)</w:t>
+        <w:t xml:space="preserve">    │   └── static/{css,js}/</w:t>
+      </w:r>
+    </w:p>
+    <w:p>
+      <w:pPr>
+        <w:shd w:val="clear" w:color="auto" w:fill="F5F5F5"/>
+        <w:ind w:left="360"/>
+      </w:pPr>
+      <w:r>
+        <w:rPr>
+          <w:rFonts w:ascii="Courier New" w:eastAsia="Courier New" w:hAnsi="Courier New" w:cs="Courier New"/>
+          <w:sz w:val="20"/>
+          <w:szCs w:val="20"/>
+        </w:rPr>
+        <w:t xml:space="preserve">    ├── configs/settings.py          # Pydantic settings from .env</w:t>
+      </w:r>
+    </w:p>
+    <w:p>
+      <w:pPr>
+        <w:shd w:val="clear" w:color="auto" w:fill="F5F5F5"/>
+        <w:ind w:left="360"/>
+      </w:pPr>
+      <w:r>
+        <w:rPr>
+          <w:rFonts w:ascii="Courier New" w:eastAsia="Courier New" w:hAnsi="Courier New" w:cs="Courier New"/>
+          <w:sz w:val="20"/>
+          <w:szCs w:val="20"/>
+        </w:rPr>
+        <w:t xml:space="preserve">    ├── input_samples/               # Pre-packaged test reference clips (version-controlled)</w:t>
       </w:r>
     </w:p>
     <w:p>
@@ -11615,50 +10017,22 @@
           <w:sz w:val="20"/>
           <w:szCs w:val="20"/>
         </w:rPr>
-        <w:t xml:space="preserve">    │   └── download_models.py       # </w:t>
-      </w:r>
-      <w:proofErr w:type="gramStart"/>
-      <w:r>
-        <w:rPr>
-          <w:rFonts w:ascii="Courier New" w:eastAsia="Courier New" w:hAnsi="Courier New" w:cs="Courier New"/>
-          <w:sz w:val="20"/>
-          <w:szCs w:val="20"/>
-        </w:rPr>
-        <w:t>Pre-download</w:t>
-      </w:r>
-      <w:proofErr w:type="gramEnd"/>
-      <w:r>
-        <w:rPr>
-          <w:rFonts w:ascii="Courier New" w:eastAsia="Courier New" w:hAnsi="Courier New" w:cs="Courier New"/>
-          <w:sz w:val="20"/>
-          <w:szCs w:val="20"/>
-        </w:rPr>
-        <w:t xml:space="preserve"> model weights</w:t>
-      </w:r>
-    </w:p>
-    <w:p>
-      <w:pPr>
-        <w:shd w:val="clear" w:color="auto" w:fill="F5F5F5"/>
-        <w:ind w:left="360"/>
-      </w:pPr>
-      <w:r>
-        <w:rPr>
-          <w:rFonts w:ascii="Courier New" w:eastAsia="Courier New" w:hAnsi="Courier New" w:cs="Courier New"/>
-          <w:sz w:val="20"/>
-          <w:szCs w:val="20"/>
-        </w:rPr>
-        <w:t xml:space="preserve">    ├── </w:t>
-      </w:r>
-      <w:proofErr w:type="spellStart"/>
-      <w:r>
-        <w:rPr>
-          <w:rFonts w:ascii="Courier New" w:eastAsia="Courier New" w:hAnsi="Courier New" w:cs="Courier New"/>
-          <w:sz w:val="20"/>
-          <w:szCs w:val="20"/>
-        </w:rPr>
-        <w:t>Makefile</w:t>
-      </w:r>
-      <w:proofErr w:type="spellEnd"/>
+        <w:t xml:space="preserve">    │   └── download_models.py       # Pre-download model weights</w:t>
+      </w:r>
+    </w:p>
+    <w:p>
+      <w:pPr>
+        <w:shd w:val="clear" w:color="auto" w:fill="F5F5F5"/>
+        <w:ind w:left="360"/>
+      </w:pPr>
+      <w:r>
+        <w:rPr>
+          <w:rFonts w:ascii="Courier New" w:eastAsia="Courier New" w:hAnsi="Courier New" w:cs="Courier New"/>
+          <w:sz w:val="20"/>
+          <w:szCs w:val="20"/>
+        </w:rPr>
+        <w:t xml:space="preserve">    ├── Makefile</w:t>
+      </w:r>
     </w:p>
     <w:p>
       <w:pPr>
@@ -11685,18 +10059,8 @@
           <w:sz w:val="20"/>
           <w:szCs w:val="20"/>
         </w:rPr>
-        <w:t xml:space="preserve">    └── .</w:t>
-      </w:r>
-      <w:proofErr w:type="spellStart"/>
-      <w:r>
-        <w:rPr>
-          <w:rFonts w:ascii="Courier New" w:eastAsia="Courier New" w:hAnsi="Courier New" w:cs="Courier New"/>
-          <w:sz w:val="20"/>
-          <w:szCs w:val="20"/>
-        </w:rPr>
-        <w:t>env.example</w:t>
-      </w:r>
-      <w:proofErr w:type="spellEnd"/>
+        <w:t xml:space="preserve">    └── .env.example</w:t>
+      </w:r>
     </w:p>
     <w:p>
       <w:pPr>
@@ -11756,135 +10120,35 @@
           <w:sz w:val="20"/>
           <w:szCs w:val="20"/>
         </w:rPr>
-        <w:t>HF_TOKEN=</w:t>
-      </w:r>
-      <w:proofErr w:type="spellStart"/>
-      <w:r>
-        <w:rPr>
-          <w:rFonts w:ascii="Courier New" w:eastAsia="Courier New" w:hAnsi="Courier New" w:cs="Courier New"/>
-          <w:sz w:val="20"/>
-          <w:szCs w:val="20"/>
-        </w:rPr>
-        <w:t>hf_xxx</w:t>
-      </w:r>
-      <w:proofErr w:type="spellEnd"/>
-      <w:r>
-        <w:rPr>
-          <w:rFonts w:ascii="Courier New" w:eastAsia="Courier New" w:hAnsi="Courier New" w:cs="Courier New"/>
-          <w:sz w:val="20"/>
-          <w:szCs w:val="20"/>
-        </w:rPr>
-        <w:t xml:space="preserve">                    # </w:t>
-      </w:r>
-      <w:proofErr w:type="spellStart"/>
-      <w:r>
-        <w:rPr>
-          <w:rFonts w:ascii="Courier New" w:eastAsia="Courier New" w:hAnsi="Courier New" w:cs="Courier New"/>
-          <w:sz w:val="20"/>
-          <w:szCs w:val="20"/>
-        </w:rPr>
-        <w:t>HuggingFace</w:t>
-      </w:r>
-      <w:proofErr w:type="spellEnd"/>
-      <w:r>
-        <w:rPr>
-          <w:rFonts w:ascii="Courier New" w:eastAsia="Courier New" w:hAnsi="Courier New" w:cs="Courier New"/>
-          <w:sz w:val="20"/>
-          <w:szCs w:val="20"/>
-        </w:rPr>
-        <w:t xml:space="preserve"> token (optional, removes rate limits)</w:t>
-      </w:r>
-    </w:p>
-    <w:p>
-      <w:pPr>
-        <w:shd w:val="clear" w:color="auto" w:fill="F5F5F5"/>
-        <w:ind w:left="360"/>
-      </w:pPr>
-      <w:r>
-        <w:rPr>
-          <w:rFonts w:ascii="Courier New" w:eastAsia="Courier New" w:hAnsi="Courier New" w:cs="Courier New"/>
-          <w:sz w:val="20"/>
-          <w:szCs w:val="20"/>
-        </w:rPr>
-        <w:t xml:space="preserve">DEVICE=auto                        # auto | </w:t>
-      </w:r>
-      <w:proofErr w:type="spellStart"/>
-      <w:r>
-        <w:rPr>
-          <w:rFonts w:ascii="Courier New" w:eastAsia="Courier New" w:hAnsi="Courier New" w:cs="Courier New"/>
-          <w:sz w:val="20"/>
-          <w:szCs w:val="20"/>
-        </w:rPr>
-        <w:t>cuda</w:t>
-      </w:r>
-      <w:proofErr w:type="spellEnd"/>
-      <w:r>
-        <w:rPr>
-          <w:rFonts w:ascii="Courier New" w:eastAsia="Courier New" w:hAnsi="Courier New" w:cs="Courier New"/>
-          <w:sz w:val="20"/>
-          <w:szCs w:val="20"/>
-        </w:rPr>
-        <w:t xml:space="preserve"> | </w:t>
-      </w:r>
-      <w:proofErr w:type="spellStart"/>
-      <w:r>
-        <w:rPr>
-          <w:rFonts w:ascii="Courier New" w:eastAsia="Courier New" w:hAnsi="Courier New" w:cs="Courier New"/>
-          <w:sz w:val="20"/>
-          <w:szCs w:val="20"/>
-        </w:rPr>
-        <w:t>mps</w:t>
-      </w:r>
-      <w:proofErr w:type="spellEnd"/>
-      <w:r>
-        <w:rPr>
-          <w:rFonts w:ascii="Courier New" w:eastAsia="Courier New" w:hAnsi="Courier New" w:cs="Courier New"/>
-          <w:sz w:val="20"/>
-          <w:szCs w:val="20"/>
-        </w:rPr>
-        <w:t xml:space="preserve"> | </w:t>
-      </w:r>
-      <w:proofErr w:type="spellStart"/>
-      <w:r>
-        <w:rPr>
-          <w:rFonts w:ascii="Courier New" w:eastAsia="Courier New" w:hAnsi="Courier New" w:cs="Courier New"/>
-          <w:sz w:val="20"/>
-          <w:szCs w:val="20"/>
-        </w:rPr>
-        <w:t>cpu</w:t>
-      </w:r>
-      <w:proofErr w:type="spellEnd"/>
-    </w:p>
-    <w:p>
-      <w:pPr>
-        <w:shd w:val="clear" w:color="auto" w:fill="F5F5F5"/>
-        <w:ind w:left="360"/>
-      </w:pPr>
-      <w:r>
-        <w:rPr>
-          <w:rFonts w:ascii="Courier New" w:eastAsia="Courier New" w:hAnsi="Courier New" w:cs="Courier New"/>
-          <w:sz w:val="20"/>
-          <w:szCs w:val="20"/>
-        </w:rPr>
-        <w:t>XTTS_MODEL_NAME=</w:t>
-      </w:r>
-      <w:proofErr w:type="spellStart"/>
-      <w:r>
-        <w:rPr>
-          <w:rFonts w:ascii="Courier New" w:eastAsia="Courier New" w:hAnsi="Courier New" w:cs="Courier New"/>
-          <w:sz w:val="20"/>
-          <w:szCs w:val="20"/>
-        </w:rPr>
-        <w:t>tts_models</w:t>
-      </w:r>
-      <w:proofErr w:type="spellEnd"/>
-      <w:r>
-        <w:rPr>
-          <w:rFonts w:ascii="Courier New" w:eastAsia="Courier New" w:hAnsi="Courier New" w:cs="Courier New"/>
-          <w:sz w:val="20"/>
-          <w:szCs w:val="20"/>
-        </w:rPr>
-        <w:t>/multilingual/multi-dataset/xtts_v2</w:t>
+        <w:t>HF_TOKEN=hf_xxx                    # HuggingFace token (optional, removes rate limits)</w:t>
+      </w:r>
+    </w:p>
+    <w:p>
+      <w:pPr>
+        <w:shd w:val="clear" w:color="auto" w:fill="F5F5F5"/>
+        <w:ind w:left="360"/>
+      </w:pPr>
+      <w:r>
+        <w:rPr>
+          <w:rFonts w:ascii="Courier New" w:eastAsia="Courier New" w:hAnsi="Courier New" w:cs="Courier New"/>
+          <w:sz w:val="20"/>
+          <w:szCs w:val="20"/>
+        </w:rPr>
+        <w:t>DEVICE=auto                        # auto | cuda | mps | cpu</w:t>
+      </w:r>
+    </w:p>
+    <w:p>
+      <w:pPr>
+        <w:shd w:val="clear" w:color="auto" w:fill="F5F5F5"/>
+        <w:ind w:left="360"/>
+      </w:pPr>
+      <w:r>
+        <w:rPr>
+          <w:rFonts w:ascii="Courier New" w:eastAsia="Courier New" w:hAnsi="Courier New" w:cs="Courier New"/>
+          <w:sz w:val="20"/>
+          <w:szCs w:val="20"/>
+        </w:rPr>
+        <w:t>XTTS_MODEL_NAME=tts_models/multilingual/multi-dataset/xtts_v2</w:t>
       </w:r>
     </w:p>
     <w:p>

</xml_diff>

<commit_message>
RTX (GPU) series installation update
</commit_message>
<xml_diff>
--- a/audio-ML/speak-like-anyone-for-social-media/docs/TTS_Agent_Solution_Design.docx
+++ b/audio-ML/speak-like-anyone-for-social-media/docs/TTS_Agent_Solution_Design.docx
@@ -6630,7 +6630,7 @@
         <w:pStyle w:val="Heading2"/>
       </w:pPr>
       <w:r>
-        <w:t>11.3 Starting the Server [Post Initial Set Up]</w:t>
+        <w:t>11.3 First-Time Setup (Windows Native — PowerShell)</w:t>
       </w:r>
     </w:p>
     <w:p>
@@ -6638,7 +6638,482 @@
         <w:spacing w:after="120"/>
       </w:pPr>
       <w:r>
-        <w:t>Once the app is installed, use these steps every time you want to start the server:</w:t>
+        <w:t>These steps apply to Windows 10/11 running PowerShell. Do not use cmd.exe or WSL for this workflow. Run the following once per machine to allow local scripts:</w:t>
+      </w:r>
+    </w:p>
+    <w:p>
+      <w:pPr>
+        <w:shd w:val="clear" w:color="auto" w:fill="F5F5F5"/>
+        <w:ind w:left="360"/>
+      </w:pPr>
+      <w:r>
+        <w:rPr>
+          <w:rFonts w:ascii="Courier New" w:eastAsia="Courier New" w:hAnsi="Courier New" w:cs="Courier New"/>
+          <w:sz w:val="20"/>
+          <w:szCs w:val="20"/>
+        </w:rPr>
+        <w:t>Set-ExecutionPolicy -ExecutionPolicy RemoteSigned -Scope CurrentUser</w:t>
+      </w:r>
+    </w:p>
+    <w:p>
+      <w:pPr>
+        <w:spacing w:after="120"/>
+      </w:pPr>
+      <w:r>
+        <w:rPr>
+          <w:b/>
+          <w:bCs/>
+        </w:rPr>
+        <w:t>RTX 4070 (and earlier NVIDIA GPUs)</w:t>
+      </w:r>
+    </w:p>
+    <w:p>
+      <w:pPr>
+        <w:spacing w:after="80"/>
+      </w:pPr>
+      <w:r>
+        <w:t>setup.bat detects RTX 4070 (sm_8x) and installs CUDA 12.1 PyTorch automatically.</w:t>
+      </w:r>
+    </w:p>
+    <w:p>
+      <w:pPr>
+        <w:shd w:val="clear" w:color="auto" w:fill="F5F5F5"/>
+        <w:ind w:left="360"/>
+      </w:pPr>
+      <w:r>
+        <w:rPr>
+          <w:rFonts w:ascii="Courier New" w:eastAsia="Courier New" w:hAnsi="Courier New" w:cs="Courier New"/>
+          <w:sz w:val="20"/>
+          <w:szCs w:val="20"/>
+        </w:rPr>
+        <w:t># Step 1 — First-time setup (run once)</w:t>
+      </w:r>
+    </w:p>
+    <w:p>
+      <w:pPr>
+        <w:shd w:val="clear" w:color="auto" w:fill="F5F5F5"/>
+        <w:ind w:left="360"/>
+      </w:pPr>
+      <w:r>
+        <w:rPr>
+          <w:rFonts w:ascii="Courier New" w:eastAsia="Courier New" w:hAnsi="Courier New" w:cs="Courier New"/>
+          <w:sz w:val="20"/>
+          <w:szCs w:val="20"/>
+        </w:rPr>
+        <w:t>scripts\setup.bat</w:t>
+      </w:r>
+    </w:p>
+    <w:p>
+      <w:pPr>
+        <w:shd w:val="clear" w:color="auto" w:fill="F5F5F5"/>
+        <w:ind w:left="360"/>
+      </w:pPr>
+      <w:r>
+        <w:rPr>
+          <w:rFonts w:ascii="Courier New" w:eastAsia="Courier New" w:hAnsi="Courier New" w:cs="Courier New"/>
+          <w:sz w:val="20"/>
+          <w:szCs w:val="20"/>
+        </w:rPr>
+        <w:t xml:space="preserve"> </w:t>
+      </w:r>
+    </w:p>
+    <w:p>
+      <w:pPr>
+        <w:shd w:val="clear" w:color="auto" w:fill="F5F5F5"/>
+        <w:ind w:left="360"/>
+      </w:pPr>
+      <w:r>
+        <w:rPr>
+          <w:rFonts w:ascii="Courier New" w:eastAsia="Courier New" w:hAnsi="Courier New" w:cs="Courier New"/>
+          <w:sz w:val="20"/>
+          <w:szCs w:val="20"/>
+        </w:rPr>
+        <w:t># Step 2 — Activate the virtual environment (PowerShell syntax)</w:t>
+      </w:r>
+    </w:p>
+    <w:p>
+      <w:pPr>
+        <w:shd w:val="clear" w:color="auto" w:fill="F5F5F5"/>
+        <w:ind w:left="360"/>
+      </w:pPr>
+      <w:r>
+        <w:rPr>
+          <w:rFonts w:ascii="Courier New" w:eastAsia="Courier New" w:hAnsi="Courier New" w:cs="Courier New"/>
+          <w:sz w:val="20"/>
+          <w:szCs w:val="20"/>
+        </w:rPr>
+        <w:t>.\venv\Scripts\Activate.ps1</w:t>
+      </w:r>
+    </w:p>
+    <w:p>
+      <w:pPr>
+        <w:shd w:val="clear" w:color="auto" w:fill="F5F5F5"/>
+        <w:ind w:left="360"/>
+      </w:pPr>
+      <w:r>
+        <w:rPr>
+          <w:rFonts w:ascii="Courier New" w:eastAsia="Courier New" w:hAnsi="Courier New" w:cs="Courier New"/>
+          <w:sz w:val="20"/>
+          <w:szCs w:val="20"/>
+        </w:rPr>
+        <w:t xml:space="preserve"> </w:t>
+      </w:r>
+    </w:p>
+    <w:p>
+      <w:pPr>
+        <w:shd w:val="clear" w:color="auto" w:fill="F5F5F5"/>
+        <w:ind w:left="360"/>
+      </w:pPr>
+      <w:r>
+        <w:rPr>
+          <w:rFonts w:ascii="Courier New" w:eastAsia="Courier New" w:hAnsi="Courier New" w:cs="Courier New"/>
+          <w:sz w:val="20"/>
+          <w:szCs w:val="20"/>
+        </w:rPr>
+        <w:t># Step 3 — Download model weights (~2.3 GB, run once)</w:t>
+      </w:r>
+    </w:p>
+    <w:p>
+      <w:pPr>
+        <w:shd w:val="clear" w:color="auto" w:fill="F5F5F5"/>
+        <w:ind w:left="360"/>
+      </w:pPr>
+      <w:r>
+        <w:rPr>
+          <w:rFonts w:ascii="Courier New" w:eastAsia="Courier New" w:hAnsi="Courier New" w:cs="Courier New"/>
+          <w:sz w:val="20"/>
+          <w:szCs w:val="20"/>
+        </w:rPr>
+        <w:t>python scripts\download_models.py</w:t>
+      </w:r>
+    </w:p>
+    <w:p>
+      <w:pPr>
+        <w:shd w:val="clear" w:color="auto" w:fill="F5F5F5"/>
+        <w:ind w:left="360"/>
+      </w:pPr>
+      <w:r>
+        <w:rPr>
+          <w:rFonts w:ascii="Courier New" w:eastAsia="Courier New" w:hAnsi="Courier New" w:cs="Courier New"/>
+          <w:sz w:val="20"/>
+          <w:szCs w:val="20"/>
+        </w:rPr>
+        <w:t xml:space="preserve"> </w:t>
+      </w:r>
+    </w:p>
+    <w:p>
+      <w:pPr>
+        <w:shd w:val="clear" w:color="auto" w:fill="F5F5F5"/>
+        <w:ind w:left="360"/>
+      </w:pPr>
+      <w:r>
+        <w:rPr>
+          <w:rFonts w:ascii="Courier New" w:eastAsia="Courier New" w:hAnsi="Courier New" w:cs="Courier New"/>
+          <w:sz w:val="20"/>
+          <w:szCs w:val="20"/>
+        </w:rPr>
+        <w:t># Step 4 — Start the server</w:t>
+      </w:r>
+    </w:p>
+    <w:p>
+      <w:pPr>
+        <w:shd w:val="clear" w:color="auto" w:fill="F5F5F5"/>
+        <w:ind w:left="360"/>
+      </w:pPr>
+      <w:r>
+        <w:rPr>
+          <w:rFonts w:ascii="Courier New" w:eastAsia="Courier New" w:hAnsi="Courier New" w:cs="Courier New"/>
+          <w:sz w:val="20"/>
+          <w:szCs w:val="20"/>
+        </w:rPr>
+        <w:t>venv\Scripts\uvicorn.exe backend.app:app --host 0.0.0.0 --port 8000 --reload</w:t>
+      </w:r>
+    </w:p>
+    <w:p>
+      <w:pPr>
+        <w:shd w:val="clear" w:color="auto" w:fill="F5F5F5"/>
+        <w:ind w:left="360"/>
+      </w:pPr>
+      <w:r>
+        <w:rPr>
+          <w:rFonts w:ascii="Courier New" w:eastAsia="Courier New" w:hAnsi="Courier New" w:cs="Courier New"/>
+          <w:sz w:val="20"/>
+          <w:szCs w:val="20"/>
+        </w:rPr>
+        <w:t># Open: http://localhost:8000</w:t>
+      </w:r>
+    </w:p>
+    <w:p>
+      <w:pPr>
+        <w:spacing w:after="120"/>
+      </w:pPr>
+      <w:r>
+        <w:rPr>
+          <w:b/>
+          <w:bCs/>
+        </w:rPr>
+        <w:t>RTX 5080 (Blackwell — sm_12x)</w:t>
+      </w:r>
+    </w:p>
+    <w:p>
+      <w:pPr>
+        <w:spacing w:after="80"/>
+      </w:pPr>
+      <w:r>
+        <w:t xml:space="preserve">The RTX 5080 uses NVIDIA’s Blackwell architecture (compute capability sm_12.0). Standard CUDA 12.1 PyTorch builds do not include Blackwell kernels and crash with “no kernel image is available for execution on the device”. CUDA 12.6+ is required. setup.bat detects this automatically — no extra steps needed.</w:t>
+      </w:r>
+    </w:p>
+    <w:p>
+      <w:pPr>
+        <w:shd w:val="clear" w:color="auto" w:fill="F5F5F5"/>
+        <w:ind w:left="360"/>
+      </w:pPr>
+      <w:r>
+        <w:rPr>
+          <w:rFonts w:ascii="Courier New" w:eastAsia="Courier New" w:hAnsi="Courier New" w:cs="Courier New"/>
+          <w:sz w:val="20"/>
+          <w:szCs w:val="20"/>
+        </w:rPr>
+        <w:t># Step 1 — First-time setup (run once)</w:t>
+      </w:r>
+    </w:p>
+    <w:p>
+      <w:pPr>
+        <w:shd w:val="clear" w:color="auto" w:fill="F5F5F5"/>
+        <w:ind w:left="360"/>
+      </w:pPr>
+      <w:r>
+        <w:rPr>
+          <w:rFonts w:ascii="Courier New" w:eastAsia="Courier New" w:hAnsi="Courier New" w:cs="Courier New"/>
+          <w:sz w:val="20"/>
+          <w:szCs w:val="20"/>
+        </w:rPr>
+        <w:t># Detects RTX 5080 (sm_12x) and installs CUDA 12.6 PyTorch automatically</w:t>
+      </w:r>
+    </w:p>
+    <w:p>
+      <w:pPr>
+        <w:shd w:val="clear" w:color="auto" w:fill="F5F5F5"/>
+        <w:ind w:left="360"/>
+      </w:pPr>
+      <w:r>
+        <w:rPr>
+          <w:rFonts w:ascii="Courier New" w:eastAsia="Courier New" w:hAnsi="Courier New" w:cs="Courier New"/>
+          <w:sz w:val="20"/>
+          <w:szCs w:val="20"/>
+        </w:rPr>
+        <w:t>scripts\setup.bat</w:t>
+      </w:r>
+    </w:p>
+    <w:p>
+      <w:pPr>
+        <w:shd w:val="clear" w:color="auto" w:fill="F5F5F5"/>
+        <w:ind w:left="360"/>
+      </w:pPr>
+      <w:r>
+        <w:rPr>
+          <w:rFonts w:ascii="Courier New" w:eastAsia="Courier New" w:hAnsi="Courier New" w:cs="Courier New"/>
+          <w:sz w:val="20"/>
+          <w:szCs w:val="20"/>
+        </w:rPr>
+        <w:t xml:space="preserve"> </w:t>
+      </w:r>
+    </w:p>
+    <w:p>
+      <w:pPr>
+        <w:shd w:val="clear" w:color="auto" w:fill="F5F5F5"/>
+        <w:ind w:left="360"/>
+      </w:pPr>
+      <w:r>
+        <w:rPr>
+          <w:rFonts w:ascii="Courier New" w:eastAsia="Courier New" w:hAnsi="Courier New" w:cs="Courier New"/>
+          <w:sz w:val="20"/>
+          <w:szCs w:val="20"/>
+        </w:rPr>
+        <w:t># Step 2 — Activate the virtual environment</w:t>
+      </w:r>
+    </w:p>
+    <w:p>
+      <w:pPr>
+        <w:shd w:val="clear" w:color="auto" w:fill="F5F5F5"/>
+        <w:ind w:left="360"/>
+      </w:pPr>
+      <w:r>
+        <w:rPr>
+          <w:rFonts w:ascii="Courier New" w:eastAsia="Courier New" w:hAnsi="Courier New" w:cs="Courier New"/>
+          <w:sz w:val="20"/>
+          <w:szCs w:val="20"/>
+        </w:rPr>
+        <w:t>.\venv\Scripts\Activate.ps1</w:t>
+      </w:r>
+    </w:p>
+    <w:p>
+      <w:pPr>
+        <w:shd w:val="clear" w:color="auto" w:fill="F5F5F5"/>
+        <w:ind w:left="360"/>
+      </w:pPr>
+      <w:r>
+        <w:rPr>
+          <w:rFonts w:ascii="Courier New" w:eastAsia="Courier New" w:hAnsi="Courier New" w:cs="Courier New"/>
+          <w:sz w:val="20"/>
+          <w:szCs w:val="20"/>
+        </w:rPr>
+        <w:t xml:space="preserve"> </w:t>
+      </w:r>
+    </w:p>
+    <w:p>
+      <w:pPr>
+        <w:shd w:val="clear" w:color="auto" w:fill="F5F5F5"/>
+        <w:ind w:left="360"/>
+      </w:pPr>
+      <w:r>
+        <w:rPr>
+          <w:rFonts w:ascii="Courier New" w:eastAsia="Courier New" w:hAnsi="Courier New" w:cs="Courier New"/>
+          <w:sz w:val="20"/>
+          <w:szCs w:val="20"/>
+        </w:rPr>
+        <w:t># Step 3 — Download model weights (~2.3 GB, run once)</w:t>
+      </w:r>
+    </w:p>
+    <w:p>
+      <w:pPr>
+        <w:shd w:val="clear" w:color="auto" w:fill="F5F5F5"/>
+        <w:ind w:left="360"/>
+      </w:pPr>
+      <w:r>
+        <w:rPr>
+          <w:rFonts w:ascii="Courier New" w:eastAsia="Courier New" w:hAnsi="Courier New" w:cs="Courier New"/>
+          <w:sz w:val="20"/>
+          <w:szCs w:val="20"/>
+        </w:rPr>
+        <w:t>python scripts\download_models.py</w:t>
+      </w:r>
+    </w:p>
+    <w:p>
+      <w:pPr>
+        <w:shd w:val="clear" w:color="auto" w:fill="F5F5F5"/>
+        <w:ind w:left="360"/>
+      </w:pPr>
+      <w:r>
+        <w:rPr>
+          <w:rFonts w:ascii="Courier New" w:eastAsia="Courier New" w:hAnsi="Courier New" w:cs="Courier New"/>
+          <w:sz w:val="20"/>
+          <w:szCs w:val="20"/>
+        </w:rPr>
+        <w:t xml:space="preserve"> </w:t>
+      </w:r>
+    </w:p>
+    <w:p>
+      <w:pPr>
+        <w:shd w:val="clear" w:color="auto" w:fill="F5F5F5"/>
+        <w:ind w:left="360"/>
+      </w:pPr>
+      <w:r>
+        <w:rPr>
+          <w:rFonts w:ascii="Courier New" w:eastAsia="Courier New" w:hAnsi="Courier New" w:cs="Courier New"/>
+          <w:sz w:val="20"/>
+          <w:szCs w:val="20"/>
+        </w:rPr>
+        <w:t># Step 4 — Start the server</w:t>
+      </w:r>
+    </w:p>
+    <w:p>
+      <w:pPr>
+        <w:shd w:val="clear" w:color="auto" w:fill="F5F5F5"/>
+        <w:ind w:left="360"/>
+      </w:pPr>
+      <w:r>
+        <w:rPr>
+          <w:rFonts w:ascii="Courier New" w:eastAsia="Courier New" w:hAnsi="Courier New" w:cs="Courier New"/>
+          <w:sz w:val="20"/>
+          <w:szCs w:val="20"/>
+        </w:rPr>
+        <w:t>venv\Scripts\uvicorn.exe backend.app:app --host 0.0.0.0 --port 8000 --reload</w:t>
+      </w:r>
+    </w:p>
+    <w:p>
+      <w:pPr>
+        <w:shd w:val="clear" w:color="auto" w:fill="F5F5F5"/>
+        <w:ind w:left="360"/>
+      </w:pPr>
+      <w:r>
+        <w:rPr>
+          <w:rFonts w:ascii="Courier New" w:eastAsia="Courier New" w:hAnsi="Courier New" w:cs="Courier New"/>
+          <w:sz w:val="20"/>
+          <w:szCs w:val="20"/>
+        </w:rPr>
+        <w:t># Open: http://localhost:8000</w:t>
+      </w:r>
+    </w:p>
+    <w:p>
+      <w:pPr>
+        <w:spacing w:after="80"/>
+      </w:pPr>
+      <w:r>
+        <w:rPr>
+          <w:b/>
+          <w:bCs/>
+        </w:rPr>
+        <w:t xml:space="preserve">Already installed with the wrong PyTorch? </w:t>
+      </w:r>
+      <w:r>
+        <w:t>If setup.bat was run before this fix, update PyTorch once:</w:t>
+      </w:r>
+    </w:p>
+    <w:p>
+      <w:pPr>
+        <w:shd w:val="clear" w:color="auto" w:fill="F5F5F5"/>
+        <w:ind w:left="360"/>
+      </w:pPr>
+      <w:r>
+        <w:rPr>
+          <w:rFonts w:ascii="Courier New" w:eastAsia="Courier New" w:hAnsi="Courier New" w:cs="Courier New"/>
+          <w:sz w:val="20"/>
+          <w:szCs w:val="20"/>
+        </w:rPr>
+        <w:t>.\venv\Scripts\Activate.ps1</w:t>
+      </w:r>
+    </w:p>
+    <w:p>
+      <w:pPr>
+        <w:shd w:val="clear" w:color="auto" w:fill="F5F5F5"/>
+        <w:ind w:left="360"/>
+      </w:pPr>
+      <w:r>
+        <w:rPr>
+          <w:rFonts w:ascii="Courier New" w:eastAsia="Courier New" w:hAnsi="Courier New" w:cs="Courier New"/>
+          <w:sz w:val="20"/>
+          <w:szCs w:val="20"/>
+        </w:rPr>
+        <w:t>pip install torch torchaudio --index-url https://download.pytorch.org/whl/cu126</w:t>
+      </w:r>
+    </w:p>
+    <w:p>
+      <w:pPr>
+        <w:pStyle w:val="Heading2"/>
+      </w:pPr>
+      <w:r>
+        <w:t>11.4 Starting the Server [Post Initial Set Up]</w:t>
+      </w:r>
+    </w:p>
+    <w:p>
+      <w:pPr>
+        <w:spacing w:after="120"/>
+      </w:pPr>
+      <w:r>
+        <w:t>Once the app is installed, use these steps every time you want to start the server.</w:t>
+      </w:r>
+    </w:p>
+    <w:p>
+      <w:pPr>
+        <w:spacing w:after="80"/>
+      </w:pPr>
+      <w:r>
+        <w:rPr>
+          <w:b/>
+          <w:bCs/>
+        </w:rPr>
+        <w:t>macOS / Linux / WSL2</w:t>
       </w:r>
     </w:p>
     <w:p>
@@ -6680,20 +7155,6 @@
           <w:sz w:val="20"/>
           <w:szCs w:val="20"/>
         </w:rPr>
-        <w:t xml:space="preserve"> </w:t>
-      </w:r>
-    </w:p>
-    <w:p>
-      <w:pPr>
-        <w:shd w:val="clear" w:color="auto" w:fill="F5F5F5"/>
-        <w:ind w:left="360"/>
-      </w:pPr>
-      <w:r>
-        <w:rPr>
-          <w:rFonts w:ascii="Courier New" w:eastAsia="Courier New" w:hAnsi="Courier New" w:cs="Courier New"/>
-          <w:sz w:val="20"/>
-          <w:szCs w:val="20"/>
-        </w:rPr>
         <w:t># Start the server</w:t>
       </w:r>
     </w:p>
@@ -6722,20 +7183,6 @@
           <w:sz w:val="20"/>
           <w:szCs w:val="20"/>
         </w:rPr>
-        <w:t xml:space="preserve"> </w:t>
-      </w:r>
-    </w:p>
-    <w:p>
-      <w:pPr>
-        <w:shd w:val="clear" w:color="auto" w:fill="F5F5F5"/>
-        <w:ind w:left="360"/>
-      </w:pPr>
-      <w:r>
-        <w:rPr>
-          <w:rFonts w:ascii="Courier New" w:eastAsia="Courier New" w:hAnsi="Courier New" w:cs="Courier New"/>
-          <w:sz w:val="20"/>
-          <w:szCs w:val="20"/>
-        </w:rPr>
         <w:t># Open: http://localhost:8000</w:t>
       </w:r>
     </w:p>
@@ -6750,20 +7197,6 @@
           <w:sz w:val="20"/>
           <w:szCs w:val="20"/>
         </w:rPr>
-        <w:t xml:space="preserve"> </w:t>
-      </w:r>
-    </w:p>
-    <w:p>
-      <w:pPr>
-        <w:shd w:val="clear" w:color="auto" w:fill="F5F5F5"/>
-        <w:ind w:left="360"/>
-      </w:pPr>
-      <w:r>
-        <w:rPr>
-          <w:rFonts w:ascii="Courier New" w:eastAsia="Courier New" w:hAnsi="Courier New" w:cs="Courier New"/>
-          <w:sz w:val="20"/>
-          <w:szCs w:val="20"/>
-        </w:rPr>
         <w:t># Stop the server</w:t>
       </w:r>
     </w:p>
@@ -6783,11 +7216,93 @@
     </w:p>
     <w:p>
       <w:pPr>
+        <w:spacing w:after="80"/>
+      </w:pPr>
+      <w:r>
+        <w:rPr>
+          <w:b/>
+          <w:bCs/>
+        </w:rPr>
+        <w:t>Windows Native (PowerShell — RTX 4070 and RTX 5080)</w:t>
+      </w:r>
+    </w:p>
+    <w:p>
+      <w:pPr>
+        <w:shd w:val="clear" w:color="auto" w:fill="F5F5F5"/>
+        <w:ind w:left="360"/>
+      </w:pPr>
+      <w:r>
+        <w:rPr>
+          <w:rFonts w:ascii="Courier New" w:eastAsia="Courier New" w:hAnsi="Courier New" w:cs="Courier New"/>
+          <w:sz w:val="20"/>
+          <w:szCs w:val="20"/>
+        </w:rPr>
+        <w:t># Activate the virtual environment (PowerShell syntax)</w:t>
+      </w:r>
+    </w:p>
+    <w:p>
+      <w:pPr>
+        <w:shd w:val="clear" w:color="auto" w:fill="F5F5F5"/>
+        <w:ind w:left="360"/>
+      </w:pPr>
+      <w:r>
+        <w:rPr>
+          <w:rFonts w:ascii="Courier New" w:eastAsia="Courier New" w:hAnsi="Courier New" w:cs="Courier New"/>
+          <w:sz w:val="20"/>
+          <w:szCs w:val="20"/>
+        </w:rPr>
+        <w:t>.\venv\Scripts\Activate.ps1</w:t>
+      </w:r>
+    </w:p>
+    <w:p>
+      <w:pPr>
+        <w:shd w:val="clear" w:color="auto" w:fill="F5F5F5"/>
+        <w:ind w:left="360"/>
+      </w:pPr>
+      <w:r>
+        <w:rPr>
+          <w:rFonts w:ascii="Courier New" w:eastAsia="Courier New" w:hAnsi="Courier New" w:cs="Courier New"/>
+          <w:sz w:val="20"/>
+          <w:szCs w:val="20"/>
+        </w:rPr>
+        <w:t># Start the server</w:t>
+      </w:r>
+    </w:p>
+    <w:p>
+      <w:pPr>
+        <w:shd w:val="clear" w:color="auto" w:fill="F5F5F5"/>
+        <w:ind w:left="360"/>
+      </w:pPr>
+      <w:r>
+        <w:rPr>
+          <w:rFonts w:ascii="Courier New" w:eastAsia="Courier New" w:hAnsi="Courier New" w:cs="Courier New"/>
+          <w:sz w:val="20"/>
+          <w:szCs w:val="20"/>
+        </w:rPr>
+        <w:t>venv\Scripts\uvicorn.exe backend.app:app --host 0.0.0.0 --port 8000 --reload</w:t>
+      </w:r>
+    </w:p>
+    <w:p>
+      <w:pPr>
+        <w:shd w:val="clear" w:color="auto" w:fill="F5F5F5"/>
+        <w:ind w:left="360"/>
+      </w:pPr>
+      <w:r>
+        <w:rPr>
+          <w:rFonts w:ascii="Courier New" w:eastAsia="Courier New" w:hAnsi="Courier New" w:cs="Courier New"/>
+          <w:sz w:val="20"/>
+          <w:szCs w:val="20"/>
+        </w:rPr>
+        <w:t># Open: http://localhost:8000    Stop: Ctrl+C in this terminal</w:t>
+      </w:r>
+    </w:p>
+    <w:p>
+      <w:pPr>
         <w:pStyle w:val="Heading2"/>
       </w:pPr>
       <w:r>
         <w:lastRenderedPageBreak/>
-        <w:t>11.4 Python Version Constraint</w:t>
+        <w:t>11.5 Python Version Constraint</w:t>
       </w:r>
     </w:p>
     <w:p>
@@ -6871,7 +7386,7 @@
         <w:pStyle w:val="Heading2"/>
       </w:pPr>
       <w:r>
-        <w:t>11.5 Docker</w:t>
+        <w:t>11.6 Docker</w:t>
       </w:r>
     </w:p>
     <w:p>
@@ -7005,7 +7520,7 @@
         <w:pStyle w:val="Heading2"/>
       </w:pPr>
       <w:r>
-        <w:t>11.6 HuggingFace Token</w:t>
+        <w:t>11.7 HuggingFace Token</w:t>
       </w:r>
     </w:p>
     <w:p>
@@ -7045,7 +7560,7 @@
         <w:pStyle w:val="Heading2"/>
       </w:pPr>
       <w:r>
-        <w:t>11.7 Troubleshooting: espeak-ng on macOS</w:t>
+        <w:t>11.8 Troubleshooting: espeak-ng on macOS</w:t>
       </w:r>
     </w:p>
     <w:p>

</xml_diff>

<commit_message>
Windows install instructions updated
</commit_message>
<xml_diff>
--- a/audio-ML/speak-like-anyone-for-social-media/docs/TTS_Agent_Solution_Design.docx
+++ b/audio-ML/speak-like-anyone-for-social-media/docs/TTS_Agent_Solution_Design.docx
@@ -1,46 +1,110 @@
 
 <file path=word/document.xml><?xml version="1.0" encoding="utf-8"?>
-<w:document xmlns:wpc="http://schemas.microsoft.com/office/word/2010/wordprocessingCanvas" xmlns:cx="http://schemas.microsoft.com/office/drawing/2014/chartex" xmlns:cx1="http://schemas.microsoft.com/office/drawing/2015/9/8/chartex" xmlns:cx2="http://schemas.microsoft.com/office/drawing/2015/10/21/chartex" xmlns:cx3="http://schemas.microsoft.com/office/drawing/2016/5/9/chartex" xmlns:cx4="http://schemas.microsoft.com/office/drawing/2016/5/10/chartex" xmlns:cx5="http://schemas.microsoft.com/office/drawing/2016/5/11/chartex" xmlns:cx6="http://schemas.microsoft.com/office/drawing/2016/5/12/chartex" xmlns:cx7="http://schemas.microsoft.com/office/drawing/2016/5/13/chartex" xmlns:cx8="http://schemas.microsoft.com/office/drawing/2016/5/14/chartex" xmlns:mc="http://schemas.openxmlformats.org/markup-compatibility/2006" xmlns:aink="http://schemas.microsoft.com/office/drawing/2016/ink" xmlns:am3d="http://schemas.microsoft.com/office/drawing/2017/model3d" xmlns:o="urn:schemas-microsoft-com:office:office" xmlns:oel="http://schemas.microsoft.com/office/2019/extlst" xmlns:r="http://schemas.openxmlformats.org/officeDocument/2006/relationships" xmlns:m="http://schemas.openxmlformats.org/officeDocument/2006/math" xmlns:v="urn:schemas-microsoft-com:vml" xmlns:wp14="http://schemas.microsoft.com/office/word/2010/wordprocessingDrawing" xmlns:wp="http://schemas.openxmlformats.org/drawingml/2006/wordprocessingDrawing" xmlns:w10="urn:schemas-microsoft-com:office:word" xmlns:w="http://schemas.openxmlformats.org/wordprocessingml/2006/main" xmlns:w14="http://schemas.microsoft.com/office/word/2010/wordml" xmlns:w15="http://schemas.microsoft.com/office/word/2012/wordml" xmlns:w16cex="http://schemas.microsoft.com/office/word/2018/wordml/cex" xmlns:w16cid="http://schemas.microsoft.com/office/word/2016/wordml/cid" xmlns:w16="http://schemas.microsoft.com/office/word/2018/wordml" xmlns:w16du="http://schemas.microsoft.com/office/word/2023/wordml/word16du" xmlns:w16sdtdh="http://schemas.microsoft.com/office/word/2020/wordml/sdtdatahash" xmlns:w16sdtfl="http://schemas.microsoft.com/office/word/2024/wordml/sdtformatlock" xmlns:w16se="http://schemas.microsoft.com/office/word/2015/wordml/symex" xmlns:wpg="http://schemas.microsoft.com/office/word/2010/wordprocessingGroup" xmlns:wpi="http://schemas.microsoft.com/office/word/2010/wordprocessingInk" xmlns:wne="http://schemas.microsoft.com/office/word/2006/wordml" xmlns:wps="http://schemas.microsoft.com/office/word/2010/wordprocessingShape" mc:Ignorable="w14 w15 w16se w16cid w16 w16cex w16sdtdh w16sdtfl w16du wp14">
+<w:document xmlns:wpc="http://schemas.microsoft.com/office/word/2010/wordprocessingCanvas" xmlns:cx="http://schemas.microsoft.com/office/drawing/2014/chartex" xmlns:cx1="http://schemas.microsoft.com/office/drawing/2015/9/8/chartex" xmlns:cx2="http://schemas.microsoft.com/office/drawing/2015/10/21/chartex" xmlns:cx3="http://schemas.microsoft.com/office/drawing/2016/5/9/chartex" xmlns:cx4="http://schemas.microsoft.com/office/drawing/2016/5/10/chartex" xmlns:cx5="http://schemas.microsoft.com/office/drawing/2016/5/11/chartex" xmlns:cx6="http://schemas.microsoft.com/office/drawing/2016/5/12/chartex" xmlns:cx7="http://schemas.microsoft.com/office/drawing/2016/5/13/chartex" xmlns:cx8="http://schemas.microsoft.com/office/drawing/2016/5/14/chartex" xmlns:mc="http://schemas.openxmlformats.org/markup-compatibility/2006" xmlns:aink="http://schemas.microsoft.com/office/drawing/2016/ink" xmlns:am3d="http://schemas.microsoft.com/office/drawing/2017/model3d" xmlns:o="urn:schemas-microsoft-com:office:office" xmlns:oel="http://schemas.microsoft.com/office/2019/extlst" xmlns:r="http://schemas.openxmlformats.org/officeDocument/2006/relationships" xmlns:m="http://schemas.openxmlformats.org/officeDocument/2006/math" xmlns:v="urn:schemas-microsoft-com:vml" xmlns:wp14="http://schemas.microsoft.com/office/word/2010/wordprocessingDrawing" xmlns:wp="http://schemas.openxmlformats.org/drawingml/2006/wordprocessingDrawing" xmlns:w10="urn:schemas-microsoft-com:office:word" xmlns:w="http://schemas.openxmlformats.org/wordprocessingml/2006/main" xmlns:w14="http://schemas.microsoft.com/office/word/2010/wordml" xmlns:w15="http://schemas.microsoft.com/office/word/2012/wordml" xmlns:w16cex="http://schemas.microsoft.com/office/word/2018/wordml/cex" xmlns:w16cid="http://schemas.microsoft.com/office/word/2016/wordml/cid" xmlns:w16="http://schemas.microsoft.com/office/word/2018/wordml" xmlns:w16sdtdh="http://schemas.microsoft.com/office/word/2020/wordml/sdtdatahash" xmlns:w16se="http://schemas.microsoft.com/office/word/2015/wordml/symex" xmlns:wpg="http://schemas.microsoft.com/office/word/2010/wordprocessingGroup" xmlns:wpi="http://schemas.microsoft.com/office/word/2010/wordprocessingInk" xmlns:wne="http://schemas.microsoft.com/office/word/2006/wordml" xmlns:wps="http://schemas.microsoft.com/office/word/2010/wordprocessingShape" mc:Ignorable="w14 w15 w16se w16cid w16 w16cex w16sdtdh wp14">
   <w:body>
     <w:p>
       <w:pPr>
         <w:spacing w:before="1440" w:after="240"/>
         <w:jc w:val="center"/>
-      </w:pPr>
-      <w:r>
         <w:rPr>
           <w:b/>
           <w:bCs/>
-          <w:sz w:val="56"/>
-          <w:szCs w:val="56"/>
-        </w:rPr>
-        <w:t>TTS Agent — Solution Design Document</w:t>
-      </w:r>
-    </w:p>
-    <w:p>
-      <w:pPr>
-        <w:spacing w:after="120"/>
-        <w:jc w:val="center"/>
-      </w:pPr>
-      <w:r>
-        <w:rPr>
-          <w:sz w:val="28"/>
-          <w:szCs w:val="28"/>
-        </w:rPr>
-        <w:t>Version 3.0.0</w:t>
-      </w:r>
-    </w:p>
-    <w:p>
-      <w:pPr>
-        <w:spacing w:after="720"/>
-        <w:jc w:val="center"/>
-      </w:pPr>
-      <w:r>
-        <w:rPr>
-          <w:sz w:val="28"/>
-          <w:szCs w:val="28"/>
-        </w:rPr>
-        <w:t>May 2026</w:t>
+          <w:color w:val="0070C0"/>
+          <w:sz w:val="48"/>
+          <w:szCs w:val="48"/>
+        </w:rPr>
+      </w:pPr>
+      <w:r>
+        <w:rPr>
+          <w:b/>
+          <w:bCs/>
+          <w:sz w:val="48"/>
+          <w:szCs w:val="48"/>
+        </w:rPr>
+        <w:t>T</w:t>
+      </w:r>
+      <w:r>
+        <w:rPr>
+          <w:b/>
+          <w:bCs/>
+          <w:sz w:val="48"/>
+          <w:szCs w:val="48"/>
+        </w:rPr>
+        <w:t xml:space="preserve">ext </w:t>
+      </w:r>
+      <w:r>
+        <w:rPr>
+          <w:b/>
+          <w:bCs/>
+          <w:sz w:val="48"/>
+          <w:szCs w:val="48"/>
+        </w:rPr>
+        <w:t>T</w:t>
+      </w:r>
+      <w:r>
+        <w:rPr>
+          <w:b/>
+          <w:bCs/>
+          <w:sz w:val="48"/>
+          <w:szCs w:val="48"/>
+        </w:rPr>
+        <w:t xml:space="preserve">o </w:t>
+      </w:r>
+      <w:r>
+        <w:rPr>
+          <w:b/>
+          <w:bCs/>
+          <w:sz w:val="48"/>
+          <w:szCs w:val="48"/>
+        </w:rPr>
+        <w:t>S</w:t>
+      </w:r>
+      <w:r>
+        <w:rPr>
+          <w:b/>
+          <w:bCs/>
+          <w:sz w:val="48"/>
+          <w:szCs w:val="48"/>
+        </w:rPr>
+        <w:t>peech</w:t>
+      </w:r>
+      <w:r>
+        <w:rPr>
+          <w:b/>
+          <w:bCs/>
+          <w:sz w:val="48"/>
+          <w:szCs w:val="48"/>
+        </w:rPr>
+        <w:t xml:space="preserve"> Agent</w:t>
+      </w:r>
+      <w:r>
+        <w:rPr>
+          <w:b/>
+          <w:bCs/>
+          <w:sz w:val="48"/>
+          <w:szCs w:val="48"/>
+        </w:rPr>
+        <w:br/>
+      </w:r>
+      <w:r>
+        <w:rPr>
+          <w:b/>
+          <w:bCs/>
+          <w:color w:val="0070C0"/>
+          <w:sz w:val="48"/>
+          <w:szCs w:val="48"/>
+        </w:rPr>
+        <w:t>Solution Design Document</w:t>
+      </w:r>
+      <w:r>
+        <w:rPr>
+          <w:b/>
+          <w:bCs/>
+          <w:color w:val="0070C0"/>
+          <w:sz w:val="48"/>
+          <w:szCs w:val="48"/>
+        </w:rPr>
+        <w:br/>
       </w:r>
     </w:p>
     <w:p>
@@ -73,12 +137,6 @@
         <w:gridCol w:w="6560"/>
       </w:tblGrid>
       <w:tr>
-        <w:tblPrEx>
-          <w:tblCellMar>
-            <w:top w:w="0" w:type="dxa"/>
-            <w:bottom w:w="0" w:type="dxa"/>
-          </w:tblCellMar>
-        </w:tblPrEx>
         <w:trPr>
           <w:tblHeader/>
         </w:trPr>
@@ -144,12 +202,6 @@
         </w:tc>
       </w:tr>
       <w:tr>
-        <w:tblPrEx>
-          <w:tblCellMar>
-            <w:top w:w="0" w:type="dxa"/>
-            <w:bottom w:w="0" w:type="dxa"/>
-          </w:tblCellMar>
-        </w:tblPrEx>
         <w:tc>
           <w:tcPr>
             <w:tcW w:w="2800" w:type="dxa"/>
@@ -206,12 +258,6 @@
         </w:tc>
       </w:tr>
       <w:tr>
-        <w:tblPrEx>
-          <w:tblCellMar>
-            <w:top w:w="0" w:type="dxa"/>
-            <w:bottom w:w="0" w:type="dxa"/>
-          </w:tblCellMar>
-        </w:tblPrEx>
         <w:tc>
           <w:tcPr>
             <w:tcW w:w="2800" w:type="dxa"/>
@@ -268,12 +314,6 @@
         </w:tc>
       </w:tr>
       <w:tr>
-        <w:tblPrEx>
-          <w:tblCellMar>
-            <w:top w:w="0" w:type="dxa"/>
-            <w:bottom w:w="0" w:type="dxa"/>
-          </w:tblCellMar>
-        </w:tblPrEx>
         <w:tc>
           <w:tcPr>
             <w:tcW w:w="2800" w:type="dxa"/>
@@ -330,12 +370,6 @@
         </w:tc>
       </w:tr>
       <w:tr>
-        <w:tblPrEx>
-          <w:tblCellMar>
-            <w:top w:w="0" w:type="dxa"/>
-            <w:bottom w:w="0" w:type="dxa"/>
-          </w:tblCellMar>
-        </w:tblPrEx>
         <w:tc>
           <w:tcPr>
             <w:tcW w:w="2800" w:type="dxa"/>
@@ -490,15 +524,15 @@
         <w:spacing w:after="120"/>
       </w:pPr>
       <w:r>
+        <w:t>A production TTS application is built around several linked stages: text normalisation, grapheme-to-phoneme conversion, acoustic modelling, vocoder/waveform generation, and post-processing.</w:t>
+      </w:r>
+    </w:p>
+    <w:p>
+      <w:pPr>
+        <w:pStyle w:val="Heading1"/>
+      </w:pPr>
+      <w:r>
         <w:lastRenderedPageBreak/>
-        <w:t>A production TTS application is built around several linked stages: text normalisation, grapheme-to-phoneme conversion, acoustic modelling, vocoder/waveform generation, and post-processing.</w:t>
-      </w:r>
-    </w:p>
-    <w:p>
-      <w:pPr>
-        <w:pStyle w:val="Heading1"/>
-      </w:pPr>
-      <w:r>
         <w:t>3. AI / ML Foundations of TTS</w:t>
       </w:r>
     </w:p>
@@ -620,12 +654,6 @@
         <w:gridCol w:w="3180"/>
       </w:tblGrid>
       <w:tr>
-        <w:tblPrEx>
-          <w:tblCellMar>
-            <w:top w:w="0" w:type="dxa"/>
-            <w:bottom w:w="0" w:type="dxa"/>
-          </w:tblCellMar>
-        </w:tblPrEx>
         <w:trPr>
           <w:tblHeader/>
         </w:trPr>
@@ -751,12 +779,6 @@
         </w:tc>
       </w:tr>
       <w:tr>
-        <w:tblPrEx>
-          <w:tblCellMar>
-            <w:top w:w="0" w:type="dxa"/>
-            <w:bottom w:w="0" w:type="dxa"/>
-          </w:tblCellMar>
-        </w:tblPrEx>
         <w:tc>
           <w:tcPr>
             <w:tcW w:w="1800" w:type="dxa"/>
@@ -867,12 +889,6 @@
         </w:tc>
       </w:tr>
       <w:tr>
-        <w:tblPrEx>
-          <w:tblCellMar>
-            <w:top w:w="0" w:type="dxa"/>
-            <w:bottom w:w="0" w:type="dxa"/>
-          </w:tblCellMar>
-        </w:tblPrEx>
         <w:tc>
           <w:tcPr>
             <w:tcW w:w="1800" w:type="dxa"/>
@@ -983,12 +999,6 @@
         </w:tc>
       </w:tr>
       <w:tr>
-        <w:tblPrEx>
-          <w:tblCellMar>
-            <w:top w:w="0" w:type="dxa"/>
-            <w:bottom w:w="0" w:type="dxa"/>
-          </w:tblCellMar>
-        </w:tblPrEx>
         <w:tc>
           <w:tcPr>
             <w:tcW w:w="1800" w:type="dxa"/>
@@ -1099,12 +1109,6 @@
         </w:tc>
       </w:tr>
       <w:tr>
-        <w:tblPrEx>
-          <w:tblCellMar>
-            <w:top w:w="0" w:type="dxa"/>
-            <w:bottom w:w="0" w:type="dxa"/>
-          </w:tblCellMar>
-        </w:tblPrEx>
         <w:tc>
           <w:tcPr>
             <w:tcW w:w="1800" w:type="dxa"/>
@@ -1215,12 +1219,6 @@
         </w:tc>
       </w:tr>
       <w:tr>
-        <w:tblPrEx>
-          <w:tblCellMar>
-            <w:top w:w="0" w:type="dxa"/>
-            <w:bottom w:w="0" w:type="dxa"/>
-          </w:tblCellMar>
-        </w:tblPrEx>
         <w:tc>
           <w:tcPr>
             <w:tcW w:w="1800" w:type="dxa"/>
@@ -1377,12 +1375,6 @@
         <w:gridCol w:w="2000"/>
       </w:tblGrid>
       <w:tr>
-        <w:tblPrEx>
-          <w:tblCellMar>
-            <w:top w:w="0" w:type="dxa"/>
-            <w:bottom w:w="0" w:type="dxa"/>
-          </w:tblCellMar>
-        </w:tblPrEx>
         <w:trPr>
           <w:tblHeader/>
         </w:trPr>
@@ -1538,12 +1530,6 @@
         </w:tc>
       </w:tr>
       <w:tr>
-        <w:tblPrEx>
-          <w:tblCellMar>
-            <w:top w:w="0" w:type="dxa"/>
-            <w:bottom w:w="0" w:type="dxa"/>
-          </w:tblCellMar>
-        </w:tblPrEx>
         <w:tc>
           <w:tcPr>
             <w:tcW w:w="1500" w:type="dxa"/>
@@ -1681,12 +1667,6 @@
         </w:tc>
       </w:tr>
       <w:tr>
-        <w:tblPrEx>
-          <w:tblCellMar>
-            <w:top w:w="0" w:type="dxa"/>
-            <w:bottom w:w="0" w:type="dxa"/>
-          </w:tblCellMar>
-        </w:tblPrEx>
         <w:tc>
           <w:tcPr>
             <w:tcW w:w="1500" w:type="dxa"/>
@@ -1833,7 +1813,13 @@
       <w:pPr>
         <w:pStyle w:val="Heading2"/>
       </w:pPr>
-      <w:r>
+    </w:p>
+    <w:p>
+      <w:pPr>
+        <w:pStyle w:val="Heading2"/>
+      </w:pPr>
+      <w:r>
+        <w:lastRenderedPageBreak/>
         <w:t>4.2 44.1 kHz Broadcast Export</w:t>
       </w:r>
     </w:p>
@@ -2443,12 +2429,6 @@
         <w:gridCol w:w="3160"/>
       </w:tblGrid>
       <w:tr>
-        <w:tblPrEx>
-          <w:tblCellMar>
-            <w:top w:w="0" w:type="dxa"/>
-            <w:bottom w:w="0" w:type="dxa"/>
-          </w:tblCellMar>
-        </w:tblPrEx>
         <w:trPr>
           <w:tblHeader/>
         </w:trPr>
@@ -2574,12 +2554,6 @@
         </w:tc>
       </w:tr>
       <w:tr>
-        <w:tblPrEx>
-          <w:tblCellMar>
-            <w:top w:w="0" w:type="dxa"/>
-            <w:bottom w:w="0" w:type="dxa"/>
-          </w:tblCellMar>
-        </w:tblPrEx>
         <w:tc>
           <w:tcPr>
             <w:tcW w:w="2000" w:type="dxa"/>
@@ -2690,12 +2664,6 @@
         </w:tc>
       </w:tr>
       <w:tr>
-        <w:tblPrEx>
-          <w:tblCellMar>
-            <w:top w:w="0" w:type="dxa"/>
-            <w:bottom w:w="0" w:type="dxa"/>
-          </w:tblCellMar>
-        </w:tblPrEx>
         <w:tc>
           <w:tcPr>
             <w:tcW w:w="2000" w:type="dxa"/>
@@ -2806,12 +2774,6 @@
         </w:tc>
       </w:tr>
       <w:tr>
-        <w:tblPrEx>
-          <w:tblCellMar>
-            <w:top w:w="0" w:type="dxa"/>
-            <w:bottom w:w="0" w:type="dxa"/>
-          </w:tblCellMar>
-        </w:tblPrEx>
         <w:tc>
           <w:tcPr>
             <w:tcW w:w="2000" w:type="dxa"/>
@@ -2922,12 +2884,6 @@
         </w:tc>
       </w:tr>
       <w:tr>
-        <w:tblPrEx>
-          <w:tblCellMar>
-            <w:top w:w="0" w:type="dxa"/>
-            <w:bottom w:w="0" w:type="dxa"/>
-          </w:tblCellMar>
-        </w:tblPrEx>
         <w:tc>
           <w:tcPr>
             <w:tcW w:w="2000" w:type="dxa"/>
@@ -3038,12 +2994,6 @@
         </w:tc>
       </w:tr>
       <w:tr>
-        <w:tblPrEx>
-          <w:tblCellMar>
-            <w:top w:w="0" w:type="dxa"/>
-            <w:bottom w:w="0" w:type="dxa"/>
-          </w:tblCellMar>
-        </w:tblPrEx>
         <w:tc>
           <w:tcPr>
             <w:tcW w:w="2000" w:type="dxa"/>
@@ -3154,12 +3104,6 @@
         </w:tc>
       </w:tr>
       <w:tr>
-        <w:tblPrEx>
-          <w:tblCellMar>
-            <w:top w:w="0" w:type="dxa"/>
-            <w:bottom w:w="0" w:type="dxa"/>
-          </w:tblCellMar>
-        </w:tblPrEx>
         <w:tc>
           <w:tcPr>
             <w:tcW w:w="2000" w:type="dxa"/>
@@ -3270,12 +3214,6 @@
         </w:tc>
       </w:tr>
       <w:tr>
-        <w:tblPrEx>
-          <w:tblCellMar>
-            <w:top w:w="0" w:type="dxa"/>
-            <w:bottom w:w="0" w:type="dxa"/>
-          </w:tblCellMar>
-        </w:tblPrEx>
         <w:tc>
           <w:tcPr>
             <w:tcW w:w="2000" w:type="dxa"/>
@@ -3386,12 +3324,6 @@
         </w:tc>
       </w:tr>
       <w:tr>
-        <w:tblPrEx>
-          <w:tblCellMar>
-            <w:top w:w="0" w:type="dxa"/>
-            <w:bottom w:w="0" w:type="dxa"/>
-          </w:tblCellMar>
-        </w:tblPrEx>
         <w:tc>
           <w:tcPr>
             <w:tcW w:w="2000" w:type="dxa"/>
@@ -4171,12 +4103,6 @@
         <w:gridCol w:w="7160"/>
       </w:tblGrid>
       <w:tr>
-        <w:tblPrEx>
-          <w:tblCellMar>
-            <w:top w:w="0" w:type="dxa"/>
-            <w:bottom w:w="0" w:type="dxa"/>
-          </w:tblCellMar>
-        </w:tblPrEx>
         <w:trPr>
           <w:tblHeader/>
         </w:trPr>
@@ -4242,12 +4168,6 @@
         </w:tc>
       </w:tr>
       <w:tr>
-        <w:tblPrEx>
-          <w:tblCellMar>
-            <w:top w:w="0" w:type="dxa"/>
-            <w:bottom w:w="0" w:type="dxa"/>
-          </w:tblCellMar>
-        </w:tblPrEx>
         <w:tc>
           <w:tcPr>
             <w:tcW w:w="2200" w:type="dxa"/>
@@ -4304,12 +4224,6 @@
         </w:tc>
       </w:tr>
       <w:tr>
-        <w:tblPrEx>
-          <w:tblCellMar>
-            <w:top w:w="0" w:type="dxa"/>
-            <w:bottom w:w="0" w:type="dxa"/>
-          </w:tblCellMar>
-        </w:tblPrEx>
         <w:tc>
           <w:tcPr>
             <w:tcW w:w="2200" w:type="dxa"/>
@@ -4366,12 +4280,6 @@
         </w:tc>
       </w:tr>
       <w:tr>
-        <w:tblPrEx>
-          <w:tblCellMar>
-            <w:top w:w="0" w:type="dxa"/>
-            <w:bottom w:w="0" w:type="dxa"/>
-          </w:tblCellMar>
-        </w:tblPrEx>
         <w:tc>
           <w:tcPr>
             <w:tcW w:w="2200" w:type="dxa"/>
@@ -4428,12 +4336,6 @@
         </w:tc>
       </w:tr>
       <w:tr>
-        <w:tblPrEx>
-          <w:tblCellMar>
-            <w:top w:w="0" w:type="dxa"/>
-            <w:bottom w:w="0" w:type="dxa"/>
-          </w:tblCellMar>
-        </w:tblPrEx>
         <w:tc>
           <w:tcPr>
             <w:tcW w:w="2200" w:type="dxa"/>
@@ -4662,12 +4564,6 @@
         <w:gridCol w:w="6060"/>
       </w:tblGrid>
       <w:tr>
-        <w:tblPrEx>
-          <w:tblCellMar>
-            <w:top w:w="0" w:type="dxa"/>
-            <w:bottom w:w="0" w:type="dxa"/>
-          </w:tblCellMar>
-        </w:tblPrEx>
         <w:trPr>
           <w:tblHeader/>
         </w:trPr>
@@ -4763,12 +4659,6 @@
         </w:tc>
       </w:tr>
       <w:tr>
-        <w:tblPrEx>
-          <w:tblCellMar>
-            <w:top w:w="0" w:type="dxa"/>
-            <w:bottom w:w="0" w:type="dxa"/>
-          </w:tblCellMar>
-        </w:tblPrEx>
         <w:tc>
           <w:tcPr>
             <w:tcW w:w="1300" w:type="dxa"/>
@@ -4852,12 +4742,6 @@
         </w:tc>
       </w:tr>
       <w:tr>
-        <w:tblPrEx>
-          <w:tblCellMar>
-            <w:top w:w="0" w:type="dxa"/>
-            <w:bottom w:w="0" w:type="dxa"/>
-          </w:tblCellMar>
-        </w:tblPrEx>
         <w:tc>
           <w:tcPr>
             <w:tcW w:w="1300" w:type="dxa"/>
@@ -4941,12 +4825,6 @@
         </w:tc>
       </w:tr>
       <w:tr>
-        <w:tblPrEx>
-          <w:tblCellMar>
-            <w:top w:w="0" w:type="dxa"/>
-            <w:bottom w:w="0" w:type="dxa"/>
-          </w:tblCellMar>
-        </w:tblPrEx>
         <w:tc>
           <w:tcPr>
             <w:tcW w:w="1300" w:type="dxa"/>
@@ -5030,12 +4908,6 @@
         </w:tc>
       </w:tr>
       <w:tr>
-        <w:tblPrEx>
-          <w:tblCellMar>
-            <w:top w:w="0" w:type="dxa"/>
-            <w:bottom w:w="0" w:type="dxa"/>
-          </w:tblCellMar>
-        </w:tblPrEx>
         <w:tc>
           <w:tcPr>
             <w:tcW w:w="1300" w:type="dxa"/>
@@ -5119,12 +4991,6 @@
         </w:tc>
       </w:tr>
       <w:tr>
-        <w:tblPrEx>
-          <w:tblCellMar>
-            <w:top w:w="0" w:type="dxa"/>
-            <w:bottom w:w="0" w:type="dxa"/>
-          </w:tblCellMar>
-        </w:tblPrEx>
         <w:tc>
           <w:tcPr>
             <w:tcW w:w="1300" w:type="dxa"/>
@@ -5208,12 +5074,6 @@
         </w:tc>
       </w:tr>
       <w:tr>
-        <w:tblPrEx>
-          <w:tblCellMar>
-            <w:top w:w="0" w:type="dxa"/>
-            <w:bottom w:w="0" w:type="dxa"/>
-          </w:tblCellMar>
-        </w:tblPrEx>
         <w:tc>
           <w:tcPr>
             <w:tcW w:w="1300" w:type="dxa"/>
@@ -5297,12 +5157,6 @@
         </w:tc>
       </w:tr>
       <w:tr>
-        <w:tblPrEx>
-          <w:tblCellMar>
-            <w:top w:w="0" w:type="dxa"/>
-            <w:bottom w:w="0" w:type="dxa"/>
-          </w:tblCellMar>
-        </w:tblPrEx>
         <w:tc>
           <w:tcPr>
             <w:tcW w:w="1300" w:type="dxa"/>
@@ -5386,12 +5240,6 @@
         </w:tc>
       </w:tr>
       <w:tr>
-        <w:tblPrEx>
-          <w:tblCellMar>
-            <w:top w:w="0" w:type="dxa"/>
-            <w:bottom w:w="0" w:type="dxa"/>
-          </w:tblCellMar>
-        </w:tblPrEx>
         <w:tc>
           <w:tcPr>
             <w:tcW w:w="1300" w:type="dxa"/>
@@ -5475,12 +5323,6 @@
         </w:tc>
       </w:tr>
       <w:tr>
-        <w:tblPrEx>
-          <w:tblCellMar>
-            <w:top w:w="0" w:type="dxa"/>
-            <w:bottom w:w="0" w:type="dxa"/>
-          </w:tblCellMar>
-        </w:tblPrEx>
         <w:tc>
           <w:tcPr>
             <w:tcW w:w="1300" w:type="dxa"/>
@@ -5811,12 +5653,6 @@
         <w:gridCol w:w="4960"/>
       </w:tblGrid>
       <w:tr>
-        <w:tblPrEx>
-          <w:tblCellMar>
-            <w:top w:w="0" w:type="dxa"/>
-            <w:bottom w:w="0" w:type="dxa"/>
-          </w:tblCellMar>
-        </w:tblPrEx>
         <w:trPr>
           <w:tblHeader/>
         </w:trPr>
@@ -5912,12 +5748,6 @@
         </w:tc>
       </w:tr>
       <w:tr>
-        <w:tblPrEx>
-          <w:tblCellMar>
-            <w:top w:w="0" w:type="dxa"/>
-            <w:bottom w:w="0" w:type="dxa"/>
-          </w:tblCellMar>
-        </w:tblPrEx>
         <w:tc>
           <w:tcPr>
             <w:tcW w:w="2800" w:type="dxa"/>
@@ -6001,12 +5831,6 @@
         </w:tc>
       </w:tr>
       <w:tr>
-        <w:tblPrEx>
-          <w:tblCellMar>
-            <w:top w:w="0" w:type="dxa"/>
-            <w:bottom w:w="0" w:type="dxa"/>
-          </w:tblCellMar>
-        </w:tblPrEx>
         <w:tc>
           <w:tcPr>
             <w:tcW w:w="2800" w:type="dxa"/>
@@ -6090,12 +5914,6 @@
         </w:tc>
       </w:tr>
       <w:tr>
-        <w:tblPrEx>
-          <w:tblCellMar>
-            <w:top w:w="0" w:type="dxa"/>
-            <w:bottom w:w="0" w:type="dxa"/>
-          </w:tblCellMar>
-        </w:tblPrEx>
         <w:tc>
           <w:tcPr>
             <w:tcW w:w="2800" w:type="dxa"/>
@@ -6179,12 +5997,6 @@
         </w:tc>
       </w:tr>
       <w:tr>
-        <w:tblPrEx>
-          <w:tblCellMar>
-            <w:top w:w="0" w:type="dxa"/>
-            <w:bottom w:w="0" w:type="dxa"/>
-          </w:tblCellMar>
-        </w:tblPrEx>
         <w:tc>
           <w:tcPr>
             <w:tcW w:w="2800" w:type="dxa"/>
@@ -6630,6 +6442,7 @@
         <w:pStyle w:val="Heading2"/>
       </w:pPr>
       <w:r>
+        <w:lastRenderedPageBreak/>
         <w:t>11.3 First-Time Setup (Windows Native — PowerShell)</w:t>
       </w:r>
     </w:p>
@@ -6638,7 +6451,15 @@
         <w:spacing w:after="120"/>
       </w:pPr>
       <w:r>
-        <w:t>These steps apply to Windows 10/11 running PowerShell. Do not use cmd.exe or WSL for this workflow. Run the following once per machine to allow local scripts:</w:t>
+        <w:t xml:space="preserve">These steps apply to Windows 10/11 running PowerShell. Do not use cmd.exe or WSL for this workflow. </w:t>
+      </w:r>
+    </w:p>
+    <w:p>
+      <w:pPr>
+        <w:spacing w:after="120"/>
+      </w:pPr>
+      <w:r>
+        <w:t>Run the following once per machine to allow local scripts:</w:t>
       </w:r>
     </w:p>
     <w:p>
@@ -6658,190 +6479,11 @@
     <w:p>
       <w:pPr>
         <w:spacing w:after="120"/>
-      </w:pPr>
-      <w:r>
         <w:rPr>
           <w:b/>
           <w:bCs/>
         </w:rPr>
-        <w:t>RTX 4070 (and earlier NVIDIA GPUs)</w:t>
-      </w:r>
-    </w:p>
-    <w:p>
-      <w:pPr>
-        <w:spacing w:after="80"/>
-      </w:pPr>
-      <w:r>
-        <w:t>setup.bat detects RTX 4070 (sm_8x) and installs CUDA 12.1 PyTorch automatically.</w:t>
-      </w:r>
-    </w:p>
-    <w:p>
-      <w:pPr>
-        <w:shd w:val="clear" w:color="auto" w:fill="F5F5F5"/>
-        <w:ind w:left="360"/>
-      </w:pPr>
-      <w:r>
-        <w:rPr>
-          <w:rFonts w:ascii="Courier New" w:eastAsia="Courier New" w:hAnsi="Courier New" w:cs="Courier New"/>
-          <w:sz w:val="20"/>
-          <w:szCs w:val="20"/>
-        </w:rPr>
-        <w:t># Step 1 — First-time setup (run once)</w:t>
-      </w:r>
-    </w:p>
-    <w:p>
-      <w:pPr>
-        <w:shd w:val="clear" w:color="auto" w:fill="F5F5F5"/>
-        <w:ind w:left="360"/>
-      </w:pPr>
-      <w:r>
-        <w:rPr>
-          <w:rFonts w:ascii="Courier New" w:eastAsia="Courier New" w:hAnsi="Courier New" w:cs="Courier New"/>
-          <w:sz w:val="20"/>
-          <w:szCs w:val="20"/>
-        </w:rPr>
-        <w:t>scripts\setup.bat</w:t>
-      </w:r>
-    </w:p>
-    <w:p>
-      <w:pPr>
-        <w:shd w:val="clear" w:color="auto" w:fill="F5F5F5"/>
-        <w:ind w:left="360"/>
-      </w:pPr>
-      <w:r>
-        <w:rPr>
-          <w:rFonts w:ascii="Courier New" w:eastAsia="Courier New" w:hAnsi="Courier New" w:cs="Courier New"/>
-          <w:sz w:val="20"/>
-          <w:szCs w:val="20"/>
-        </w:rPr>
-        <w:t xml:space="preserve"> </w:t>
-      </w:r>
-    </w:p>
-    <w:p>
-      <w:pPr>
-        <w:shd w:val="clear" w:color="auto" w:fill="F5F5F5"/>
-        <w:ind w:left="360"/>
-      </w:pPr>
-      <w:r>
-        <w:rPr>
-          <w:rFonts w:ascii="Courier New" w:eastAsia="Courier New" w:hAnsi="Courier New" w:cs="Courier New"/>
-          <w:sz w:val="20"/>
-          <w:szCs w:val="20"/>
-        </w:rPr>
-        <w:t># Step 2 — Activate the virtual environment (PowerShell syntax)</w:t>
-      </w:r>
-    </w:p>
-    <w:p>
-      <w:pPr>
-        <w:shd w:val="clear" w:color="auto" w:fill="F5F5F5"/>
-        <w:ind w:left="360"/>
-      </w:pPr>
-      <w:r>
-        <w:rPr>
-          <w:rFonts w:ascii="Courier New" w:eastAsia="Courier New" w:hAnsi="Courier New" w:cs="Courier New"/>
-          <w:sz w:val="20"/>
-          <w:szCs w:val="20"/>
-        </w:rPr>
-        <w:t>.\venv\Scripts\Activate.ps1</w:t>
-      </w:r>
-    </w:p>
-    <w:p>
-      <w:pPr>
-        <w:shd w:val="clear" w:color="auto" w:fill="F5F5F5"/>
-        <w:ind w:left="360"/>
-      </w:pPr>
-      <w:r>
-        <w:rPr>
-          <w:rFonts w:ascii="Courier New" w:eastAsia="Courier New" w:hAnsi="Courier New" w:cs="Courier New"/>
-          <w:sz w:val="20"/>
-          <w:szCs w:val="20"/>
-        </w:rPr>
-        <w:t xml:space="preserve"> </w:t>
-      </w:r>
-    </w:p>
-    <w:p>
-      <w:pPr>
-        <w:shd w:val="clear" w:color="auto" w:fill="F5F5F5"/>
-        <w:ind w:left="360"/>
-      </w:pPr>
-      <w:r>
-        <w:rPr>
-          <w:rFonts w:ascii="Courier New" w:eastAsia="Courier New" w:hAnsi="Courier New" w:cs="Courier New"/>
-          <w:sz w:val="20"/>
-          <w:szCs w:val="20"/>
-        </w:rPr>
-        <w:t># Step 3 — Download model weights (~2.3 GB, run once)</w:t>
-      </w:r>
-    </w:p>
-    <w:p>
-      <w:pPr>
-        <w:shd w:val="clear" w:color="auto" w:fill="F5F5F5"/>
-        <w:ind w:left="360"/>
-      </w:pPr>
-      <w:r>
-        <w:rPr>
-          <w:rFonts w:ascii="Courier New" w:eastAsia="Courier New" w:hAnsi="Courier New" w:cs="Courier New"/>
-          <w:sz w:val="20"/>
-          <w:szCs w:val="20"/>
-        </w:rPr>
-        <w:t>python scripts\download_models.py</w:t>
-      </w:r>
-    </w:p>
-    <w:p>
-      <w:pPr>
-        <w:shd w:val="clear" w:color="auto" w:fill="F5F5F5"/>
-        <w:ind w:left="360"/>
-      </w:pPr>
-      <w:r>
-        <w:rPr>
-          <w:rFonts w:ascii="Courier New" w:eastAsia="Courier New" w:hAnsi="Courier New" w:cs="Courier New"/>
-          <w:sz w:val="20"/>
-          <w:szCs w:val="20"/>
-        </w:rPr>
-        <w:t xml:space="preserve"> </w:t>
-      </w:r>
-    </w:p>
-    <w:p>
-      <w:pPr>
-        <w:shd w:val="clear" w:color="auto" w:fill="F5F5F5"/>
-        <w:ind w:left="360"/>
-      </w:pPr>
-      <w:r>
-        <w:rPr>
-          <w:rFonts w:ascii="Courier New" w:eastAsia="Courier New" w:hAnsi="Courier New" w:cs="Courier New"/>
-          <w:sz w:val="20"/>
-          <w:szCs w:val="20"/>
-        </w:rPr>
-        <w:t># Step 4 — Start the server</w:t>
-      </w:r>
-    </w:p>
-    <w:p>
-      <w:pPr>
-        <w:shd w:val="clear" w:color="auto" w:fill="F5F5F5"/>
-        <w:ind w:left="360"/>
-      </w:pPr>
-      <w:r>
-        <w:rPr>
-          <w:rFonts w:ascii="Courier New" w:eastAsia="Courier New" w:hAnsi="Courier New" w:cs="Courier New"/>
-          <w:sz w:val="20"/>
-          <w:szCs w:val="20"/>
-        </w:rPr>
-        <w:t>venv\Scripts\uvicorn.exe backend.app:app --host 0.0.0.0 --port 8000 --reload</w:t>
-      </w:r>
-    </w:p>
-    <w:p>
-      <w:pPr>
-        <w:shd w:val="clear" w:color="auto" w:fill="F5F5F5"/>
-        <w:ind w:left="360"/>
-      </w:pPr>
-      <w:r>
-        <w:rPr>
-          <w:rFonts w:ascii="Courier New" w:eastAsia="Courier New" w:hAnsi="Courier New" w:cs="Courier New"/>
-          <w:sz w:val="20"/>
-          <w:szCs w:val="20"/>
-        </w:rPr>
-        <w:t># Open: http://localhost:8000</w:t>
-      </w:r>
+      </w:pPr>
     </w:p>
     <w:p>
       <w:pPr>
@@ -6852,7 +6494,7 @@
           <w:b/>
           <w:bCs/>
         </w:rPr>
-        <w:t>RTX 5080 (Blackwell — sm_12x)</w:t>
+        <w:t>RTX 4070 (and earlier NVIDIA GPUs)</w:t>
       </w:r>
     </w:p>
     <w:p>
@@ -6860,7 +6502,7 @@
         <w:spacing w:after="80"/>
       </w:pPr>
       <w:r>
-        <w:t xml:space="preserve">The RTX 5080 uses NVIDIA’s Blackwell architecture (compute capability sm_12.0). Standard CUDA 12.1 PyTorch builds do not include Blackwell kernels and crash with “no kernel image is available for execution on the device”. CUDA 12.6+ is required. setup.bat detects this automatically — no extra steps needed.</w:t>
+        <w:t>setup.bat detects RTX 4070 (sm_8x) and installs CUDA 12.1 PyTorch automatically.</w:t>
       </w:r>
     </w:p>
     <w:p>
@@ -6888,20 +6530,6 @@
           <w:sz w:val="20"/>
           <w:szCs w:val="20"/>
         </w:rPr>
-        <w:t># Detects RTX 5080 (sm_12x) and installs CUDA 12.6 PyTorch automatically</w:t>
-      </w:r>
-    </w:p>
-    <w:p>
-      <w:pPr>
-        <w:shd w:val="clear" w:color="auto" w:fill="F5F5F5"/>
-        <w:ind w:left="360"/>
-      </w:pPr>
-      <w:r>
-        <w:rPr>
-          <w:rFonts w:ascii="Courier New" w:eastAsia="Courier New" w:hAnsi="Courier New" w:cs="Courier New"/>
-          <w:sz w:val="20"/>
-          <w:szCs w:val="20"/>
-        </w:rPr>
         <w:t>scripts\setup.bat</w:t>
       </w:r>
     </w:p>
@@ -6930,7 +6558,7 @@
           <w:sz w:val="20"/>
           <w:szCs w:val="20"/>
         </w:rPr>
-        <w:t># Step 2 — Activate the virtual environment</w:t>
+        <w:t># Step 2 — Activate the virtual environment (PowerShell syntax)</w:t>
       </w:r>
     </w:p>
     <w:p>
@@ -7047,129 +6675,199 @@
     </w:p>
     <w:p>
       <w:pPr>
-        <w:spacing w:after="80"/>
-      </w:pPr>
-      <w:r>
+        <w:spacing w:after="120"/>
         <w:rPr>
           <w:b/>
           <w:bCs/>
         </w:rPr>
-        <w:t xml:space="preserve">Already installed with the wrong PyTorch? </w:t>
-      </w:r>
-      <w:r>
-        <w:t>If setup.bat was run before this fix, update PyTorch once:</w:t>
-      </w:r>
-    </w:p>
-    <w:p>
-      <w:pPr>
-        <w:shd w:val="clear" w:color="auto" w:fill="F5F5F5"/>
-        <w:ind w:left="360"/>
-      </w:pPr>
-      <w:r>
-        <w:rPr>
-          <w:rFonts w:ascii="Courier New" w:eastAsia="Courier New" w:hAnsi="Courier New" w:cs="Courier New"/>
-          <w:sz w:val="20"/>
-          <w:szCs w:val="20"/>
-        </w:rPr>
-        <w:t>.\venv\Scripts\Activate.ps1</w:t>
-      </w:r>
-    </w:p>
-    <w:p>
-      <w:pPr>
-        <w:shd w:val="clear" w:color="auto" w:fill="F5F5F5"/>
-        <w:ind w:left="360"/>
-      </w:pPr>
-      <w:r>
-        <w:rPr>
-          <w:rFonts w:ascii="Courier New" w:eastAsia="Courier New" w:hAnsi="Courier New" w:cs="Courier New"/>
-          <w:sz w:val="20"/>
-          <w:szCs w:val="20"/>
-        </w:rPr>
-        <w:t>pip install torch torchaudio --index-url https://download.pytorch.org/whl/cu126</w:t>
-      </w:r>
-    </w:p>
-    <w:p>
-      <w:pPr>
-        <w:pStyle w:val="Heading2"/>
-      </w:pPr>
-      <w:r>
-        <w:t>11.4 Starting the Server [Post Initial Set Up]</w:t>
-      </w:r>
+      </w:pPr>
     </w:p>
     <w:p>
       <w:pPr>
         <w:spacing w:after="120"/>
-      </w:pPr>
-      <w:r>
-        <w:t>Once the app is installed, use these steps every time you want to start the server.</w:t>
-      </w:r>
-    </w:p>
-    <w:p>
-      <w:pPr>
-        <w:spacing w:after="80"/>
       </w:pPr>
       <w:r>
         <w:rPr>
           <w:b/>
           <w:bCs/>
         </w:rPr>
-        <w:t>macOS / Linux / WSL2</w:t>
-      </w:r>
-    </w:p>
-    <w:p>
-      <w:pPr>
-        <w:shd w:val="clear" w:color="auto" w:fill="F5F5F5"/>
-        <w:ind w:left="360"/>
-      </w:pPr>
-      <w:r>
-        <w:rPr>
-          <w:rFonts w:ascii="Courier New" w:eastAsia="Courier New" w:hAnsi="Courier New" w:cs="Courier New"/>
-          <w:sz w:val="20"/>
-          <w:szCs w:val="20"/>
-        </w:rPr>
-        <w:t># Activate the virtual environment</w:t>
-      </w:r>
-    </w:p>
-    <w:p>
-      <w:pPr>
-        <w:shd w:val="clear" w:color="auto" w:fill="F5F5F5"/>
-        <w:ind w:left="360"/>
-      </w:pPr>
-      <w:r>
-        <w:rPr>
-          <w:rFonts w:ascii="Courier New" w:eastAsia="Courier New" w:hAnsi="Courier New" w:cs="Courier New"/>
-          <w:sz w:val="20"/>
-          <w:szCs w:val="20"/>
-        </w:rPr>
-        <w:t>source venv/bin/activate</w:t>
-      </w:r>
-    </w:p>
-    <w:p>
-      <w:pPr>
-        <w:shd w:val="clear" w:color="auto" w:fill="F5F5F5"/>
-        <w:ind w:left="360"/>
-      </w:pPr>
-      <w:r>
-        <w:rPr>
-          <w:rFonts w:ascii="Courier New" w:eastAsia="Courier New" w:hAnsi="Courier New" w:cs="Courier New"/>
-          <w:sz w:val="20"/>
-          <w:szCs w:val="20"/>
-        </w:rPr>
-        <w:t># Start the server</w:t>
-      </w:r>
-    </w:p>
-    <w:p>
-      <w:pPr>
-        <w:shd w:val="clear" w:color="auto" w:fill="F5F5F5"/>
-        <w:ind w:left="360"/>
-      </w:pPr>
-      <w:r>
-        <w:rPr>
-          <w:rFonts w:ascii="Courier New" w:eastAsia="Courier New" w:hAnsi="Courier New" w:cs="Courier New"/>
-          <w:sz w:val="20"/>
-          <w:szCs w:val="20"/>
-        </w:rPr>
-        <w:t>make run</w:t>
+        <w:t>RTX 5080 (Blackwell — sm_12x)</w:t>
+      </w:r>
+    </w:p>
+    <w:p>
+      <w:pPr>
+        <w:spacing w:after="80"/>
+      </w:pPr>
+      <w:r>
+        <w:t>The RTX 5080 uses NVIDIA’s Blackwell architecture (compute capability sm_12.0). Standard CUDA 12.1 PyTorch builds do not include Blackwell kernels and crash with “no kernel image is available for execution on the device”. CUDA 12.6+ is required. setup.bat detects this automatically — no extra steps needed.</w:t>
+      </w:r>
+    </w:p>
+    <w:p>
+      <w:pPr>
+        <w:shd w:val="clear" w:color="auto" w:fill="F5F5F5"/>
+        <w:ind w:left="360"/>
+      </w:pPr>
+      <w:r>
+        <w:rPr>
+          <w:rFonts w:ascii="Courier New" w:eastAsia="Courier New" w:hAnsi="Courier New" w:cs="Courier New"/>
+          <w:sz w:val="20"/>
+          <w:szCs w:val="20"/>
+        </w:rPr>
+        <w:t># Step 1 — First-time setup (run once)</w:t>
+      </w:r>
+    </w:p>
+    <w:p>
+      <w:pPr>
+        <w:shd w:val="clear" w:color="auto" w:fill="F5F5F5"/>
+        <w:ind w:left="360"/>
+      </w:pPr>
+      <w:r>
+        <w:rPr>
+          <w:rFonts w:ascii="Courier New" w:eastAsia="Courier New" w:hAnsi="Courier New" w:cs="Courier New"/>
+          <w:sz w:val="20"/>
+          <w:szCs w:val="20"/>
+        </w:rPr>
+        <w:t># Detects RTX 5080 (sm_12x) and installs CUDA 12.6 PyTorch automatically</w:t>
+      </w:r>
+    </w:p>
+    <w:p>
+      <w:pPr>
+        <w:shd w:val="clear" w:color="auto" w:fill="F5F5F5"/>
+        <w:ind w:left="360"/>
+      </w:pPr>
+      <w:r>
+        <w:rPr>
+          <w:rFonts w:ascii="Courier New" w:eastAsia="Courier New" w:hAnsi="Courier New" w:cs="Courier New"/>
+          <w:sz w:val="20"/>
+          <w:szCs w:val="20"/>
+        </w:rPr>
+        <w:t>scripts\setup.bat</w:t>
+      </w:r>
+    </w:p>
+    <w:p>
+      <w:pPr>
+        <w:shd w:val="clear" w:color="auto" w:fill="F5F5F5"/>
+        <w:ind w:left="360"/>
+      </w:pPr>
+      <w:r>
+        <w:rPr>
+          <w:rFonts w:ascii="Courier New" w:eastAsia="Courier New" w:hAnsi="Courier New" w:cs="Courier New"/>
+          <w:sz w:val="20"/>
+          <w:szCs w:val="20"/>
+        </w:rPr>
+        <w:t xml:space="preserve"> </w:t>
+      </w:r>
+    </w:p>
+    <w:p>
+      <w:pPr>
+        <w:shd w:val="clear" w:color="auto" w:fill="F5F5F5"/>
+        <w:ind w:left="360"/>
+      </w:pPr>
+      <w:r>
+        <w:rPr>
+          <w:rFonts w:ascii="Courier New" w:eastAsia="Courier New" w:hAnsi="Courier New" w:cs="Courier New"/>
+          <w:sz w:val="20"/>
+          <w:szCs w:val="20"/>
+        </w:rPr>
+        <w:t># Step 2 — Activate the virtual environment</w:t>
+      </w:r>
+    </w:p>
+    <w:p>
+      <w:pPr>
+        <w:shd w:val="clear" w:color="auto" w:fill="F5F5F5"/>
+        <w:ind w:left="360"/>
+      </w:pPr>
+      <w:r>
+        <w:rPr>
+          <w:rFonts w:ascii="Courier New" w:eastAsia="Courier New" w:hAnsi="Courier New" w:cs="Courier New"/>
+          <w:sz w:val="20"/>
+          <w:szCs w:val="20"/>
+        </w:rPr>
+        <w:t>.\venv\Scripts\Activate.ps1</w:t>
+      </w:r>
+    </w:p>
+    <w:p>
+      <w:pPr>
+        <w:shd w:val="clear" w:color="auto" w:fill="F5F5F5"/>
+        <w:ind w:left="360"/>
+      </w:pPr>
+      <w:r>
+        <w:rPr>
+          <w:rFonts w:ascii="Courier New" w:eastAsia="Courier New" w:hAnsi="Courier New" w:cs="Courier New"/>
+          <w:sz w:val="20"/>
+          <w:szCs w:val="20"/>
+        </w:rPr>
+        <w:t xml:space="preserve"> </w:t>
+      </w:r>
+    </w:p>
+    <w:p>
+      <w:pPr>
+        <w:shd w:val="clear" w:color="auto" w:fill="F5F5F5"/>
+        <w:ind w:left="360"/>
+      </w:pPr>
+      <w:r>
+        <w:rPr>
+          <w:rFonts w:ascii="Courier New" w:eastAsia="Courier New" w:hAnsi="Courier New" w:cs="Courier New"/>
+          <w:sz w:val="20"/>
+          <w:szCs w:val="20"/>
+        </w:rPr>
+        <w:t># Step 3 — Download model weights (~2.3 GB, run once)</w:t>
+      </w:r>
+    </w:p>
+    <w:p>
+      <w:pPr>
+        <w:shd w:val="clear" w:color="auto" w:fill="F5F5F5"/>
+        <w:ind w:left="360"/>
+      </w:pPr>
+      <w:r>
+        <w:rPr>
+          <w:rFonts w:ascii="Courier New" w:eastAsia="Courier New" w:hAnsi="Courier New" w:cs="Courier New"/>
+          <w:sz w:val="20"/>
+          <w:szCs w:val="20"/>
+        </w:rPr>
+        <w:t>python scripts\download_models.py</w:t>
+      </w:r>
+    </w:p>
+    <w:p>
+      <w:pPr>
+        <w:shd w:val="clear" w:color="auto" w:fill="F5F5F5"/>
+        <w:ind w:left="360"/>
+      </w:pPr>
+      <w:r>
+        <w:rPr>
+          <w:rFonts w:ascii="Courier New" w:eastAsia="Courier New" w:hAnsi="Courier New" w:cs="Courier New"/>
+          <w:sz w:val="20"/>
+          <w:szCs w:val="20"/>
+        </w:rPr>
+        <w:t xml:space="preserve"> </w:t>
+      </w:r>
+    </w:p>
+    <w:p>
+      <w:pPr>
+        <w:shd w:val="clear" w:color="auto" w:fill="F5F5F5"/>
+        <w:ind w:left="360"/>
+      </w:pPr>
+      <w:r>
+        <w:rPr>
+          <w:rFonts w:ascii="Courier New" w:eastAsia="Courier New" w:hAnsi="Courier New" w:cs="Courier New"/>
+          <w:sz w:val="20"/>
+          <w:szCs w:val="20"/>
+        </w:rPr>
+        <w:t># Step 4 — Start the server</w:t>
+      </w:r>
+    </w:p>
+    <w:p>
+      <w:pPr>
+        <w:shd w:val="clear" w:color="auto" w:fill="F5F5F5"/>
+        <w:ind w:left="360"/>
+      </w:pPr>
+      <w:r>
+        <w:rPr>
+          <w:rFonts w:ascii="Courier New" w:eastAsia="Courier New" w:hAnsi="Courier New" w:cs="Courier New"/>
+          <w:sz w:val="20"/>
+          <w:szCs w:val="20"/>
+        </w:rPr>
+        <w:t>venv\Scripts\uvicorn.exe backend.app:app --host 0.0.0.0 --port 8000 --reload</w:t>
       </w:r>
     </w:p>
     <w:p>
@@ -7184,34 +6882,6 @@
           <w:szCs w:val="20"/>
         </w:rPr>
         <w:t># Open: http://localhost:8000</w:t>
-      </w:r>
-    </w:p>
-    <w:p>
-      <w:pPr>
-        <w:shd w:val="clear" w:color="auto" w:fill="F5F5F5"/>
-        <w:ind w:left="360"/>
-      </w:pPr>
-      <w:r>
-        <w:rPr>
-          <w:rFonts w:ascii="Courier New" w:eastAsia="Courier New" w:hAnsi="Courier New" w:cs="Courier New"/>
-          <w:sz w:val="20"/>
-          <w:szCs w:val="20"/>
-        </w:rPr>
-        <w:t># Stop the server</w:t>
-      </w:r>
-    </w:p>
-    <w:p>
-      <w:pPr>
-        <w:shd w:val="clear" w:color="auto" w:fill="F5F5F5"/>
-        <w:ind w:left="360"/>
-      </w:pPr>
-      <w:r>
-        <w:rPr>
-          <w:rFonts w:ascii="Courier New" w:eastAsia="Courier New" w:hAnsi="Courier New" w:cs="Courier New"/>
-          <w:sz w:val="20"/>
-          <w:szCs w:val="20"/>
-        </w:rPr>
-        <w:t>make stop</w:t>
       </w:r>
     </w:p>
     <w:p>
@@ -7223,6 +6893,181 @@
           <w:b/>
           <w:bCs/>
         </w:rPr>
+        <w:t xml:space="preserve">Already installed with the wrong PyTorch? </w:t>
+      </w:r>
+      <w:r>
+        <w:t>If setup.bat was run before this fix, update PyTorch once:</w:t>
+      </w:r>
+    </w:p>
+    <w:p>
+      <w:pPr>
+        <w:shd w:val="clear" w:color="auto" w:fill="F5F5F5"/>
+        <w:ind w:left="360"/>
+      </w:pPr>
+      <w:r>
+        <w:rPr>
+          <w:rFonts w:ascii="Courier New" w:eastAsia="Courier New" w:hAnsi="Courier New" w:cs="Courier New"/>
+          <w:sz w:val="20"/>
+          <w:szCs w:val="20"/>
+        </w:rPr>
+        <w:t>.\venv\Scripts\Activate.ps1</w:t>
+      </w:r>
+    </w:p>
+    <w:p>
+      <w:pPr>
+        <w:shd w:val="clear" w:color="auto" w:fill="F5F5F5"/>
+        <w:ind w:left="360"/>
+      </w:pPr>
+      <w:r>
+        <w:rPr>
+          <w:rFonts w:ascii="Courier New" w:eastAsia="Courier New" w:hAnsi="Courier New" w:cs="Courier New"/>
+          <w:sz w:val="20"/>
+          <w:szCs w:val="20"/>
+        </w:rPr>
+        <w:t>pip install torch torchaudio --index-url https://download.pytorch.org/whl/cu126</w:t>
+      </w:r>
+    </w:p>
+    <w:p>
+      <w:pPr>
+        <w:pStyle w:val="Heading2"/>
+      </w:pPr>
+    </w:p>
+    <w:p>
+      <w:pPr>
+        <w:pStyle w:val="Heading2"/>
+      </w:pPr>
+      <w:r>
+        <w:lastRenderedPageBreak/>
+        <w:t>11.4 Starting the Server [Post Initial Set Up]</w:t>
+      </w:r>
+    </w:p>
+    <w:p>
+      <w:pPr>
+        <w:spacing w:after="120"/>
+      </w:pPr>
+      <w:r>
+        <w:t>Once the app is installed, use these steps every time you want to start the server.</w:t>
+      </w:r>
+    </w:p>
+    <w:p>
+      <w:pPr>
+        <w:spacing w:after="80"/>
+      </w:pPr>
+      <w:r>
+        <w:rPr>
+          <w:b/>
+          <w:bCs/>
+        </w:rPr>
+        <w:t>macOS / Linux / WSL2</w:t>
+      </w:r>
+    </w:p>
+    <w:p>
+      <w:pPr>
+        <w:shd w:val="clear" w:color="auto" w:fill="F5F5F5"/>
+        <w:ind w:left="360"/>
+      </w:pPr>
+      <w:r>
+        <w:rPr>
+          <w:rFonts w:ascii="Courier New" w:eastAsia="Courier New" w:hAnsi="Courier New" w:cs="Courier New"/>
+          <w:sz w:val="20"/>
+          <w:szCs w:val="20"/>
+        </w:rPr>
+        <w:t># Activate the virtual environment</w:t>
+      </w:r>
+    </w:p>
+    <w:p>
+      <w:pPr>
+        <w:shd w:val="clear" w:color="auto" w:fill="F5F5F5"/>
+        <w:ind w:left="360"/>
+      </w:pPr>
+      <w:r>
+        <w:rPr>
+          <w:rFonts w:ascii="Courier New" w:eastAsia="Courier New" w:hAnsi="Courier New" w:cs="Courier New"/>
+          <w:sz w:val="20"/>
+          <w:szCs w:val="20"/>
+        </w:rPr>
+        <w:t>source venv/bin/activate</w:t>
+      </w:r>
+    </w:p>
+    <w:p>
+      <w:pPr>
+        <w:shd w:val="clear" w:color="auto" w:fill="F5F5F5"/>
+        <w:ind w:left="360"/>
+      </w:pPr>
+      <w:r>
+        <w:rPr>
+          <w:rFonts w:ascii="Courier New" w:eastAsia="Courier New" w:hAnsi="Courier New" w:cs="Courier New"/>
+          <w:sz w:val="20"/>
+          <w:szCs w:val="20"/>
+        </w:rPr>
+        <w:t># Start the server</w:t>
+      </w:r>
+    </w:p>
+    <w:p>
+      <w:pPr>
+        <w:shd w:val="clear" w:color="auto" w:fill="F5F5F5"/>
+        <w:ind w:left="360"/>
+      </w:pPr>
+      <w:r>
+        <w:rPr>
+          <w:rFonts w:ascii="Courier New" w:eastAsia="Courier New" w:hAnsi="Courier New" w:cs="Courier New"/>
+          <w:sz w:val="20"/>
+          <w:szCs w:val="20"/>
+        </w:rPr>
+        <w:t>make run</w:t>
+      </w:r>
+    </w:p>
+    <w:p>
+      <w:pPr>
+        <w:shd w:val="clear" w:color="auto" w:fill="F5F5F5"/>
+        <w:ind w:left="360"/>
+      </w:pPr>
+      <w:r>
+        <w:rPr>
+          <w:rFonts w:ascii="Courier New" w:eastAsia="Courier New" w:hAnsi="Courier New" w:cs="Courier New"/>
+          <w:sz w:val="20"/>
+          <w:szCs w:val="20"/>
+        </w:rPr>
+        <w:t># Open: http://localhost:8000</w:t>
+      </w:r>
+    </w:p>
+    <w:p>
+      <w:pPr>
+        <w:shd w:val="clear" w:color="auto" w:fill="F5F5F5"/>
+        <w:ind w:left="360"/>
+      </w:pPr>
+      <w:r>
+        <w:rPr>
+          <w:rFonts w:ascii="Courier New" w:eastAsia="Courier New" w:hAnsi="Courier New" w:cs="Courier New"/>
+          <w:sz w:val="20"/>
+          <w:szCs w:val="20"/>
+        </w:rPr>
+        <w:t># Stop the server</w:t>
+      </w:r>
+    </w:p>
+    <w:p>
+      <w:pPr>
+        <w:shd w:val="clear" w:color="auto" w:fill="F5F5F5"/>
+        <w:ind w:left="360"/>
+      </w:pPr>
+      <w:r>
+        <w:rPr>
+          <w:rFonts w:ascii="Courier New" w:eastAsia="Courier New" w:hAnsi="Courier New" w:cs="Courier New"/>
+          <w:sz w:val="20"/>
+          <w:szCs w:val="20"/>
+        </w:rPr>
+        <w:t>make stop</w:t>
+      </w:r>
+    </w:p>
+    <w:p>
+      <w:pPr>
+        <w:spacing w:after="80"/>
+      </w:pPr>
+      <w:r>
+        <w:rPr>
+          <w:b/>
+          <w:bCs/>
+        </w:rPr>
         <w:t>Windows Native (PowerShell — RTX 4070 and RTX 5080)</w:t>
       </w:r>
     </w:p>
@@ -7300,8 +7145,12 @@
       <w:pPr>
         <w:pStyle w:val="Heading2"/>
       </w:pPr>
-      <w:r>
-        <w:lastRenderedPageBreak/>
+    </w:p>
+    <w:p>
+      <w:pPr>
+        <w:pStyle w:val="Heading2"/>
+      </w:pPr>
+      <w:r>
         <w:t>11.5 Python Version Constraint</w:t>
       </w:r>
     </w:p>
@@ -7378,11 +7227,6 @@
     </w:p>
     <w:p>
       <w:pPr>
-        <w:spacing w:after="120"/>
-      </w:pPr>
-    </w:p>
-    <w:p>
-      <w:pPr>
         <w:pStyle w:val="Heading2"/>
       </w:pPr>
       <w:r>
@@ -7547,6 +7391,7 @@
           <w:sz w:val="20"/>
           <w:szCs w:val="20"/>
         </w:rPr>
+        <w:lastRenderedPageBreak/>
         <w:t>HF_TOKEN=hf_your_token_here</w:t>
       </w:r>
     </w:p>
@@ -7636,21 +7481,6 @@
       <w:r>
         <w:t xml:space="preserve"> function automatically finds this path.</w:t>
       </w:r>
-    </w:p>
-    <w:p>
-      <w:pPr>
-        <w:spacing w:after="240"/>
-      </w:pPr>
-    </w:p>
-    <w:p>
-      <w:pPr>
-        <w:spacing w:after="240"/>
-      </w:pPr>
-    </w:p>
-    <w:p>
-      <w:pPr>
-        <w:spacing w:after="240"/>
-      </w:pPr>
     </w:p>
     <w:p>
       <w:pPr>
@@ -7688,12 +7518,6 @@
         <w:gridCol w:w="5360"/>
       </w:tblGrid>
       <w:tr>
-        <w:tblPrEx>
-          <w:tblCellMar>
-            <w:top w:w="0" w:type="dxa"/>
-            <w:bottom w:w="0" w:type="dxa"/>
-          </w:tblCellMar>
-        </w:tblPrEx>
         <w:trPr>
           <w:tblHeader/>
         </w:trPr>
@@ -7789,12 +7613,6 @@
         </w:tc>
       </w:tr>
       <w:tr>
-        <w:tblPrEx>
-          <w:tblCellMar>
-            <w:top w:w="0" w:type="dxa"/>
-            <w:bottom w:w="0" w:type="dxa"/>
-          </w:tblCellMar>
-        </w:tblPrEx>
         <w:tc>
           <w:tcPr>
             <w:tcW w:w="1200" w:type="dxa"/>
@@ -7878,12 +7696,6 @@
         </w:tc>
       </w:tr>
       <w:tr>
-        <w:tblPrEx>
-          <w:tblCellMar>
-            <w:top w:w="0" w:type="dxa"/>
-            <w:bottom w:w="0" w:type="dxa"/>
-          </w:tblCellMar>
-        </w:tblPrEx>
         <w:tc>
           <w:tcPr>
             <w:tcW w:w="1200" w:type="dxa"/>
@@ -7967,12 +7779,6 @@
         </w:tc>
       </w:tr>
       <w:tr>
-        <w:tblPrEx>
-          <w:tblCellMar>
-            <w:top w:w="0" w:type="dxa"/>
-            <w:bottom w:w="0" w:type="dxa"/>
-          </w:tblCellMar>
-        </w:tblPrEx>
         <w:tc>
           <w:tcPr>
             <w:tcW w:w="1200" w:type="dxa"/>
@@ -8056,12 +7862,6 @@
         </w:tc>
       </w:tr>
       <w:tr>
-        <w:tblPrEx>
-          <w:tblCellMar>
-            <w:top w:w="0" w:type="dxa"/>
-            <w:bottom w:w="0" w:type="dxa"/>
-          </w:tblCellMar>
-        </w:tblPrEx>
         <w:tc>
           <w:tcPr>
             <w:tcW w:w="1200" w:type="dxa"/>
@@ -8145,12 +7945,6 @@
         </w:tc>
       </w:tr>
       <w:tr>
-        <w:tblPrEx>
-          <w:tblCellMar>
-            <w:top w:w="0" w:type="dxa"/>
-            <w:bottom w:w="0" w:type="dxa"/>
-          </w:tblCellMar>
-        </w:tblPrEx>
         <w:tc>
           <w:tcPr>
             <w:tcW w:w="1200" w:type="dxa"/>
@@ -8234,12 +8028,6 @@
         </w:tc>
       </w:tr>
       <w:tr>
-        <w:tblPrEx>
-          <w:tblCellMar>
-            <w:top w:w="0" w:type="dxa"/>
-            <w:bottom w:w="0" w:type="dxa"/>
-          </w:tblCellMar>
-        </w:tblPrEx>
         <w:tc>
           <w:tcPr>
             <w:tcW w:w="1200" w:type="dxa"/>
@@ -8323,12 +8111,6 @@
         </w:tc>
       </w:tr>
       <w:tr>
-        <w:tblPrEx>
-          <w:tblCellMar>
-            <w:top w:w="0" w:type="dxa"/>
-            <w:bottom w:w="0" w:type="dxa"/>
-          </w:tblCellMar>
-        </w:tblPrEx>
         <w:tc>
           <w:tcPr>
             <w:tcW w:w="1200" w:type="dxa"/>
@@ -8412,12 +8194,6 @@
         </w:tc>
       </w:tr>
       <w:tr>
-        <w:tblPrEx>
-          <w:tblCellMar>
-            <w:top w:w="0" w:type="dxa"/>
-            <w:bottom w:w="0" w:type="dxa"/>
-          </w:tblCellMar>
-        </w:tblPrEx>
         <w:tc>
           <w:tcPr>
             <w:tcW w:w="1200" w:type="dxa"/>
@@ -8501,12 +8277,6 @@
         </w:tc>
       </w:tr>
       <w:tr>
-        <w:tblPrEx>
-          <w:tblCellMar>
-            <w:top w:w="0" w:type="dxa"/>
-            <w:bottom w:w="0" w:type="dxa"/>
-          </w:tblCellMar>
-        </w:tblPrEx>
         <w:tc>
           <w:tcPr>
             <w:tcW w:w="1200" w:type="dxa"/>
@@ -8590,12 +8360,6 @@
         </w:tc>
       </w:tr>
       <w:tr>
-        <w:tblPrEx>
-          <w:tblCellMar>
-            <w:top w:w="0" w:type="dxa"/>
-            <w:bottom w:w="0" w:type="dxa"/>
-          </w:tblCellMar>
-        </w:tblPrEx>
         <w:tc>
           <w:tcPr>
             <w:tcW w:w="1200" w:type="dxa"/>
@@ -8679,12 +8443,6 @@
         </w:tc>
       </w:tr>
       <w:tr>
-        <w:tblPrEx>
-          <w:tblCellMar>
-            <w:top w:w="0" w:type="dxa"/>
-            <w:bottom w:w="0" w:type="dxa"/>
-          </w:tblCellMar>
-        </w:tblPrEx>
         <w:tc>
           <w:tcPr>
             <w:tcW w:w="1200" w:type="dxa"/>
@@ -9049,22 +8807,11 @@
     </w:p>
     <w:p>
       <w:pPr>
-        <w:spacing w:after="200"/>
-      </w:pPr>
-    </w:p>
-    <w:p>
-      <w:pPr>
         <w:pStyle w:val="Heading1"/>
       </w:pPr>
       <w:r>
-        <w:lastRenderedPageBreak/>
         <w:t>13. Testing</w:t>
       </w:r>
-    </w:p>
-    <w:p>
-      <w:pPr>
-        <w:spacing w:after="80"/>
-      </w:pPr>
     </w:p>
     <w:p>
       <w:pPr>
@@ -9279,11 +9026,6 @@
       <w:r>
         <w:t>All reference audio files are version-controlled in input_samples/ — no manual placement needed.</w:t>
       </w:r>
-    </w:p>
-    <w:p>
-      <w:pPr>
-        <w:spacing w:after="200"/>
-      </w:pPr>
     </w:p>
     <w:p>
       <w:pPr>
@@ -9316,12 +9058,6 @@
         <w:gridCol w:w="4160"/>
       </w:tblGrid>
       <w:tr>
-        <w:tblPrEx>
-          <w:tblCellMar>
-            <w:top w:w="0" w:type="dxa"/>
-            <w:bottom w:w="0" w:type="dxa"/>
-          </w:tblCellMar>
-        </w:tblPrEx>
         <w:trPr>
           <w:tblHeader/>
         </w:trPr>
@@ -9417,12 +9153,6 @@
         </w:tc>
       </w:tr>
       <w:tr>
-        <w:tblPrEx>
-          <w:tblCellMar>
-            <w:top w:w="0" w:type="dxa"/>
-            <w:bottom w:w="0" w:type="dxa"/>
-          </w:tblCellMar>
-        </w:tblPrEx>
         <w:tc>
           <w:tcPr>
             <w:tcW w:w="2600" w:type="dxa"/>
@@ -9506,12 +9236,6 @@
         </w:tc>
       </w:tr>
       <w:tr>
-        <w:tblPrEx>
-          <w:tblCellMar>
-            <w:top w:w="0" w:type="dxa"/>
-            <w:bottom w:w="0" w:type="dxa"/>
-          </w:tblCellMar>
-        </w:tblPrEx>
         <w:tc>
           <w:tcPr>
             <w:tcW w:w="2600" w:type="dxa"/>
@@ -9595,12 +9319,6 @@
         </w:tc>
       </w:tr>
       <w:tr>
-        <w:tblPrEx>
-          <w:tblCellMar>
-            <w:top w:w="0" w:type="dxa"/>
-            <w:bottom w:w="0" w:type="dxa"/>
-          </w:tblCellMar>
-        </w:tblPrEx>
         <w:tc>
           <w:tcPr>
             <w:tcW w:w="2600" w:type="dxa"/>
@@ -9684,12 +9402,6 @@
         </w:tc>
       </w:tr>
       <w:tr>
-        <w:tblPrEx>
-          <w:tblCellMar>
-            <w:top w:w="0" w:type="dxa"/>
-            <w:bottom w:w="0" w:type="dxa"/>
-          </w:tblCellMar>
-        </w:tblPrEx>
         <w:tc>
           <w:tcPr>
             <w:tcW w:w="2600" w:type="dxa"/>
@@ -9773,12 +9485,6 @@
         </w:tc>
       </w:tr>
       <w:tr>
-        <w:tblPrEx>
-          <w:tblCellMar>
-            <w:top w:w="0" w:type="dxa"/>
-            <w:bottom w:w="0" w:type="dxa"/>
-          </w:tblCellMar>
-        </w:tblPrEx>
         <w:tc>
           <w:tcPr>
             <w:tcW w:w="2600" w:type="dxa"/>
@@ -9862,12 +9568,6 @@
         </w:tc>
       </w:tr>
       <w:tr>
-        <w:tblPrEx>
-          <w:tblCellMar>
-            <w:top w:w="0" w:type="dxa"/>
-            <w:bottom w:w="0" w:type="dxa"/>
-          </w:tblCellMar>
-        </w:tblPrEx>
         <w:tc>
           <w:tcPr>
             <w:tcW w:w="2600" w:type="dxa"/>
@@ -9951,12 +9651,6 @@
         </w:tc>
       </w:tr>
       <w:tr>
-        <w:tblPrEx>
-          <w:tblCellMar>
-            <w:top w:w="0" w:type="dxa"/>
-            <w:bottom w:w="0" w:type="dxa"/>
-          </w:tblCellMar>
-        </w:tblPrEx>
         <w:tc>
           <w:tcPr>
             <w:tcW w:w="2600" w:type="dxa"/>
@@ -10070,6 +9764,509 @@
     </w:p>
     <w:p>
       <w:pPr>
+        <w:pStyle w:val="Heading1"/>
+      </w:pPr>
+      <w:r>
+        <w:t>15. Project Structure</w:t>
+      </w:r>
+    </w:p>
+    <w:p>
+      <w:pPr>
+        <w:spacing w:after="80"/>
+      </w:pPr>
+    </w:p>
+    <w:p>
+      <w:pPr>
+        <w:shd w:val="clear" w:color="auto" w:fill="F5F5F5"/>
+        <w:ind w:left="360"/>
+      </w:pPr>
+      <w:r>
+        <w:rPr>
+          <w:rFonts w:ascii="Courier New" w:eastAsia="Courier New" w:hAnsi="Courier New" w:cs="Courier New"/>
+          <w:sz w:val="20"/>
+          <w:szCs w:val="20"/>
+        </w:rPr>
+        <w:t>Custom_TTS_Model/</w:t>
+      </w:r>
+    </w:p>
+    <w:p>
+      <w:pPr>
+        <w:shd w:val="clear" w:color="auto" w:fill="F5F5F5"/>
+        <w:ind w:left="360"/>
+      </w:pPr>
+      <w:r>
+        <w:rPr>
+          <w:rFonts w:ascii="Courier New" w:eastAsia="Courier New" w:hAnsi="Courier New" w:cs="Courier New"/>
+          <w:sz w:val="20"/>
+          <w:szCs w:val="20"/>
+        </w:rPr>
+        <w:t>├── docs/</w:t>
+      </w:r>
+    </w:p>
+    <w:p>
+      <w:pPr>
+        <w:shd w:val="clear" w:color="auto" w:fill="F5F5F5"/>
+        <w:ind w:left="360"/>
+      </w:pPr>
+      <w:r>
+        <w:rPr>
+          <w:rFonts w:ascii="Courier New" w:eastAsia="Courier New" w:hAnsi="Courier New" w:cs="Courier New"/>
+          <w:sz w:val="20"/>
+          <w:szCs w:val="20"/>
+        </w:rPr>
+        <w:t>│   └── TTS_Agent_Solution_Design.docx</w:t>
+      </w:r>
+    </w:p>
+    <w:p>
+      <w:pPr>
+        <w:shd w:val="clear" w:color="auto" w:fill="F5F5F5"/>
+        <w:ind w:left="360"/>
+      </w:pPr>
+      <w:r>
+        <w:rPr>
+          <w:rFonts w:ascii="Courier New" w:eastAsia="Courier New" w:hAnsi="Courier New" w:cs="Courier New"/>
+          <w:sz w:val="20"/>
+          <w:szCs w:val="20"/>
+        </w:rPr>
+        <w:t>└── tts-agent/</w:t>
+      </w:r>
+    </w:p>
+    <w:p>
+      <w:pPr>
+        <w:shd w:val="clear" w:color="auto" w:fill="F5F5F5"/>
+        <w:ind w:left="360"/>
+      </w:pPr>
+      <w:r>
+        <w:rPr>
+          <w:rFonts w:ascii="Courier New" w:eastAsia="Courier New" w:hAnsi="Courier New" w:cs="Courier New"/>
+          <w:sz w:val="20"/>
+          <w:szCs w:val="20"/>
+        </w:rPr>
+        <w:t xml:space="preserve">    ├── backend/</w:t>
+      </w:r>
+    </w:p>
+    <w:p>
+      <w:pPr>
+        <w:shd w:val="clear" w:color="auto" w:fill="F5F5F5"/>
+        <w:ind w:left="360"/>
+      </w:pPr>
+      <w:r>
+        <w:rPr>
+          <w:rFonts w:ascii="Courier New" w:eastAsia="Courier New" w:hAnsi="Courier New" w:cs="Courier New"/>
+          <w:sz w:val="20"/>
+          <w:szCs w:val="20"/>
+        </w:rPr>
+        <w:t xml:space="preserve">    │   ├── app.py                   # FastAPI factory (v3.0.0)</w:t>
+      </w:r>
+    </w:p>
+    <w:p>
+      <w:pPr>
+        <w:shd w:val="clear" w:color="auto" w:fill="F5F5F5"/>
+        <w:ind w:left="360"/>
+      </w:pPr>
+      <w:r>
+        <w:rPr>
+          <w:rFonts w:ascii="Courier New" w:eastAsia="Courier New" w:hAnsi="Courier New" w:cs="Courier New"/>
+          <w:sz w:val="20"/>
+          <w:szCs w:val="20"/>
+        </w:rPr>
+        <w:t xml:space="preserve">    │   ├── api/</w:t>
+      </w:r>
+    </w:p>
+    <w:p>
+      <w:pPr>
+        <w:shd w:val="clear" w:color="auto" w:fill="F5F5F5"/>
+        <w:ind w:left="360"/>
+      </w:pPr>
+      <w:r>
+        <w:rPr>
+          <w:rFonts w:ascii="Courier New" w:eastAsia="Courier New" w:hAnsi="Courier New" w:cs="Courier New"/>
+          <w:sz w:val="20"/>
+          <w:szCs w:val="20"/>
+        </w:rPr>
+        <w:t xml:space="preserve">    │   │   ├── routes.py            # All route handlers</w:t>
+      </w:r>
+    </w:p>
+    <w:p>
+      <w:pPr>
+        <w:shd w:val="clear" w:color="auto" w:fill="F5F5F5"/>
+        <w:ind w:left="360"/>
+      </w:pPr>
+      <w:r>
+        <w:rPr>
+          <w:rFonts w:ascii="Courier New" w:eastAsia="Courier New" w:hAnsi="Courier New" w:cs="Courier New"/>
+          <w:sz w:val="20"/>
+          <w:szCs w:val="20"/>
+        </w:rPr>
+        <w:t xml:space="preserve">    │   │   └── schemas.py           # Pydantic request/response models</w:t>
+      </w:r>
+    </w:p>
+    <w:p>
+      <w:pPr>
+        <w:shd w:val="clear" w:color="auto" w:fill="F5F5F5"/>
+        <w:ind w:left="360"/>
+      </w:pPr>
+      <w:r>
+        <w:rPr>
+          <w:rFonts w:ascii="Courier New" w:eastAsia="Courier New" w:hAnsi="Courier New" w:cs="Courier New"/>
+          <w:sz w:val="20"/>
+          <w:szCs w:val="20"/>
+        </w:rPr>
+        <w:t xml:space="preserve">    │   ├── engines/</w:t>
+      </w:r>
+    </w:p>
+    <w:p>
+      <w:pPr>
+        <w:shd w:val="clear" w:color="auto" w:fill="F5F5F5"/>
+        <w:ind w:left="360"/>
+      </w:pPr>
+      <w:r>
+        <w:rPr>
+          <w:rFonts w:ascii="Courier New" w:eastAsia="Courier New" w:hAnsi="Courier New" w:cs="Courier New"/>
+          <w:sz w:val="20"/>
+          <w:szCs w:val="20"/>
+        </w:rPr>
+        <w:t xml:space="preserve">    │   │   ├── base.py              # Abstract TTSEngine contract</w:t>
+      </w:r>
+    </w:p>
+    <w:p>
+      <w:pPr>
+        <w:shd w:val="clear" w:color="auto" w:fill="F5F5F5"/>
+        <w:ind w:left="360"/>
+      </w:pPr>
+      <w:r>
+        <w:rPr>
+          <w:rFonts w:ascii="Courier New" w:eastAsia="Courier New" w:hAnsi="Courier New" w:cs="Courier New"/>
+          <w:sz w:val="20"/>
+          <w:szCs w:val="20"/>
+        </w:rPr>
+        <w:t xml:space="preserve">    │   │   ├── kokoro_engine.py     # Kokoro-82M wrapper (54 voices, 9 languages)</w:t>
+      </w:r>
+    </w:p>
+    <w:p>
+      <w:pPr>
+        <w:shd w:val="clear" w:color="auto" w:fill="F5F5F5"/>
+        <w:ind w:left="360"/>
+      </w:pPr>
+      <w:r>
+        <w:rPr>
+          <w:rFonts w:ascii="Courier New" w:eastAsia="Courier New" w:hAnsi="Courier New" w:cs="Courier New"/>
+          <w:sz w:val="20"/>
+          <w:szCs w:val="20"/>
+        </w:rPr>
+        <w:t xml:space="preserve">    │   │   └── xtts_engine.py       # XTTS v2 zero-shot cloning wrapper (17 languages)</w:t>
+      </w:r>
+    </w:p>
+    <w:p>
+      <w:pPr>
+        <w:shd w:val="clear" w:color="auto" w:fill="F5F5F5"/>
+        <w:ind w:left="360"/>
+      </w:pPr>
+      <w:r>
+        <w:rPr>
+          <w:rFonts w:ascii="Courier New" w:eastAsia="Courier New" w:hAnsi="Courier New" w:cs="Courier New"/>
+          <w:sz w:val="20"/>
+          <w:szCs w:val="20"/>
+        </w:rPr>
+        <w:t xml:space="preserve">    │   └── utils/</w:t>
+      </w:r>
+    </w:p>
+    <w:p>
+      <w:pPr>
+        <w:shd w:val="clear" w:color="auto" w:fill="F5F5F5"/>
+        <w:ind w:left="360"/>
+      </w:pPr>
+      <w:r>
+        <w:rPr>
+          <w:rFonts w:ascii="Courier New" w:eastAsia="Courier New" w:hAnsi="Courier New" w:cs="Courier New"/>
+          <w:sz w:val="20"/>
+          <w:szCs w:val="20"/>
+        </w:rPr>
+        <w:t xml:space="preserve">    │       ├── audio.py             # Resample, normalise, trim</w:t>
+      </w:r>
+    </w:p>
+    <w:p>
+      <w:pPr>
+        <w:shd w:val="clear" w:color="auto" w:fill="F5F5F5"/>
+        <w:ind w:left="360"/>
+      </w:pPr>
+      <w:r>
+        <w:rPr>
+          <w:rFonts w:ascii="Courier New" w:eastAsia="Courier New" w:hAnsi="Courier New" w:cs="Courier New"/>
+          <w:sz w:val="20"/>
+          <w:szCs w:val="20"/>
+        </w:rPr>
+        <w:t xml:space="preserve">    │       ├── broadcast.py         # EBU R128, noise reduction, EQ, 44.1 kHz</w:t>
+      </w:r>
+    </w:p>
+    <w:p>
+      <w:pPr>
+        <w:shd w:val="clear" w:color="auto" w:fill="F5F5F5"/>
+        <w:ind w:left="360"/>
+      </w:pPr>
+      <w:r>
+        <w:rPr>
+          <w:rFonts w:ascii="Courier New" w:eastAsia="Courier New" w:hAnsi="Courier New" w:cs="Courier New"/>
+          <w:sz w:val="20"/>
+          <w:szCs w:val="20"/>
+        </w:rPr>
+        <w:t xml:space="preserve">    │       ├── ssml.py              # SSML parser</w:t>
+      </w:r>
+    </w:p>
+    <w:p>
+      <w:pPr>
+        <w:shd w:val="clear" w:color="auto" w:fill="F5F5F5"/>
+        <w:ind w:left="360"/>
+      </w:pPr>
+      <w:r>
+        <w:rPr>
+          <w:rFonts w:ascii="Courier New" w:eastAsia="Courier New" w:hAnsi="Courier New" w:cs="Courier New"/>
+          <w:sz w:val="20"/>
+          <w:szCs w:val="20"/>
+        </w:rPr>
+        <w:t xml:space="preserve">    │       ├── batch.py             # Async batch synthesis</w:t>
+      </w:r>
+    </w:p>
+    <w:p>
+      <w:pPr>
+        <w:shd w:val="clear" w:color="auto" w:fill="F5F5F5"/>
+        <w:ind w:left="360"/>
+      </w:pPr>
+      <w:r>
+        <w:rPr>
+          <w:rFonts w:ascii="Courier New" w:eastAsia="Courier New" w:hAnsi="Courier New" w:cs="Courier New"/>
+          <w:sz w:val="20"/>
+          <w:szCs w:val="20"/>
+        </w:rPr>
+        <w:t xml:space="preserve">    │       ├── device.py            # CUDA / MPS / CPU detection</w:t>
+      </w:r>
+    </w:p>
+    <w:p>
+      <w:pPr>
+        <w:shd w:val="clear" w:color="auto" w:fill="F5F5F5"/>
+        <w:ind w:left="360"/>
+      </w:pPr>
+      <w:r>
+        <w:rPr>
+          <w:rFonts w:ascii="Courier New" w:eastAsia="Courier New" w:hAnsi="Courier New" w:cs="Courier New"/>
+          <w:sz w:val="20"/>
+          <w:szCs w:val="20"/>
+        </w:rPr>
+        <w:t xml:space="preserve">    │       └── logger.py</w:t>
+      </w:r>
+    </w:p>
+    <w:p>
+      <w:pPr>
+        <w:shd w:val="clear" w:color="auto" w:fill="F5F5F5"/>
+        <w:ind w:left="360"/>
+      </w:pPr>
+      <w:r>
+        <w:rPr>
+          <w:rFonts w:ascii="Courier New" w:eastAsia="Courier New" w:hAnsi="Courier New" w:cs="Courier New"/>
+          <w:sz w:val="20"/>
+          <w:szCs w:val="20"/>
+        </w:rPr>
+        <w:t xml:space="preserve">    ├── frontend/</w:t>
+      </w:r>
+    </w:p>
+    <w:p>
+      <w:pPr>
+        <w:shd w:val="clear" w:color="auto" w:fill="F5F5F5"/>
+        <w:ind w:left="360"/>
+      </w:pPr>
+      <w:r>
+        <w:rPr>
+          <w:rFonts w:ascii="Courier New" w:eastAsia="Courier New" w:hAnsi="Courier New" w:cs="Courier New"/>
+          <w:sz w:val="20"/>
+          <w:szCs w:val="20"/>
+        </w:rPr>
+        <w:t xml:space="preserve">    │   ├── templates/index.html     # 3-tab browser UI</w:t>
+      </w:r>
+    </w:p>
+    <w:p>
+      <w:pPr>
+        <w:shd w:val="clear" w:color="auto" w:fill="F5F5F5"/>
+        <w:ind w:left="360"/>
+      </w:pPr>
+      <w:r>
+        <w:rPr>
+          <w:rFonts w:ascii="Courier New" w:eastAsia="Courier New" w:hAnsi="Courier New" w:cs="Courier New"/>
+          <w:sz w:val="20"/>
+          <w:szCs w:val="20"/>
+        </w:rPr>
+        <w:t xml:space="preserve">    │   └── static/{css,js}/</w:t>
+      </w:r>
+    </w:p>
+    <w:p>
+      <w:pPr>
+        <w:shd w:val="clear" w:color="auto" w:fill="F5F5F5"/>
+        <w:ind w:left="360"/>
+      </w:pPr>
+      <w:r>
+        <w:rPr>
+          <w:rFonts w:ascii="Courier New" w:eastAsia="Courier New" w:hAnsi="Courier New" w:cs="Courier New"/>
+          <w:sz w:val="20"/>
+          <w:szCs w:val="20"/>
+        </w:rPr>
+        <w:t xml:space="preserve">    ├── configs/settings.py          # Pydantic settings from .env</w:t>
+      </w:r>
+    </w:p>
+    <w:p>
+      <w:pPr>
+        <w:shd w:val="clear" w:color="auto" w:fill="F5F5F5"/>
+        <w:ind w:left="360"/>
+      </w:pPr>
+      <w:r>
+        <w:rPr>
+          <w:rFonts w:ascii="Courier New" w:eastAsia="Courier New" w:hAnsi="Courier New" w:cs="Courier New"/>
+          <w:sz w:val="20"/>
+          <w:szCs w:val="20"/>
+        </w:rPr>
+        <w:t xml:space="preserve">    ├── input_samples/               # Pre-packaged test reference clips (version-controlled)</w:t>
+      </w:r>
+    </w:p>
+    <w:p>
+      <w:pPr>
+        <w:shd w:val="clear" w:color="auto" w:fill="F5F5F5"/>
+        <w:ind w:left="360"/>
+      </w:pPr>
+      <w:r>
+        <w:rPr>
+          <w:rFonts w:ascii="Courier New" w:eastAsia="Courier New" w:hAnsi="Courier New" w:cs="Courier New"/>
+          <w:sz w:val="20"/>
+          <w:szCs w:val="20"/>
+        </w:rPr>
+        <w:t xml:space="preserve">    │   └── README.md</w:t>
+      </w:r>
+    </w:p>
+    <w:p>
+      <w:pPr>
+        <w:shd w:val="clear" w:color="auto" w:fill="F5F5F5"/>
+        <w:ind w:left="360"/>
+      </w:pPr>
+      <w:r>
+        <w:rPr>
+          <w:rFonts w:ascii="Courier New" w:eastAsia="Courier New" w:hAnsi="Courier New" w:cs="Courier New"/>
+          <w:sz w:val="20"/>
+          <w:szCs w:val="20"/>
+        </w:rPr>
+        <w:t xml:space="preserve">    ├── tests/</w:t>
+      </w:r>
+    </w:p>
+    <w:p>
+      <w:pPr>
+        <w:shd w:val="clear" w:color="auto" w:fill="F5F5F5"/>
+        <w:ind w:left="360"/>
+      </w:pPr>
+      <w:r>
+        <w:rPr>
+          <w:rFonts w:ascii="Courier New" w:eastAsia="Courier New" w:hAnsi="Courier New" w:cs="Courier New"/>
+          <w:sz w:val="20"/>
+          <w:szCs w:val="20"/>
+        </w:rPr>
+        <w:t xml:space="preserve">    ├── docker/</w:t>
+      </w:r>
+    </w:p>
+    <w:p>
+      <w:pPr>
+        <w:shd w:val="clear" w:color="auto" w:fill="F5F5F5"/>
+        <w:ind w:left="360"/>
+      </w:pPr>
+      <w:r>
+        <w:rPr>
+          <w:rFonts w:ascii="Courier New" w:eastAsia="Courier New" w:hAnsi="Courier New" w:cs="Courier New"/>
+          <w:sz w:val="20"/>
+          <w:szCs w:val="20"/>
+        </w:rPr>
+        <w:t xml:space="preserve">    ├── scripts/</w:t>
+      </w:r>
+    </w:p>
+    <w:p>
+      <w:pPr>
+        <w:shd w:val="clear" w:color="auto" w:fill="F5F5F5"/>
+        <w:ind w:left="360"/>
+      </w:pPr>
+      <w:r>
+        <w:rPr>
+          <w:rFonts w:ascii="Courier New" w:eastAsia="Courier New" w:hAnsi="Courier New" w:cs="Courier New"/>
+          <w:sz w:val="20"/>
+          <w:szCs w:val="20"/>
+        </w:rPr>
+        <w:t xml:space="preserve">    │   ├── setup.sh                 # One-command setup (macOS / Linux / WSL2)</w:t>
+      </w:r>
+    </w:p>
+    <w:p>
+      <w:pPr>
+        <w:shd w:val="clear" w:color="auto" w:fill="F5F5F5"/>
+        <w:ind w:left="360"/>
+      </w:pPr>
+      <w:r>
+        <w:rPr>
+          <w:rFonts w:ascii="Courier New" w:eastAsia="Courier New" w:hAnsi="Courier New" w:cs="Courier New"/>
+          <w:sz w:val="20"/>
+          <w:szCs w:val="20"/>
+        </w:rPr>
+        <w:t xml:space="preserve">    │   ├── setup.bat                # One-command setup (Windows native)</w:t>
+      </w:r>
+    </w:p>
+    <w:p>
+      <w:pPr>
+        <w:shd w:val="clear" w:color="auto" w:fill="F5F5F5"/>
+        <w:ind w:left="360"/>
+      </w:pPr>
+      <w:r>
+        <w:rPr>
+          <w:rFonts w:ascii="Courier New" w:eastAsia="Courier New" w:hAnsi="Courier New" w:cs="Courier New"/>
+          <w:sz w:val="20"/>
+          <w:szCs w:val="20"/>
+        </w:rPr>
+        <w:t xml:space="preserve">    │   └── download_models.py       # Pre-download model weights</w:t>
+      </w:r>
+    </w:p>
+    <w:p>
+      <w:pPr>
+        <w:shd w:val="clear" w:color="auto" w:fill="F5F5F5"/>
+        <w:ind w:left="360"/>
+      </w:pPr>
+      <w:r>
+        <w:rPr>
+          <w:rFonts w:ascii="Courier New" w:eastAsia="Courier New" w:hAnsi="Courier New" w:cs="Courier New"/>
+          <w:sz w:val="20"/>
+          <w:szCs w:val="20"/>
+        </w:rPr>
+        <w:t xml:space="preserve">    ├── Makefile</w:t>
+      </w:r>
+    </w:p>
+    <w:p>
+      <w:pPr>
+        <w:shd w:val="clear" w:color="auto" w:fill="F5F5F5"/>
+        <w:ind w:left="360"/>
+      </w:pPr>
+      <w:r>
+        <w:rPr>
+          <w:rFonts w:ascii="Courier New" w:eastAsia="Courier New" w:hAnsi="Courier New" w:cs="Courier New"/>
+          <w:sz w:val="20"/>
+          <w:szCs w:val="20"/>
+        </w:rPr>
+        <w:t xml:space="preserve">    ├── requirements.txt</w:t>
+      </w:r>
+    </w:p>
+    <w:p>
+      <w:pPr>
+        <w:shd w:val="clear" w:color="auto" w:fill="F5F5F5"/>
+        <w:ind w:left="360"/>
+      </w:pPr>
+      <w:r>
+        <w:rPr>
+          <w:rFonts w:ascii="Courier New" w:eastAsia="Courier New" w:hAnsi="Courier New" w:cs="Courier New"/>
+          <w:sz w:val="20"/>
+          <w:szCs w:val="20"/>
+        </w:rPr>
+        <w:t xml:space="preserve">    └── .env.example</w:t>
+      </w:r>
+    </w:p>
+    <w:p>
+      <w:pPr>
         <w:spacing w:after="200"/>
       </w:pPr>
     </w:p>
@@ -10077,510 +10274,6 @@
       <w:pPr>
         <w:pStyle w:val="Heading1"/>
       </w:pPr>
-      <w:r>
-        <w:lastRenderedPageBreak/>
-        <w:t>15. Project Structure</w:t>
-      </w:r>
-    </w:p>
-    <w:p>
-      <w:pPr>
-        <w:spacing w:after="80"/>
-      </w:pPr>
-    </w:p>
-    <w:p>
-      <w:pPr>
-        <w:shd w:val="clear" w:color="auto" w:fill="F5F5F5"/>
-        <w:ind w:left="360"/>
-      </w:pPr>
-      <w:r>
-        <w:rPr>
-          <w:rFonts w:ascii="Courier New" w:eastAsia="Courier New" w:hAnsi="Courier New" w:cs="Courier New"/>
-          <w:sz w:val="20"/>
-          <w:szCs w:val="20"/>
-        </w:rPr>
-        <w:t>Custom_TTS_Model/</w:t>
-      </w:r>
-    </w:p>
-    <w:p>
-      <w:pPr>
-        <w:shd w:val="clear" w:color="auto" w:fill="F5F5F5"/>
-        <w:ind w:left="360"/>
-      </w:pPr>
-      <w:r>
-        <w:rPr>
-          <w:rFonts w:ascii="Courier New" w:eastAsia="Courier New" w:hAnsi="Courier New" w:cs="Courier New"/>
-          <w:sz w:val="20"/>
-          <w:szCs w:val="20"/>
-        </w:rPr>
-        <w:t>├── docs/</w:t>
-      </w:r>
-    </w:p>
-    <w:p>
-      <w:pPr>
-        <w:shd w:val="clear" w:color="auto" w:fill="F5F5F5"/>
-        <w:ind w:left="360"/>
-      </w:pPr>
-      <w:r>
-        <w:rPr>
-          <w:rFonts w:ascii="Courier New" w:eastAsia="Courier New" w:hAnsi="Courier New" w:cs="Courier New"/>
-          <w:sz w:val="20"/>
-          <w:szCs w:val="20"/>
-        </w:rPr>
-        <w:t>│   └── TTS_Agent_Solution_Design.docx</w:t>
-      </w:r>
-    </w:p>
-    <w:p>
-      <w:pPr>
-        <w:shd w:val="clear" w:color="auto" w:fill="F5F5F5"/>
-        <w:ind w:left="360"/>
-      </w:pPr>
-      <w:r>
-        <w:rPr>
-          <w:rFonts w:ascii="Courier New" w:eastAsia="Courier New" w:hAnsi="Courier New" w:cs="Courier New"/>
-          <w:sz w:val="20"/>
-          <w:szCs w:val="20"/>
-        </w:rPr>
-        <w:t>└── tts-agent/</w:t>
-      </w:r>
-    </w:p>
-    <w:p>
-      <w:pPr>
-        <w:shd w:val="clear" w:color="auto" w:fill="F5F5F5"/>
-        <w:ind w:left="360"/>
-      </w:pPr>
-      <w:r>
-        <w:rPr>
-          <w:rFonts w:ascii="Courier New" w:eastAsia="Courier New" w:hAnsi="Courier New" w:cs="Courier New"/>
-          <w:sz w:val="20"/>
-          <w:szCs w:val="20"/>
-        </w:rPr>
-        <w:t xml:space="preserve">    ├── backend/</w:t>
-      </w:r>
-    </w:p>
-    <w:p>
-      <w:pPr>
-        <w:shd w:val="clear" w:color="auto" w:fill="F5F5F5"/>
-        <w:ind w:left="360"/>
-      </w:pPr>
-      <w:r>
-        <w:rPr>
-          <w:rFonts w:ascii="Courier New" w:eastAsia="Courier New" w:hAnsi="Courier New" w:cs="Courier New"/>
-          <w:sz w:val="20"/>
-          <w:szCs w:val="20"/>
-        </w:rPr>
-        <w:t xml:space="preserve">    │   ├── app.py                   # FastAPI factory (v3.0.0)</w:t>
-      </w:r>
-    </w:p>
-    <w:p>
-      <w:pPr>
-        <w:shd w:val="clear" w:color="auto" w:fill="F5F5F5"/>
-        <w:ind w:left="360"/>
-      </w:pPr>
-      <w:r>
-        <w:rPr>
-          <w:rFonts w:ascii="Courier New" w:eastAsia="Courier New" w:hAnsi="Courier New" w:cs="Courier New"/>
-          <w:sz w:val="20"/>
-          <w:szCs w:val="20"/>
-        </w:rPr>
-        <w:t xml:space="preserve">    │   ├── api/</w:t>
-      </w:r>
-    </w:p>
-    <w:p>
-      <w:pPr>
-        <w:shd w:val="clear" w:color="auto" w:fill="F5F5F5"/>
-        <w:ind w:left="360"/>
-      </w:pPr>
-      <w:r>
-        <w:rPr>
-          <w:rFonts w:ascii="Courier New" w:eastAsia="Courier New" w:hAnsi="Courier New" w:cs="Courier New"/>
-          <w:sz w:val="20"/>
-          <w:szCs w:val="20"/>
-        </w:rPr>
-        <w:t xml:space="preserve">    │   │   ├── routes.py            # All route handlers</w:t>
-      </w:r>
-    </w:p>
-    <w:p>
-      <w:pPr>
-        <w:shd w:val="clear" w:color="auto" w:fill="F5F5F5"/>
-        <w:ind w:left="360"/>
-      </w:pPr>
-      <w:r>
-        <w:rPr>
-          <w:rFonts w:ascii="Courier New" w:eastAsia="Courier New" w:hAnsi="Courier New" w:cs="Courier New"/>
-          <w:sz w:val="20"/>
-          <w:szCs w:val="20"/>
-        </w:rPr>
-        <w:t xml:space="preserve">    │   │   └── schemas.py           # Pydantic request/response models</w:t>
-      </w:r>
-    </w:p>
-    <w:p>
-      <w:pPr>
-        <w:shd w:val="clear" w:color="auto" w:fill="F5F5F5"/>
-        <w:ind w:left="360"/>
-      </w:pPr>
-      <w:r>
-        <w:rPr>
-          <w:rFonts w:ascii="Courier New" w:eastAsia="Courier New" w:hAnsi="Courier New" w:cs="Courier New"/>
-          <w:sz w:val="20"/>
-          <w:szCs w:val="20"/>
-        </w:rPr>
-        <w:t xml:space="preserve">    │   ├── engines/</w:t>
-      </w:r>
-    </w:p>
-    <w:p>
-      <w:pPr>
-        <w:shd w:val="clear" w:color="auto" w:fill="F5F5F5"/>
-        <w:ind w:left="360"/>
-      </w:pPr>
-      <w:r>
-        <w:rPr>
-          <w:rFonts w:ascii="Courier New" w:eastAsia="Courier New" w:hAnsi="Courier New" w:cs="Courier New"/>
-          <w:sz w:val="20"/>
-          <w:szCs w:val="20"/>
-        </w:rPr>
-        <w:t xml:space="preserve">    │   │   ├── base.py              # Abstract TTSEngine contract</w:t>
-      </w:r>
-    </w:p>
-    <w:p>
-      <w:pPr>
-        <w:shd w:val="clear" w:color="auto" w:fill="F5F5F5"/>
-        <w:ind w:left="360"/>
-      </w:pPr>
-      <w:r>
-        <w:rPr>
-          <w:rFonts w:ascii="Courier New" w:eastAsia="Courier New" w:hAnsi="Courier New" w:cs="Courier New"/>
-          <w:sz w:val="20"/>
-          <w:szCs w:val="20"/>
-        </w:rPr>
-        <w:t xml:space="preserve">    │   │   ├── kokoro_engine.py     # Kokoro-82M wrapper (54 voices, 9 languages)</w:t>
-      </w:r>
-    </w:p>
-    <w:p>
-      <w:pPr>
-        <w:shd w:val="clear" w:color="auto" w:fill="F5F5F5"/>
-        <w:ind w:left="360"/>
-      </w:pPr>
-      <w:r>
-        <w:rPr>
-          <w:rFonts w:ascii="Courier New" w:eastAsia="Courier New" w:hAnsi="Courier New" w:cs="Courier New"/>
-          <w:sz w:val="20"/>
-          <w:szCs w:val="20"/>
-        </w:rPr>
-        <w:t xml:space="preserve">    │   │   └── xtts_engine.py       # XTTS v2 zero-shot cloning wrapper (17 languages)</w:t>
-      </w:r>
-    </w:p>
-    <w:p>
-      <w:pPr>
-        <w:shd w:val="clear" w:color="auto" w:fill="F5F5F5"/>
-        <w:ind w:left="360"/>
-      </w:pPr>
-      <w:r>
-        <w:rPr>
-          <w:rFonts w:ascii="Courier New" w:eastAsia="Courier New" w:hAnsi="Courier New" w:cs="Courier New"/>
-          <w:sz w:val="20"/>
-          <w:szCs w:val="20"/>
-        </w:rPr>
-        <w:t xml:space="preserve">    │   └── utils/</w:t>
-      </w:r>
-    </w:p>
-    <w:p>
-      <w:pPr>
-        <w:shd w:val="clear" w:color="auto" w:fill="F5F5F5"/>
-        <w:ind w:left="360"/>
-      </w:pPr>
-      <w:r>
-        <w:rPr>
-          <w:rFonts w:ascii="Courier New" w:eastAsia="Courier New" w:hAnsi="Courier New" w:cs="Courier New"/>
-          <w:sz w:val="20"/>
-          <w:szCs w:val="20"/>
-        </w:rPr>
-        <w:t xml:space="preserve">    │       ├── audio.py             # Resample, normalise, trim</w:t>
-      </w:r>
-    </w:p>
-    <w:p>
-      <w:pPr>
-        <w:shd w:val="clear" w:color="auto" w:fill="F5F5F5"/>
-        <w:ind w:left="360"/>
-      </w:pPr>
-      <w:r>
-        <w:rPr>
-          <w:rFonts w:ascii="Courier New" w:eastAsia="Courier New" w:hAnsi="Courier New" w:cs="Courier New"/>
-          <w:sz w:val="20"/>
-          <w:szCs w:val="20"/>
-        </w:rPr>
-        <w:t xml:space="preserve">    │       ├── broadcast.py         # EBU R128, noise reduction, EQ, 44.1 kHz</w:t>
-      </w:r>
-    </w:p>
-    <w:p>
-      <w:pPr>
-        <w:shd w:val="clear" w:color="auto" w:fill="F5F5F5"/>
-        <w:ind w:left="360"/>
-      </w:pPr>
-      <w:r>
-        <w:rPr>
-          <w:rFonts w:ascii="Courier New" w:eastAsia="Courier New" w:hAnsi="Courier New" w:cs="Courier New"/>
-          <w:sz w:val="20"/>
-          <w:szCs w:val="20"/>
-        </w:rPr>
-        <w:t xml:space="preserve">    │       ├── ssml.py              # SSML parser</w:t>
-      </w:r>
-    </w:p>
-    <w:p>
-      <w:pPr>
-        <w:shd w:val="clear" w:color="auto" w:fill="F5F5F5"/>
-        <w:ind w:left="360"/>
-      </w:pPr>
-      <w:r>
-        <w:rPr>
-          <w:rFonts w:ascii="Courier New" w:eastAsia="Courier New" w:hAnsi="Courier New" w:cs="Courier New"/>
-          <w:sz w:val="20"/>
-          <w:szCs w:val="20"/>
-        </w:rPr>
-        <w:t xml:space="preserve">    │       ├── batch.py             # Async batch synthesis</w:t>
-      </w:r>
-    </w:p>
-    <w:p>
-      <w:pPr>
-        <w:shd w:val="clear" w:color="auto" w:fill="F5F5F5"/>
-        <w:ind w:left="360"/>
-      </w:pPr>
-      <w:r>
-        <w:rPr>
-          <w:rFonts w:ascii="Courier New" w:eastAsia="Courier New" w:hAnsi="Courier New" w:cs="Courier New"/>
-          <w:sz w:val="20"/>
-          <w:szCs w:val="20"/>
-        </w:rPr>
-        <w:t xml:space="preserve">    │       ├── device.py            # CUDA / MPS / CPU detection</w:t>
-      </w:r>
-    </w:p>
-    <w:p>
-      <w:pPr>
-        <w:shd w:val="clear" w:color="auto" w:fill="F5F5F5"/>
-        <w:ind w:left="360"/>
-      </w:pPr>
-      <w:r>
-        <w:rPr>
-          <w:rFonts w:ascii="Courier New" w:eastAsia="Courier New" w:hAnsi="Courier New" w:cs="Courier New"/>
-          <w:sz w:val="20"/>
-          <w:szCs w:val="20"/>
-        </w:rPr>
-        <w:t xml:space="preserve">    │       └── logger.py</w:t>
-      </w:r>
-    </w:p>
-    <w:p>
-      <w:pPr>
-        <w:shd w:val="clear" w:color="auto" w:fill="F5F5F5"/>
-        <w:ind w:left="360"/>
-      </w:pPr>
-      <w:r>
-        <w:rPr>
-          <w:rFonts w:ascii="Courier New" w:eastAsia="Courier New" w:hAnsi="Courier New" w:cs="Courier New"/>
-          <w:sz w:val="20"/>
-          <w:szCs w:val="20"/>
-        </w:rPr>
-        <w:t xml:space="preserve">    ├── frontend/</w:t>
-      </w:r>
-    </w:p>
-    <w:p>
-      <w:pPr>
-        <w:shd w:val="clear" w:color="auto" w:fill="F5F5F5"/>
-        <w:ind w:left="360"/>
-      </w:pPr>
-      <w:r>
-        <w:rPr>
-          <w:rFonts w:ascii="Courier New" w:eastAsia="Courier New" w:hAnsi="Courier New" w:cs="Courier New"/>
-          <w:sz w:val="20"/>
-          <w:szCs w:val="20"/>
-        </w:rPr>
-        <w:t xml:space="preserve">    │   ├── templates/index.html     # 3-tab browser UI</w:t>
-      </w:r>
-    </w:p>
-    <w:p>
-      <w:pPr>
-        <w:shd w:val="clear" w:color="auto" w:fill="F5F5F5"/>
-        <w:ind w:left="360"/>
-      </w:pPr>
-      <w:r>
-        <w:rPr>
-          <w:rFonts w:ascii="Courier New" w:eastAsia="Courier New" w:hAnsi="Courier New" w:cs="Courier New"/>
-          <w:sz w:val="20"/>
-          <w:szCs w:val="20"/>
-        </w:rPr>
-        <w:t xml:space="preserve">    │   └── static/{css,js}/</w:t>
-      </w:r>
-    </w:p>
-    <w:p>
-      <w:pPr>
-        <w:shd w:val="clear" w:color="auto" w:fill="F5F5F5"/>
-        <w:ind w:left="360"/>
-      </w:pPr>
-      <w:r>
-        <w:rPr>
-          <w:rFonts w:ascii="Courier New" w:eastAsia="Courier New" w:hAnsi="Courier New" w:cs="Courier New"/>
-          <w:sz w:val="20"/>
-          <w:szCs w:val="20"/>
-        </w:rPr>
-        <w:t xml:space="preserve">    ├── configs/settings.py          # Pydantic settings from .env</w:t>
-      </w:r>
-    </w:p>
-    <w:p>
-      <w:pPr>
-        <w:shd w:val="clear" w:color="auto" w:fill="F5F5F5"/>
-        <w:ind w:left="360"/>
-      </w:pPr>
-      <w:r>
-        <w:rPr>
-          <w:rFonts w:ascii="Courier New" w:eastAsia="Courier New" w:hAnsi="Courier New" w:cs="Courier New"/>
-          <w:sz w:val="20"/>
-          <w:szCs w:val="20"/>
-        </w:rPr>
-        <w:t xml:space="preserve">    ├── input_samples/               # Pre-packaged test reference clips (version-controlled)</w:t>
-      </w:r>
-    </w:p>
-    <w:p>
-      <w:pPr>
-        <w:shd w:val="clear" w:color="auto" w:fill="F5F5F5"/>
-        <w:ind w:left="360"/>
-      </w:pPr>
-      <w:r>
-        <w:rPr>
-          <w:rFonts w:ascii="Courier New" w:eastAsia="Courier New" w:hAnsi="Courier New" w:cs="Courier New"/>
-          <w:sz w:val="20"/>
-          <w:szCs w:val="20"/>
-        </w:rPr>
-        <w:t xml:space="preserve">    │   └── README.md</w:t>
-      </w:r>
-    </w:p>
-    <w:p>
-      <w:pPr>
-        <w:shd w:val="clear" w:color="auto" w:fill="F5F5F5"/>
-        <w:ind w:left="360"/>
-      </w:pPr>
-      <w:r>
-        <w:rPr>
-          <w:rFonts w:ascii="Courier New" w:eastAsia="Courier New" w:hAnsi="Courier New" w:cs="Courier New"/>
-          <w:sz w:val="20"/>
-          <w:szCs w:val="20"/>
-        </w:rPr>
-        <w:t xml:space="preserve">    ├── tests/</w:t>
-      </w:r>
-    </w:p>
-    <w:p>
-      <w:pPr>
-        <w:shd w:val="clear" w:color="auto" w:fill="F5F5F5"/>
-        <w:ind w:left="360"/>
-      </w:pPr>
-      <w:r>
-        <w:rPr>
-          <w:rFonts w:ascii="Courier New" w:eastAsia="Courier New" w:hAnsi="Courier New" w:cs="Courier New"/>
-          <w:sz w:val="20"/>
-          <w:szCs w:val="20"/>
-        </w:rPr>
-        <w:t xml:space="preserve">    ├── docker/</w:t>
-      </w:r>
-    </w:p>
-    <w:p>
-      <w:pPr>
-        <w:shd w:val="clear" w:color="auto" w:fill="F5F5F5"/>
-        <w:ind w:left="360"/>
-      </w:pPr>
-      <w:r>
-        <w:rPr>
-          <w:rFonts w:ascii="Courier New" w:eastAsia="Courier New" w:hAnsi="Courier New" w:cs="Courier New"/>
-          <w:sz w:val="20"/>
-          <w:szCs w:val="20"/>
-        </w:rPr>
-        <w:t xml:space="preserve">    ├── scripts/</w:t>
-      </w:r>
-    </w:p>
-    <w:p>
-      <w:pPr>
-        <w:shd w:val="clear" w:color="auto" w:fill="F5F5F5"/>
-        <w:ind w:left="360"/>
-      </w:pPr>
-      <w:r>
-        <w:rPr>
-          <w:rFonts w:ascii="Courier New" w:eastAsia="Courier New" w:hAnsi="Courier New" w:cs="Courier New"/>
-          <w:sz w:val="20"/>
-          <w:szCs w:val="20"/>
-        </w:rPr>
-        <w:t xml:space="preserve">    │   ├── setup.sh                 # One-command setup (macOS / Linux / WSL2)</w:t>
-      </w:r>
-    </w:p>
-    <w:p>
-      <w:pPr>
-        <w:shd w:val="clear" w:color="auto" w:fill="F5F5F5"/>
-        <w:ind w:left="360"/>
-      </w:pPr>
-      <w:r>
-        <w:rPr>
-          <w:rFonts w:ascii="Courier New" w:eastAsia="Courier New" w:hAnsi="Courier New" w:cs="Courier New"/>
-          <w:sz w:val="20"/>
-          <w:szCs w:val="20"/>
-        </w:rPr>
-        <w:t xml:space="preserve">    │   ├── setup.bat                # One-command setup (Windows native)</w:t>
-      </w:r>
-    </w:p>
-    <w:p>
-      <w:pPr>
-        <w:shd w:val="clear" w:color="auto" w:fill="F5F5F5"/>
-        <w:ind w:left="360"/>
-      </w:pPr>
-      <w:r>
-        <w:rPr>
-          <w:rFonts w:ascii="Courier New" w:eastAsia="Courier New" w:hAnsi="Courier New" w:cs="Courier New"/>
-          <w:sz w:val="20"/>
-          <w:szCs w:val="20"/>
-        </w:rPr>
-        <w:t xml:space="preserve">    │   └── download_models.py       # Pre-download model weights</w:t>
-      </w:r>
-    </w:p>
-    <w:p>
-      <w:pPr>
-        <w:shd w:val="clear" w:color="auto" w:fill="F5F5F5"/>
-        <w:ind w:left="360"/>
-      </w:pPr>
-      <w:r>
-        <w:rPr>
-          <w:rFonts w:ascii="Courier New" w:eastAsia="Courier New" w:hAnsi="Courier New" w:cs="Courier New"/>
-          <w:sz w:val="20"/>
-          <w:szCs w:val="20"/>
-        </w:rPr>
-        <w:t xml:space="preserve">    ├── Makefile</w:t>
-      </w:r>
-    </w:p>
-    <w:p>
-      <w:pPr>
-        <w:shd w:val="clear" w:color="auto" w:fill="F5F5F5"/>
-        <w:ind w:left="360"/>
-      </w:pPr>
-      <w:r>
-        <w:rPr>
-          <w:rFonts w:ascii="Courier New" w:eastAsia="Courier New" w:hAnsi="Courier New" w:cs="Courier New"/>
-          <w:sz w:val="20"/>
-          <w:szCs w:val="20"/>
-        </w:rPr>
-        <w:t xml:space="preserve">    ├── requirements.txt</w:t>
-      </w:r>
-    </w:p>
-    <w:p>
-      <w:pPr>
-        <w:shd w:val="clear" w:color="auto" w:fill="F5F5F5"/>
-        <w:ind w:left="360"/>
-      </w:pPr>
-      <w:r>
-        <w:rPr>
-          <w:rFonts w:ascii="Courier New" w:eastAsia="Courier New" w:hAnsi="Courier New" w:cs="Courier New"/>
-          <w:sz w:val="20"/>
-          <w:szCs w:val="20"/>
-        </w:rPr>
-        <w:t xml:space="preserve">    └── .env.example</w:t>
-      </w:r>
-    </w:p>
-    <w:p>
-      <w:pPr>
-        <w:spacing w:after="200"/>
-      </w:pPr>
     </w:p>
     <w:p>
       <w:pPr>
@@ -10601,13 +10294,7 @@
       <w:pPr>
         <w:pStyle w:val="Heading1"/>
       </w:pPr>
-    </w:p>
-    <w:p>
-      <w:pPr>
-        <w:pStyle w:val="Heading1"/>
-      </w:pPr>
-      <w:r>
-        <w:lastRenderedPageBreak/>
+      <w:r>
         <w:t>16. Key Configuration</w:t>
       </w:r>
     </w:p>
@@ -10778,7 +10465,7 @@
 </file>
 
 <file path=word/endnotes.xml><?xml version="1.0" encoding="utf-8"?>
-<w:endnotes xmlns:wpc="http://schemas.microsoft.com/office/word/2010/wordprocessingCanvas" xmlns:cx="http://schemas.microsoft.com/office/drawing/2014/chartex" xmlns:cx1="http://schemas.microsoft.com/office/drawing/2015/9/8/chartex" xmlns:cx2="http://schemas.microsoft.com/office/drawing/2015/10/21/chartex" xmlns:cx3="http://schemas.microsoft.com/office/drawing/2016/5/9/chartex" xmlns:cx4="http://schemas.microsoft.com/office/drawing/2016/5/10/chartex" xmlns:cx5="http://schemas.microsoft.com/office/drawing/2016/5/11/chartex" xmlns:cx6="http://schemas.microsoft.com/office/drawing/2016/5/12/chartex" xmlns:cx7="http://schemas.microsoft.com/office/drawing/2016/5/13/chartex" xmlns:cx8="http://schemas.microsoft.com/office/drawing/2016/5/14/chartex" xmlns:mc="http://schemas.openxmlformats.org/markup-compatibility/2006" xmlns:aink="http://schemas.microsoft.com/office/drawing/2016/ink" xmlns:am3d="http://schemas.microsoft.com/office/drawing/2017/model3d" xmlns:o="urn:schemas-microsoft-com:office:office" xmlns:oel="http://schemas.microsoft.com/office/2019/extlst" xmlns:r="http://schemas.openxmlformats.org/officeDocument/2006/relationships" xmlns:m="http://schemas.openxmlformats.org/officeDocument/2006/math" xmlns:v="urn:schemas-microsoft-com:vml" xmlns:wp14="http://schemas.microsoft.com/office/word/2010/wordprocessingDrawing" xmlns:wp="http://schemas.openxmlformats.org/drawingml/2006/wordprocessingDrawing" xmlns:w10="urn:schemas-microsoft-com:office:word" xmlns:w="http://schemas.openxmlformats.org/wordprocessingml/2006/main" xmlns:w14="http://schemas.microsoft.com/office/word/2010/wordml" xmlns:w15="http://schemas.microsoft.com/office/word/2012/wordml" xmlns:w16cex="http://schemas.microsoft.com/office/word/2018/wordml/cex" xmlns:w16cid="http://schemas.microsoft.com/office/word/2016/wordml/cid" xmlns:w16="http://schemas.microsoft.com/office/word/2018/wordml" xmlns:w16du="http://schemas.microsoft.com/office/word/2023/wordml/word16du" xmlns:w16sdtdh="http://schemas.microsoft.com/office/word/2020/wordml/sdtdatahash" xmlns:w16sdtfl="http://schemas.microsoft.com/office/word/2024/wordml/sdtformatlock" xmlns:w16se="http://schemas.microsoft.com/office/word/2015/wordml/symex" xmlns:wpg="http://schemas.microsoft.com/office/word/2010/wordprocessingGroup" xmlns:wpi="http://schemas.microsoft.com/office/word/2010/wordprocessingInk" xmlns:wne="http://schemas.microsoft.com/office/word/2006/wordml" xmlns:wps="http://schemas.microsoft.com/office/word/2010/wordprocessingShape" mc:Ignorable="w14 w15 w16se w16cid w16 w16cex w16sdtdh w16sdtfl w16du wp14">
+<w:endnotes xmlns:wpc="http://schemas.microsoft.com/office/word/2010/wordprocessingCanvas" xmlns:cx="http://schemas.microsoft.com/office/drawing/2014/chartex" xmlns:cx1="http://schemas.microsoft.com/office/drawing/2015/9/8/chartex" xmlns:cx2="http://schemas.microsoft.com/office/drawing/2015/10/21/chartex" xmlns:cx3="http://schemas.microsoft.com/office/drawing/2016/5/9/chartex" xmlns:cx4="http://schemas.microsoft.com/office/drawing/2016/5/10/chartex" xmlns:cx5="http://schemas.microsoft.com/office/drawing/2016/5/11/chartex" xmlns:cx6="http://schemas.microsoft.com/office/drawing/2016/5/12/chartex" xmlns:cx7="http://schemas.microsoft.com/office/drawing/2016/5/13/chartex" xmlns:cx8="http://schemas.microsoft.com/office/drawing/2016/5/14/chartex" xmlns:mc="http://schemas.openxmlformats.org/markup-compatibility/2006" xmlns:aink="http://schemas.microsoft.com/office/drawing/2016/ink" xmlns:am3d="http://schemas.microsoft.com/office/drawing/2017/model3d" xmlns:o="urn:schemas-microsoft-com:office:office" xmlns:oel="http://schemas.microsoft.com/office/2019/extlst" xmlns:r="http://schemas.openxmlformats.org/officeDocument/2006/relationships" xmlns:m="http://schemas.openxmlformats.org/officeDocument/2006/math" xmlns:v="urn:schemas-microsoft-com:vml" xmlns:wp14="http://schemas.microsoft.com/office/word/2010/wordprocessingDrawing" xmlns:wp="http://schemas.openxmlformats.org/drawingml/2006/wordprocessingDrawing" xmlns:w10="urn:schemas-microsoft-com:office:word" xmlns:w="http://schemas.openxmlformats.org/wordprocessingml/2006/main" xmlns:w14="http://schemas.microsoft.com/office/word/2010/wordml" xmlns:w15="http://schemas.microsoft.com/office/word/2012/wordml" xmlns:w16cex="http://schemas.microsoft.com/office/word/2018/wordml/cex" xmlns:w16cid="http://schemas.microsoft.com/office/word/2016/wordml/cid" xmlns:w16="http://schemas.microsoft.com/office/word/2018/wordml" xmlns:w16sdtdh="http://schemas.microsoft.com/office/word/2020/wordml/sdtdatahash" xmlns:w16se="http://schemas.microsoft.com/office/word/2015/wordml/symex" xmlns:wpg="http://schemas.microsoft.com/office/word/2010/wordprocessingGroup" xmlns:wpi="http://schemas.microsoft.com/office/word/2010/wordprocessingInk" xmlns:wne="http://schemas.microsoft.com/office/word/2006/wordml" xmlns:wps="http://schemas.microsoft.com/office/word/2010/wordprocessingShape" mc:Ignorable="w14 w15 w16se w16cid w16 w16cex w16sdtdh wp14">
   <w:endnote w:type="separator" w:id="-1">
     <w:p>
       <w:r>
@@ -10797,7 +10484,7 @@
 </file>
 
 <file path=word/footer1.xml><?xml version="1.0" encoding="utf-8"?>
-<w:ftr xmlns:wpc="http://schemas.microsoft.com/office/word/2010/wordprocessingCanvas" xmlns:cx="http://schemas.microsoft.com/office/drawing/2014/chartex" xmlns:cx1="http://schemas.microsoft.com/office/drawing/2015/9/8/chartex" xmlns:cx2="http://schemas.microsoft.com/office/drawing/2015/10/21/chartex" xmlns:cx3="http://schemas.microsoft.com/office/drawing/2016/5/9/chartex" xmlns:cx4="http://schemas.microsoft.com/office/drawing/2016/5/10/chartex" xmlns:cx5="http://schemas.microsoft.com/office/drawing/2016/5/11/chartex" xmlns:cx6="http://schemas.microsoft.com/office/drawing/2016/5/12/chartex" xmlns:cx7="http://schemas.microsoft.com/office/drawing/2016/5/13/chartex" xmlns:cx8="http://schemas.microsoft.com/office/drawing/2016/5/14/chartex" xmlns:mc="http://schemas.openxmlformats.org/markup-compatibility/2006" xmlns:aink="http://schemas.microsoft.com/office/drawing/2016/ink" xmlns:am3d="http://schemas.microsoft.com/office/drawing/2017/model3d" xmlns:o="urn:schemas-microsoft-com:office:office" xmlns:oel="http://schemas.microsoft.com/office/2019/extlst" xmlns:r="http://schemas.openxmlformats.org/officeDocument/2006/relationships" xmlns:m="http://schemas.openxmlformats.org/officeDocument/2006/math" xmlns:v="urn:schemas-microsoft-com:vml" xmlns:wp14="http://schemas.microsoft.com/office/word/2010/wordprocessingDrawing" xmlns:wp="http://schemas.openxmlformats.org/drawingml/2006/wordprocessingDrawing" xmlns:w10="urn:schemas-microsoft-com:office:word" xmlns:w="http://schemas.openxmlformats.org/wordprocessingml/2006/main" xmlns:w14="http://schemas.microsoft.com/office/word/2010/wordml" xmlns:w15="http://schemas.microsoft.com/office/word/2012/wordml" xmlns:w16cex="http://schemas.microsoft.com/office/word/2018/wordml/cex" xmlns:w16cid="http://schemas.microsoft.com/office/word/2016/wordml/cid" xmlns:w16="http://schemas.microsoft.com/office/word/2018/wordml" xmlns:w16du="http://schemas.microsoft.com/office/word/2023/wordml/word16du" xmlns:w16sdtdh="http://schemas.microsoft.com/office/word/2020/wordml/sdtdatahash" xmlns:w16sdtfl="http://schemas.microsoft.com/office/word/2024/wordml/sdtformatlock" xmlns:w16se="http://schemas.microsoft.com/office/word/2015/wordml/symex" xmlns:wpg="http://schemas.microsoft.com/office/word/2010/wordprocessingGroup" xmlns:wpi="http://schemas.microsoft.com/office/word/2010/wordprocessingInk" xmlns:wne="http://schemas.microsoft.com/office/word/2006/wordml" xmlns:wps="http://schemas.microsoft.com/office/word/2010/wordprocessingShape" mc:Ignorable="w14 w15 w16se w16cid w16 w16cex w16sdtdh w16sdtfl w16du wp14">
+<w:ftr xmlns:wpc="http://schemas.microsoft.com/office/word/2010/wordprocessingCanvas" xmlns:cx="http://schemas.microsoft.com/office/drawing/2014/chartex" xmlns:cx1="http://schemas.microsoft.com/office/drawing/2015/9/8/chartex" xmlns:cx2="http://schemas.microsoft.com/office/drawing/2015/10/21/chartex" xmlns:cx3="http://schemas.microsoft.com/office/drawing/2016/5/9/chartex" xmlns:cx4="http://schemas.microsoft.com/office/drawing/2016/5/10/chartex" xmlns:cx5="http://schemas.microsoft.com/office/drawing/2016/5/11/chartex" xmlns:cx6="http://schemas.microsoft.com/office/drawing/2016/5/12/chartex" xmlns:cx7="http://schemas.microsoft.com/office/drawing/2016/5/13/chartex" xmlns:cx8="http://schemas.microsoft.com/office/drawing/2016/5/14/chartex" xmlns:mc="http://schemas.openxmlformats.org/markup-compatibility/2006" xmlns:aink="http://schemas.microsoft.com/office/drawing/2016/ink" xmlns:am3d="http://schemas.microsoft.com/office/drawing/2017/model3d" xmlns:o="urn:schemas-microsoft-com:office:office" xmlns:oel="http://schemas.microsoft.com/office/2019/extlst" xmlns:r="http://schemas.openxmlformats.org/officeDocument/2006/relationships" xmlns:m="http://schemas.openxmlformats.org/officeDocument/2006/math" xmlns:v="urn:schemas-microsoft-com:vml" xmlns:wp14="http://schemas.microsoft.com/office/word/2010/wordprocessingDrawing" xmlns:wp="http://schemas.openxmlformats.org/drawingml/2006/wordprocessingDrawing" xmlns:w10="urn:schemas-microsoft-com:office:word" xmlns:w="http://schemas.openxmlformats.org/wordprocessingml/2006/main" xmlns:w14="http://schemas.microsoft.com/office/word/2010/wordml" xmlns:w15="http://schemas.microsoft.com/office/word/2012/wordml" xmlns:w16cex="http://schemas.microsoft.com/office/word/2018/wordml/cex" xmlns:w16cid="http://schemas.microsoft.com/office/word/2016/wordml/cid" xmlns:w16="http://schemas.microsoft.com/office/word/2018/wordml" xmlns:w16sdtdh="http://schemas.microsoft.com/office/word/2020/wordml/sdtdatahash" xmlns:w16se="http://schemas.microsoft.com/office/word/2015/wordml/symex" xmlns:wpg="http://schemas.microsoft.com/office/word/2010/wordprocessingGroup" xmlns:wpi="http://schemas.microsoft.com/office/word/2010/wordprocessingInk" xmlns:wne="http://schemas.microsoft.com/office/word/2006/wordml" xmlns:wps="http://schemas.microsoft.com/office/word/2010/wordprocessingShape" mc:Ignorable="w14 w15 w16se w16cid w16 w16cex w16sdtdh wp14">
   <w:p>
     <w:pPr>
       <w:pBdr>
@@ -10908,7 +10595,7 @@
 </file>
 
 <file path=word/footnotes.xml><?xml version="1.0" encoding="utf-8"?>
-<w:footnotes xmlns:wpc="http://schemas.microsoft.com/office/word/2010/wordprocessingCanvas" xmlns:cx="http://schemas.microsoft.com/office/drawing/2014/chartex" xmlns:cx1="http://schemas.microsoft.com/office/drawing/2015/9/8/chartex" xmlns:cx2="http://schemas.microsoft.com/office/drawing/2015/10/21/chartex" xmlns:cx3="http://schemas.microsoft.com/office/drawing/2016/5/9/chartex" xmlns:cx4="http://schemas.microsoft.com/office/drawing/2016/5/10/chartex" xmlns:cx5="http://schemas.microsoft.com/office/drawing/2016/5/11/chartex" xmlns:cx6="http://schemas.microsoft.com/office/drawing/2016/5/12/chartex" xmlns:cx7="http://schemas.microsoft.com/office/drawing/2016/5/13/chartex" xmlns:cx8="http://schemas.microsoft.com/office/drawing/2016/5/14/chartex" xmlns:mc="http://schemas.openxmlformats.org/markup-compatibility/2006" xmlns:aink="http://schemas.microsoft.com/office/drawing/2016/ink" xmlns:am3d="http://schemas.microsoft.com/office/drawing/2017/model3d" xmlns:o="urn:schemas-microsoft-com:office:office" xmlns:oel="http://schemas.microsoft.com/office/2019/extlst" xmlns:r="http://schemas.openxmlformats.org/officeDocument/2006/relationships" xmlns:m="http://schemas.openxmlformats.org/officeDocument/2006/math" xmlns:v="urn:schemas-microsoft-com:vml" xmlns:wp14="http://schemas.microsoft.com/office/word/2010/wordprocessingDrawing" xmlns:wp="http://schemas.openxmlformats.org/drawingml/2006/wordprocessingDrawing" xmlns:w10="urn:schemas-microsoft-com:office:word" xmlns:w="http://schemas.openxmlformats.org/wordprocessingml/2006/main" xmlns:w14="http://schemas.microsoft.com/office/word/2010/wordml" xmlns:w15="http://schemas.microsoft.com/office/word/2012/wordml" xmlns:w16cex="http://schemas.microsoft.com/office/word/2018/wordml/cex" xmlns:w16cid="http://schemas.microsoft.com/office/word/2016/wordml/cid" xmlns:w16="http://schemas.microsoft.com/office/word/2018/wordml" xmlns:w16du="http://schemas.microsoft.com/office/word/2023/wordml/word16du" xmlns:w16sdtdh="http://schemas.microsoft.com/office/word/2020/wordml/sdtdatahash" xmlns:w16sdtfl="http://schemas.microsoft.com/office/word/2024/wordml/sdtformatlock" xmlns:w16se="http://schemas.microsoft.com/office/word/2015/wordml/symex" xmlns:wpg="http://schemas.microsoft.com/office/word/2010/wordprocessingGroup" xmlns:wpi="http://schemas.microsoft.com/office/word/2010/wordprocessingInk" xmlns:wne="http://schemas.microsoft.com/office/word/2006/wordml" xmlns:wps="http://schemas.microsoft.com/office/word/2010/wordprocessingShape" mc:Ignorable="w14 w15 w16se w16cid w16 w16cex w16sdtdh w16sdtfl w16du wp14">
+<w:footnotes xmlns:wpc="http://schemas.microsoft.com/office/word/2010/wordprocessingCanvas" xmlns:cx="http://schemas.microsoft.com/office/drawing/2014/chartex" xmlns:cx1="http://schemas.microsoft.com/office/drawing/2015/9/8/chartex" xmlns:cx2="http://schemas.microsoft.com/office/drawing/2015/10/21/chartex" xmlns:cx3="http://schemas.microsoft.com/office/drawing/2016/5/9/chartex" xmlns:cx4="http://schemas.microsoft.com/office/drawing/2016/5/10/chartex" xmlns:cx5="http://schemas.microsoft.com/office/drawing/2016/5/11/chartex" xmlns:cx6="http://schemas.microsoft.com/office/drawing/2016/5/12/chartex" xmlns:cx7="http://schemas.microsoft.com/office/drawing/2016/5/13/chartex" xmlns:cx8="http://schemas.microsoft.com/office/drawing/2016/5/14/chartex" xmlns:mc="http://schemas.openxmlformats.org/markup-compatibility/2006" xmlns:aink="http://schemas.microsoft.com/office/drawing/2016/ink" xmlns:am3d="http://schemas.microsoft.com/office/drawing/2017/model3d" xmlns:o="urn:schemas-microsoft-com:office:office" xmlns:oel="http://schemas.microsoft.com/office/2019/extlst" xmlns:r="http://schemas.openxmlformats.org/officeDocument/2006/relationships" xmlns:m="http://schemas.openxmlformats.org/officeDocument/2006/math" xmlns:v="urn:schemas-microsoft-com:vml" xmlns:wp14="http://schemas.microsoft.com/office/word/2010/wordprocessingDrawing" xmlns:wp="http://schemas.openxmlformats.org/drawingml/2006/wordprocessingDrawing" xmlns:w10="urn:schemas-microsoft-com:office:word" xmlns:w="http://schemas.openxmlformats.org/wordprocessingml/2006/main" xmlns:w14="http://schemas.microsoft.com/office/word/2010/wordml" xmlns:w15="http://schemas.microsoft.com/office/word/2012/wordml" xmlns:w16cex="http://schemas.microsoft.com/office/word/2018/wordml/cex" xmlns:w16cid="http://schemas.microsoft.com/office/word/2016/wordml/cid" xmlns:w16="http://schemas.microsoft.com/office/word/2018/wordml" xmlns:w16sdtdh="http://schemas.microsoft.com/office/word/2020/wordml/sdtdatahash" xmlns:w16se="http://schemas.microsoft.com/office/word/2015/wordml/symex" xmlns:wpg="http://schemas.microsoft.com/office/word/2010/wordprocessingGroup" xmlns:wpi="http://schemas.microsoft.com/office/word/2010/wordprocessingInk" xmlns:wne="http://schemas.microsoft.com/office/word/2006/wordml" xmlns:wps="http://schemas.microsoft.com/office/word/2010/wordprocessingShape" mc:Ignorable="w14 w15 w16se w16cid w16 w16cex w16sdtdh wp14">
   <w:footnote w:type="separator" w:id="-1">
     <w:p>
       <w:r>
@@ -10927,7 +10614,7 @@
 </file>
 
 <file path=word/header1.xml><?xml version="1.0" encoding="utf-8"?>
-<w:hdr xmlns:wpc="http://schemas.microsoft.com/office/word/2010/wordprocessingCanvas" xmlns:cx="http://schemas.microsoft.com/office/drawing/2014/chartex" xmlns:cx1="http://schemas.microsoft.com/office/drawing/2015/9/8/chartex" xmlns:cx2="http://schemas.microsoft.com/office/drawing/2015/10/21/chartex" xmlns:cx3="http://schemas.microsoft.com/office/drawing/2016/5/9/chartex" xmlns:cx4="http://schemas.microsoft.com/office/drawing/2016/5/10/chartex" xmlns:cx5="http://schemas.microsoft.com/office/drawing/2016/5/11/chartex" xmlns:cx6="http://schemas.microsoft.com/office/drawing/2016/5/12/chartex" xmlns:cx7="http://schemas.microsoft.com/office/drawing/2016/5/13/chartex" xmlns:cx8="http://schemas.microsoft.com/office/drawing/2016/5/14/chartex" xmlns:mc="http://schemas.openxmlformats.org/markup-compatibility/2006" xmlns:aink="http://schemas.microsoft.com/office/drawing/2016/ink" xmlns:am3d="http://schemas.microsoft.com/office/drawing/2017/model3d" xmlns:o="urn:schemas-microsoft-com:office:office" xmlns:oel="http://schemas.microsoft.com/office/2019/extlst" xmlns:r="http://schemas.openxmlformats.org/officeDocument/2006/relationships" xmlns:m="http://schemas.openxmlformats.org/officeDocument/2006/math" xmlns:v="urn:schemas-microsoft-com:vml" xmlns:wp14="http://schemas.microsoft.com/office/word/2010/wordprocessingDrawing" xmlns:wp="http://schemas.openxmlformats.org/drawingml/2006/wordprocessingDrawing" xmlns:w10="urn:schemas-microsoft-com:office:word" xmlns:w="http://schemas.openxmlformats.org/wordprocessingml/2006/main" xmlns:w14="http://schemas.microsoft.com/office/word/2010/wordml" xmlns:w15="http://schemas.microsoft.com/office/word/2012/wordml" xmlns:w16cex="http://schemas.microsoft.com/office/word/2018/wordml/cex" xmlns:w16cid="http://schemas.microsoft.com/office/word/2016/wordml/cid" xmlns:w16="http://schemas.microsoft.com/office/word/2018/wordml" xmlns:w16du="http://schemas.microsoft.com/office/word/2023/wordml/word16du" xmlns:w16sdtdh="http://schemas.microsoft.com/office/word/2020/wordml/sdtdatahash" xmlns:w16sdtfl="http://schemas.microsoft.com/office/word/2024/wordml/sdtformatlock" xmlns:w16se="http://schemas.microsoft.com/office/word/2015/wordml/symex" xmlns:wpg="http://schemas.microsoft.com/office/word/2010/wordprocessingGroup" xmlns:wpi="http://schemas.microsoft.com/office/word/2010/wordprocessingInk" xmlns:wne="http://schemas.microsoft.com/office/word/2006/wordml" xmlns:wps="http://schemas.microsoft.com/office/word/2010/wordprocessingShape" mc:Ignorable="w14 w15 w16se w16cid w16 w16cex w16sdtdh w16sdtfl w16du wp14">
+<w:hdr xmlns:wpc="http://schemas.microsoft.com/office/word/2010/wordprocessingCanvas" xmlns:cx="http://schemas.microsoft.com/office/drawing/2014/chartex" xmlns:cx1="http://schemas.microsoft.com/office/drawing/2015/9/8/chartex" xmlns:cx2="http://schemas.microsoft.com/office/drawing/2015/10/21/chartex" xmlns:cx3="http://schemas.microsoft.com/office/drawing/2016/5/9/chartex" xmlns:cx4="http://schemas.microsoft.com/office/drawing/2016/5/10/chartex" xmlns:cx5="http://schemas.microsoft.com/office/drawing/2016/5/11/chartex" xmlns:cx6="http://schemas.microsoft.com/office/drawing/2016/5/12/chartex" xmlns:cx7="http://schemas.microsoft.com/office/drawing/2016/5/13/chartex" xmlns:cx8="http://schemas.microsoft.com/office/drawing/2016/5/14/chartex" xmlns:mc="http://schemas.openxmlformats.org/markup-compatibility/2006" xmlns:aink="http://schemas.microsoft.com/office/drawing/2016/ink" xmlns:am3d="http://schemas.microsoft.com/office/drawing/2017/model3d" xmlns:o="urn:schemas-microsoft-com:office:office" xmlns:oel="http://schemas.microsoft.com/office/2019/extlst" xmlns:r="http://schemas.openxmlformats.org/officeDocument/2006/relationships" xmlns:m="http://schemas.openxmlformats.org/officeDocument/2006/math" xmlns:v="urn:schemas-microsoft-com:vml" xmlns:wp14="http://schemas.microsoft.com/office/word/2010/wordprocessingDrawing" xmlns:wp="http://schemas.openxmlformats.org/drawingml/2006/wordprocessingDrawing" xmlns:w10="urn:schemas-microsoft-com:office:word" xmlns:w="http://schemas.openxmlformats.org/wordprocessingml/2006/main" xmlns:w14="http://schemas.microsoft.com/office/word/2010/wordml" xmlns:w15="http://schemas.microsoft.com/office/word/2012/wordml" xmlns:w16cex="http://schemas.microsoft.com/office/word/2018/wordml/cex" xmlns:w16cid="http://schemas.microsoft.com/office/word/2016/wordml/cid" xmlns:w16="http://schemas.microsoft.com/office/word/2018/wordml" xmlns:w16sdtdh="http://schemas.microsoft.com/office/word/2020/wordml/sdtdatahash" xmlns:w16se="http://schemas.microsoft.com/office/word/2015/wordml/symex" xmlns:wpg="http://schemas.microsoft.com/office/word/2010/wordprocessingGroup" xmlns:wpi="http://schemas.microsoft.com/office/word/2010/wordprocessingInk" xmlns:wne="http://schemas.microsoft.com/office/word/2006/wordml" xmlns:wps="http://schemas.microsoft.com/office/word/2010/wordprocessingShape" mc:Ignorable="w14 w15 w16se w16cid w16 w16cex w16sdtdh wp14">
   <w:p>
     <w:pPr>
       <w:pBdr>
@@ -10959,7 +10646,7 @@
 </file>
 
 <file path=word/numbering.xml><?xml version="1.0" encoding="utf-8"?>
-<w:numbering xmlns:wpc="http://schemas.microsoft.com/office/word/2010/wordprocessingCanvas" xmlns:cx="http://schemas.microsoft.com/office/drawing/2014/chartex" xmlns:cx1="http://schemas.microsoft.com/office/drawing/2015/9/8/chartex" xmlns:cx2="http://schemas.microsoft.com/office/drawing/2015/10/21/chartex" xmlns:cx3="http://schemas.microsoft.com/office/drawing/2016/5/9/chartex" xmlns:cx4="http://schemas.microsoft.com/office/drawing/2016/5/10/chartex" xmlns:cx5="http://schemas.microsoft.com/office/drawing/2016/5/11/chartex" xmlns:cx6="http://schemas.microsoft.com/office/drawing/2016/5/12/chartex" xmlns:cx7="http://schemas.microsoft.com/office/drawing/2016/5/13/chartex" xmlns:cx8="http://schemas.microsoft.com/office/drawing/2016/5/14/chartex" xmlns:mc="http://schemas.openxmlformats.org/markup-compatibility/2006" xmlns:aink="http://schemas.microsoft.com/office/drawing/2016/ink" xmlns:am3d="http://schemas.microsoft.com/office/drawing/2017/model3d" xmlns:o="urn:schemas-microsoft-com:office:office" xmlns:oel="http://schemas.microsoft.com/office/2019/extlst" xmlns:r="http://schemas.openxmlformats.org/officeDocument/2006/relationships" xmlns:m="http://schemas.openxmlformats.org/officeDocument/2006/math" xmlns:v="urn:schemas-microsoft-com:vml" xmlns:wp14="http://schemas.microsoft.com/office/word/2010/wordprocessingDrawing" xmlns:wp="http://schemas.openxmlformats.org/drawingml/2006/wordprocessingDrawing" xmlns:w10="urn:schemas-microsoft-com:office:word" xmlns:w="http://schemas.openxmlformats.org/wordprocessingml/2006/main" xmlns:w14="http://schemas.microsoft.com/office/word/2010/wordml" xmlns:w15="http://schemas.microsoft.com/office/word/2012/wordml" xmlns:w16cex="http://schemas.microsoft.com/office/word/2018/wordml/cex" xmlns:w16cid="http://schemas.microsoft.com/office/word/2016/wordml/cid" xmlns:w16="http://schemas.microsoft.com/office/word/2018/wordml" xmlns:w16du="http://schemas.microsoft.com/office/word/2023/wordml/word16du" xmlns:w16sdtdh="http://schemas.microsoft.com/office/word/2020/wordml/sdtdatahash" xmlns:w16sdtfl="http://schemas.microsoft.com/office/word/2024/wordml/sdtformatlock" xmlns:w16se="http://schemas.microsoft.com/office/word/2015/wordml/symex" xmlns:wpg="http://schemas.microsoft.com/office/word/2010/wordprocessingGroup" xmlns:wpi="http://schemas.microsoft.com/office/word/2010/wordprocessingInk" xmlns:wne="http://schemas.microsoft.com/office/word/2006/wordml" xmlns:wps="http://schemas.microsoft.com/office/word/2010/wordprocessingShape" mc:Ignorable="w14 w15 w16se w16cid w16 w16cex w16sdtdh w16sdtfl w16du wp14">
+<w:numbering xmlns:wpc="http://schemas.microsoft.com/office/word/2010/wordprocessingCanvas" xmlns:cx="http://schemas.microsoft.com/office/drawing/2014/chartex" xmlns:cx1="http://schemas.microsoft.com/office/drawing/2015/9/8/chartex" xmlns:cx2="http://schemas.microsoft.com/office/drawing/2015/10/21/chartex" xmlns:cx3="http://schemas.microsoft.com/office/drawing/2016/5/9/chartex" xmlns:cx4="http://schemas.microsoft.com/office/drawing/2016/5/10/chartex" xmlns:cx5="http://schemas.microsoft.com/office/drawing/2016/5/11/chartex" xmlns:cx6="http://schemas.microsoft.com/office/drawing/2016/5/12/chartex" xmlns:cx7="http://schemas.microsoft.com/office/drawing/2016/5/13/chartex" xmlns:cx8="http://schemas.microsoft.com/office/drawing/2016/5/14/chartex" xmlns:mc="http://schemas.openxmlformats.org/markup-compatibility/2006" xmlns:aink="http://schemas.microsoft.com/office/drawing/2016/ink" xmlns:am3d="http://schemas.microsoft.com/office/drawing/2017/model3d" xmlns:o="urn:schemas-microsoft-com:office:office" xmlns:oel="http://schemas.microsoft.com/office/2019/extlst" xmlns:r="http://schemas.openxmlformats.org/officeDocument/2006/relationships" xmlns:m="http://schemas.openxmlformats.org/officeDocument/2006/math" xmlns:v="urn:schemas-microsoft-com:vml" xmlns:wp14="http://schemas.microsoft.com/office/word/2010/wordprocessingDrawing" xmlns:wp="http://schemas.openxmlformats.org/drawingml/2006/wordprocessingDrawing" xmlns:w10="urn:schemas-microsoft-com:office:word" xmlns:w="http://schemas.openxmlformats.org/wordprocessingml/2006/main" xmlns:w14="http://schemas.microsoft.com/office/word/2010/wordml" xmlns:w15="http://schemas.microsoft.com/office/word/2012/wordml" xmlns:w16cex="http://schemas.microsoft.com/office/word/2018/wordml/cex" xmlns:w16cid="http://schemas.microsoft.com/office/word/2016/wordml/cid" xmlns:w16="http://schemas.microsoft.com/office/word/2018/wordml" xmlns:w16sdtdh="http://schemas.microsoft.com/office/word/2020/wordml/sdtdatahash" xmlns:w16se="http://schemas.microsoft.com/office/word/2015/wordml/symex" xmlns:wpg="http://schemas.microsoft.com/office/word/2010/wordprocessingGroup" xmlns:wpi="http://schemas.microsoft.com/office/word/2010/wordprocessingInk" xmlns:wne="http://schemas.microsoft.com/office/word/2006/wordml" xmlns:wps="http://schemas.microsoft.com/office/word/2010/wordprocessingShape" mc:Ignorable="w14 w15 w16se w16cid w16 w16cex w16sdtdh wp14">
   <w:abstractNum w:abstractNumId="0" w15:restartNumberingAfterBreak="0">
     <w:nsid w:val="09FE074F"/>
     <w:multiLevelType w:val="hybridMultilevel"/>
@@ -11176,7 +10863,7 @@
 </file>
 
 <file path=word/styles.xml><?xml version="1.0" encoding="utf-8"?>
-<w:styles xmlns:mc="http://schemas.openxmlformats.org/markup-compatibility/2006" xmlns:r="http://schemas.openxmlformats.org/officeDocument/2006/relationships" xmlns:w="http://schemas.openxmlformats.org/wordprocessingml/2006/main" xmlns:w14="http://schemas.microsoft.com/office/word/2010/wordml" xmlns:w15="http://schemas.microsoft.com/office/word/2012/wordml" xmlns:w16cex="http://schemas.microsoft.com/office/word/2018/wordml/cex" xmlns:w16cid="http://schemas.microsoft.com/office/word/2016/wordml/cid" xmlns:w16="http://schemas.microsoft.com/office/word/2018/wordml" xmlns:w16du="http://schemas.microsoft.com/office/word/2023/wordml/word16du" xmlns:w16sdtdh="http://schemas.microsoft.com/office/word/2020/wordml/sdtdatahash" xmlns:w16sdtfl="http://schemas.microsoft.com/office/word/2024/wordml/sdtformatlock" xmlns:w16se="http://schemas.microsoft.com/office/word/2015/wordml/symex" mc:Ignorable="w14 w15 w16se w16cid w16 w16cex w16sdtdh w16sdtfl w16du">
+<w:styles xmlns:mc="http://schemas.openxmlformats.org/markup-compatibility/2006" xmlns:r="http://schemas.openxmlformats.org/officeDocument/2006/relationships" xmlns:w="http://schemas.openxmlformats.org/wordprocessingml/2006/main" xmlns:w14="http://schemas.microsoft.com/office/word/2010/wordml" xmlns:w15="http://schemas.microsoft.com/office/word/2012/wordml" xmlns:w16cex="http://schemas.microsoft.com/office/word/2018/wordml/cex" xmlns:w16cid="http://schemas.microsoft.com/office/word/2016/wordml/cid" xmlns:w16="http://schemas.microsoft.com/office/word/2018/wordml" xmlns:w16sdtdh="http://schemas.microsoft.com/office/word/2020/wordml/sdtdatahash" xmlns:w16se="http://schemas.microsoft.com/office/word/2015/wordml/symex" mc:Ignorable="w14 w15 w16se w16cid w16 w16cex w16sdtdh">
   <w:docDefaults>
     <w:rPrDefault>
       <w:rPr>

</xml_diff>

<commit_message>
Updated solution design doc
</commit_message>
<xml_diff>
--- a/audio-ML/speak-like-anyone-for-social-media/docs/TTS_Agent_Solution_Design.docx
+++ b/audio-ML/speak-like-anyone-for-social-media/docs/TTS_Agent_Solution_Design.docx
@@ -1811,15 +1811,24 @@
     </w:p>
     <w:p>
       <w:pPr>
+        <w:spacing w:after="120"/>
+      </w:pPr>
+    </w:p>
+    <w:p>
+      <w:pPr>
+        <w:spacing w:after="120"/>
+      </w:pPr>
+    </w:p>
+    <w:p>
+      <w:pPr>
+        <w:spacing w:after="120"/>
+      </w:pPr>
+    </w:p>
+    <w:p>
+      <w:pPr>
         <w:pStyle w:val="Heading2"/>
       </w:pPr>
-    </w:p>
-    <w:p>
-      <w:pPr>
-        <w:pStyle w:val="Heading2"/>
-      </w:pPr>
-      <w:r>
-        <w:lastRenderedPageBreak/>
+      <w:r>
         <w:t>4.2 44.1 kHz Broadcast Export</w:t>
       </w:r>
     </w:p>
@@ -2225,9 +2234,25 @@
     </w:p>
     <w:p>
       <w:pPr>
+        <w:spacing w:after="240"/>
+      </w:pPr>
+    </w:p>
+    <w:p>
+      <w:pPr>
+        <w:spacing w:after="240"/>
+      </w:pPr>
+    </w:p>
+    <w:p>
+      <w:pPr>
+        <w:spacing w:after="240"/>
+      </w:pPr>
+    </w:p>
+    <w:p>
+      <w:pPr>
         <w:pStyle w:val="Heading1"/>
       </w:pPr>
       <w:r>
+        <w:lastRenderedPageBreak/>
         <w:t>5. Design Principles</w:t>
       </w:r>
     </w:p>
@@ -2285,7 +2310,6 @@
           <w:b/>
           <w:bCs/>
         </w:rPr>
-        <w:lastRenderedPageBreak/>
         <w:t xml:space="preserve">Model interchangeability: </w:t>
       </w:r>
       <w:r>
@@ -3527,23 +3551,62 @@
           <w:sz w:val="20"/>
           <w:szCs w:val="20"/>
         </w:rPr>
-        <w:t>make stop   # or: pkill -f "uvicorn backend.app"</w:t>
-      </w:r>
-    </w:p>
-    <w:p>
-      <w:pPr>
-        <w:spacing w:after="200"/>
-      </w:pPr>
-    </w:p>
-    <w:p>
-      <w:pPr>
-        <w:pStyle w:val="Heading1"/>
-      </w:pPr>
-    </w:p>
-    <w:p>
-      <w:pPr>
-        <w:pStyle w:val="Heading1"/>
-      </w:pPr>
+        <w:t xml:space="preserve">make stop   # or: </w:t>
+      </w:r>
+      <w:proofErr w:type="spellStart"/>
+      <w:r>
+        <w:rPr>
+          <w:rFonts w:ascii="Courier New" w:eastAsia="Courier New" w:hAnsi="Courier New" w:cs="Courier New"/>
+          <w:sz w:val="20"/>
+          <w:szCs w:val="20"/>
+        </w:rPr>
+        <w:t>pkill</w:t>
+      </w:r>
+      <w:proofErr w:type="spellEnd"/>
+      <w:r>
+        <w:rPr>
+          <w:rFonts w:ascii="Courier New" w:eastAsia="Courier New" w:hAnsi="Courier New" w:cs="Courier New"/>
+          <w:sz w:val="20"/>
+          <w:szCs w:val="20"/>
+        </w:rPr>
+        <w:t xml:space="preserve"> -f "</w:t>
+      </w:r>
+      <w:proofErr w:type="spellStart"/>
+      <w:r>
+        <w:rPr>
+          <w:rFonts w:ascii="Courier New" w:eastAsia="Courier New" w:hAnsi="Courier New" w:cs="Courier New"/>
+          <w:sz w:val="20"/>
+          <w:szCs w:val="20"/>
+        </w:rPr>
+        <w:t>uvicorn</w:t>
+      </w:r>
+      <w:proofErr w:type="spellEnd"/>
+      <w:r>
+        <w:rPr>
+          <w:rFonts w:ascii="Courier New" w:eastAsia="Courier New" w:hAnsi="Courier New" w:cs="Courier New"/>
+          <w:sz w:val="20"/>
+          <w:szCs w:val="20"/>
+        </w:rPr>
+        <w:t xml:space="preserve"> </w:t>
+      </w:r>
+      <w:proofErr w:type="spellStart"/>
+      <w:r>
+        <w:rPr>
+          <w:rFonts w:ascii="Courier New" w:eastAsia="Courier New" w:hAnsi="Courier New" w:cs="Courier New"/>
+          <w:sz w:val="20"/>
+          <w:szCs w:val="20"/>
+        </w:rPr>
+        <w:t>backend.app</w:t>
+      </w:r>
+      <w:proofErr w:type="spellEnd"/>
+      <w:r>
+        <w:rPr>
+          <w:rFonts w:ascii="Courier New" w:eastAsia="Courier New" w:hAnsi="Courier New" w:cs="Courier New"/>
+          <w:sz w:val="20"/>
+          <w:szCs w:val="20"/>
+        </w:rPr>
+        <w:t>"</w:t>
+      </w:r>
     </w:p>
     <w:p>
       <w:pPr>
@@ -6090,7 +6153,121 @@
         <w:pStyle w:val="Heading2"/>
       </w:pPr>
       <w:r>
-        <w:t>11.2 First-Time Setup (macOS and Linux/WSL2)</w:t>
+        <w:t>11.</w:t>
+      </w:r>
+      <w:r>
+        <w:t>2</w:t>
+      </w:r>
+      <w:r>
+        <w:t xml:space="preserve"> </w:t>
+      </w:r>
+      <w:proofErr w:type="spellStart"/>
+      <w:r>
+        <w:t>HuggingFace</w:t>
+      </w:r>
+      <w:proofErr w:type="spellEnd"/>
+      <w:r>
+        <w:t xml:space="preserve"> Token</w:t>
+      </w:r>
+    </w:p>
+    <w:p>
+      <w:pPr>
+        <w:spacing w:after="120"/>
+      </w:pPr>
+      <w:r>
+        <w:t xml:space="preserve">A free read-only token removes download rate limits. Get one at </w:t>
+      </w:r>
+      <w:hyperlink r:id="rId7" w:history="1">
+        <w:r>
+          <w:rPr>
+            <w:rStyle w:val="Hyperlink"/>
+          </w:rPr>
+          <w:t>https://huggingface.co/settings/tokens</w:t>
+        </w:r>
+      </w:hyperlink>
+      <w:r>
+        <w:t xml:space="preserve">  </w:t>
+      </w:r>
+      <w:r>
+        <w:t>and add to .env</w:t>
+      </w:r>
+      <w:r>
+        <w:t xml:space="preserve"> </w:t>
+      </w:r>
+      <w:r>
+        <w:t xml:space="preserve">under </w:t>
+      </w:r>
+      <w:proofErr w:type="spellStart"/>
+      <w:r>
+        <w:rPr>
+          <w:rFonts w:ascii="Courier New" w:eastAsia="Courier New" w:hAnsi="Courier New" w:cs="Courier New"/>
+          <w:sz w:val="20"/>
+          <w:szCs w:val="20"/>
+        </w:rPr>
+        <w:t>tts</w:t>
+      </w:r>
+      <w:proofErr w:type="spellEnd"/>
+      <w:r>
+        <w:rPr>
+          <w:rFonts w:ascii="Courier New" w:eastAsia="Courier New" w:hAnsi="Courier New" w:cs="Courier New"/>
+          <w:sz w:val="20"/>
+          <w:szCs w:val="20"/>
+        </w:rPr>
+        <w:t>-agent</w:t>
+      </w:r>
+      <w:r>
+        <w:t xml:space="preserve"> folder</w:t>
+      </w:r>
+      <w:r>
+        <w:t>:</w:t>
+      </w:r>
+    </w:p>
+    <w:p>
+      <w:pPr>
+        <w:spacing w:after="80"/>
+      </w:pPr>
+    </w:p>
+    <w:p>
+      <w:pPr>
+        <w:shd w:val="clear" w:color="auto" w:fill="F5F5F5"/>
+        <w:ind w:left="360"/>
+      </w:pPr>
+      <w:r>
+        <w:rPr>
+          <w:rFonts w:ascii="Courier New" w:eastAsia="Courier New" w:hAnsi="Courier New" w:cs="Courier New"/>
+          <w:sz w:val="20"/>
+          <w:szCs w:val="20"/>
+        </w:rPr>
+        <w:t>HF_TOKEN=</w:t>
+      </w:r>
+      <w:proofErr w:type="spellStart"/>
+      <w:r>
+        <w:rPr>
+          <w:rFonts w:ascii="Courier New" w:eastAsia="Courier New" w:hAnsi="Courier New" w:cs="Courier New"/>
+          <w:sz w:val="20"/>
+          <w:szCs w:val="20"/>
+        </w:rPr>
+        <w:t>hf_your_token_here</w:t>
+      </w:r>
+      <w:proofErr w:type="spellEnd"/>
+    </w:p>
+    <w:p>
+      <w:pPr>
+        <w:spacing w:after="120"/>
+      </w:pPr>
+    </w:p>
+    <w:p>
+      <w:pPr>
+        <w:pStyle w:val="Heading2"/>
+      </w:pPr>
+      <w:r>
+        <w:t>11.</w:t>
+      </w:r>
+      <w:r>
+        <w:t>3</w:t>
+      </w:r>
+      <w:r>
+        <w:t xml:space="preserve"> First-Time Setup (macOS and Linux/WSL2)</w:t>
       </w:r>
     </w:p>
     <w:p>
@@ -6107,11 +6284,118 @@
       <w:r>
         <w:t xml:space="preserve"> Run setup.sh from the Windows filesystem path (/mnt/c/Users/&lt;you&gt;/...) where GitHub Desktop manages the repo — not from a separate WSL clone at ~/. This keeps git changes in sync automatically.</w:t>
       </w:r>
-    </w:p>
-    <w:p>
-      <w:pPr>
-        <w:spacing w:after="80"/>
-      </w:pPr>
+      <w:r>
+        <w:br/>
+      </w:r>
+    </w:p>
+    <w:p>
+      <w:pPr>
+        <w:shd w:val="clear" w:color="auto" w:fill="F5F5F5"/>
+        <w:ind w:left="360"/>
+        <w:rPr>
+          <w:rFonts w:ascii="Courier New" w:eastAsia="Courier New" w:hAnsi="Courier New" w:cs="Courier New"/>
+          <w:sz w:val="20"/>
+          <w:szCs w:val="20"/>
+        </w:rPr>
+      </w:pPr>
+      <w:r>
+        <w:rPr>
+          <w:rFonts w:ascii="Courier New" w:eastAsia="Courier New" w:hAnsi="Courier New" w:cs="Courier New"/>
+          <w:sz w:val="20"/>
+          <w:szCs w:val="20"/>
+        </w:rPr>
+        <w:t>#Go to the directory “</w:t>
+      </w:r>
+      <w:proofErr w:type="spellStart"/>
+      <w:r>
+        <w:rPr>
+          <w:rFonts w:ascii="Courier New" w:eastAsia="Courier New" w:hAnsi="Courier New" w:cs="Courier New"/>
+          <w:sz w:val="20"/>
+          <w:szCs w:val="20"/>
+        </w:rPr>
+        <w:t>tts</w:t>
+      </w:r>
+      <w:proofErr w:type="spellEnd"/>
+      <w:r>
+        <w:rPr>
+          <w:rFonts w:ascii="Courier New" w:eastAsia="Courier New" w:hAnsi="Courier New" w:cs="Courier New"/>
+          <w:sz w:val="20"/>
+          <w:szCs w:val="20"/>
+        </w:rPr>
+        <w:t>-agent</w:t>
+      </w:r>
+      <w:r>
+        <w:rPr>
+          <w:rFonts w:ascii="Courier New" w:eastAsia="Courier New" w:hAnsi="Courier New" w:cs="Courier New"/>
+          <w:sz w:val="20"/>
+          <w:szCs w:val="20"/>
+        </w:rPr>
+        <w:t>” that has scripts folder underneath</w:t>
+      </w:r>
+    </w:p>
+    <w:p>
+      <w:pPr>
+        <w:shd w:val="clear" w:color="auto" w:fill="F5F5F5"/>
+        <w:ind w:left="360"/>
+        <w:rPr>
+          <w:rFonts w:ascii="Courier New" w:eastAsia="Courier New" w:hAnsi="Courier New" w:cs="Courier New"/>
+          <w:sz w:val="20"/>
+          <w:szCs w:val="20"/>
+        </w:rPr>
+      </w:pPr>
+      <w:r>
+        <w:rPr>
+          <w:rFonts w:ascii="Courier New" w:eastAsia="Courier New" w:hAnsi="Courier New" w:cs="Courier New"/>
+          <w:sz w:val="20"/>
+          <w:szCs w:val="20"/>
+        </w:rPr>
+        <w:t xml:space="preserve">cd </w:t>
+      </w:r>
+      <w:proofErr w:type="spellStart"/>
+      <w:r>
+        <w:rPr>
+          <w:rFonts w:ascii="Courier New" w:eastAsia="Courier New" w:hAnsi="Courier New" w:cs="Courier New"/>
+          <w:sz w:val="20"/>
+          <w:szCs w:val="20"/>
+        </w:rPr>
+        <w:t>tts</w:t>
+      </w:r>
+      <w:proofErr w:type="spellEnd"/>
+      <w:r>
+        <w:rPr>
+          <w:rFonts w:ascii="Courier New" w:eastAsia="Courier New" w:hAnsi="Courier New" w:cs="Courier New"/>
+          <w:sz w:val="20"/>
+          <w:szCs w:val="20"/>
+        </w:rPr>
+        <w:t>-agent</w:t>
+      </w:r>
+      <w:r>
+        <w:rPr>
+          <w:rFonts w:ascii="Courier New" w:eastAsia="Courier New" w:hAnsi="Courier New" w:cs="Courier New"/>
+          <w:sz w:val="20"/>
+          <w:szCs w:val="20"/>
+        </w:rPr>
+        <w:t xml:space="preserve"> </w:t>
+      </w:r>
+    </w:p>
+    <w:p>
+      <w:pPr>
+        <w:shd w:val="clear" w:color="auto" w:fill="F5F5F5"/>
+        <w:ind w:left="360"/>
+        <w:rPr>
+          <w:rFonts w:ascii="Courier New" w:eastAsia="Courier New" w:hAnsi="Courier New" w:cs="Courier New"/>
+          <w:sz w:val="20"/>
+          <w:szCs w:val="20"/>
+        </w:rPr>
+      </w:pPr>
+      <w:r>
+        <w:rPr>
+          <w:rFonts w:ascii="Courier New" w:eastAsia="Courier New" w:hAnsi="Courier New" w:cs="Courier New"/>
+          <w:sz w:val="20"/>
+          <w:szCs w:val="20"/>
+        </w:rPr>
+        <w:t xml:space="preserve"> </w:t>
+      </w:r>
     </w:p>
     <w:p>
       <w:pPr>
@@ -6414,35 +6698,69 @@
     </w:p>
     <w:p>
       <w:pPr>
-        <w:spacing w:after="200"/>
-      </w:pPr>
-    </w:p>
-    <w:p>
-      <w:pPr>
-        <w:spacing w:after="200"/>
-      </w:pPr>
-    </w:p>
-    <w:p>
-      <w:pPr>
-        <w:spacing w:after="200"/>
-      </w:pPr>
-    </w:p>
-    <w:p>
-      <w:pPr>
-        <w:spacing w:after="200"/>
-      </w:pPr>
-    </w:p>
-    <w:p>
-      <w:pPr>
-        <w:spacing w:after="200"/>
-      </w:pPr>
+        <w:spacing w:after="120"/>
+      </w:pPr>
+      <w:r>
+        <w:lastRenderedPageBreak/>
+        <w:t xml:space="preserve">[FYI only: Check supported </w:t>
+      </w:r>
+      <w:proofErr w:type="spellStart"/>
+      <w:r>
+        <w:t>pytorch</w:t>
+      </w:r>
+      <w:proofErr w:type="spellEnd"/>
+      <w:r>
+        <w:t xml:space="preserve"> version here: </w:t>
+      </w:r>
+      <w:r>
+        <w:t>https://pytorch.org/get-started/locally/</w:t>
+      </w:r>
+      <w:r>
+        <w:br/>
+        <w:t xml:space="preserve">in case of </w:t>
+      </w:r>
+      <w:proofErr w:type="spellStart"/>
+      <w:r>
+        <w:t>Pytorch</w:t>
+      </w:r>
+      <w:proofErr w:type="spellEnd"/>
+      <w:r>
+        <w:t xml:space="preserve"> install issues try the correct distribution manually like:</w:t>
+      </w:r>
+      <w:r>
+        <w:br/>
+      </w:r>
+      <w:r>
+        <w:t xml:space="preserve">pip3 install torch torchvision </w:t>
+      </w:r>
+      <w:proofErr w:type="spellStart"/>
+      <w:r>
+        <w:t>torchaudio</w:t>
+      </w:r>
+      <w:proofErr w:type="spellEnd"/>
+      <w:r>
+        <w:t xml:space="preserve"> --index-</w:t>
+      </w:r>
+      <w:proofErr w:type="spellStart"/>
+      <w:r>
+        <w:t>url</w:t>
+      </w:r>
+      <w:proofErr w:type="spellEnd"/>
+      <w:r>
+        <w:t xml:space="preserve"> https://download.pytorch.org/whl/cu128</w:t>
+      </w:r>
+      <w:r>
+        <w:t xml:space="preserve">] </w:t>
+      </w:r>
+      <w:r>
+        <w:br/>
+      </w:r>
     </w:p>
     <w:p>
       <w:pPr>
         <w:pStyle w:val="Heading2"/>
       </w:pPr>
       <w:r>
-        <w:lastRenderedPageBreak/>
         <w:t>11.3 First-Time Setup (Windows Native — PowerShell)</w:t>
       </w:r>
     </w:p>
@@ -6924,20 +7242,17 @@
           <w:sz w:val="20"/>
           <w:szCs w:val="20"/>
         </w:rPr>
+        <w:lastRenderedPageBreak/>
         <w:t>pip install torch torchaudio --index-url https://download.pytorch.org/whl/cu126</w:t>
       </w:r>
     </w:p>
+    <w:p/>
+    <w:p/>
     <w:p>
       <w:pPr>
         <w:pStyle w:val="Heading2"/>
       </w:pPr>
-    </w:p>
-    <w:p>
-      <w:pPr>
-        <w:pStyle w:val="Heading2"/>
-      </w:pPr>
-      <w:r>
-        <w:lastRenderedPageBreak/>
+      <w:r>
         <w:t>11.4 Starting the Server [Post Initial Set Up]</w:t>
       </w:r>
     </w:p>
@@ -7141,11 +7456,7 @@
         <w:t># Open: http://localhost:8000    Stop: Ctrl+C in this terminal</w:t>
       </w:r>
     </w:p>
-    <w:p>
-      <w:pPr>
-        <w:pStyle w:val="Heading2"/>
-      </w:pPr>
-    </w:p>
+    <w:p/>
     <w:p>
       <w:pPr>
         <w:pStyle w:val="Heading2"/>
@@ -7364,48 +7675,15 @@
         <w:pStyle w:val="Heading2"/>
       </w:pPr>
       <w:r>
-        <w:t>11.7 HuggingFace Token</w:t>
-      </w:r>
-    </w:p>
-    <w:p>
-      <w:pPr>
-        <w:spacing w:after="120"/>
-      </w:pPr>
-      <w:r>
-        <w:t>A free read-only token removes download rate limits. Get one at https://huggingface.co/settings/tokens and add to .env:</w:t>
-      </w:r>
-    </w:p>
-    <w:p>
-      <w:pPr>
-        <w:spacing w:after="80"/>
-      </w:pPr>
-    </w:p>
-    <w:p>
-      <w:pPr>
-        <w:shd w:val="clear" w:color="auto" w:fill="F5F5F5"/>
-        <w:ind w:left="360"/>
-      </w:pPr>
-      <w:r>
-        <w:rPr>
-          <w:rFonts w:ascii="Courier New" w:eastAsia="Courier New" w:hAnsi="Courier New" w:cs="Courier New"/>
-          <w:sz w:val="20"/>
-          <w:szCs w:val="20"/>
-        </w:rPr>
-        <w:lastRenderedPageBreak/>
-        <w:t>HF_TOKEN=hf_your_token_here</w:t>
-      </w:r>
-    </w:p>
-    <w:p>
-      <w:pPr>
-        <w:spacing w:after="200"/>
-      </w:pPr>
-    </w:p>
-    <w:p>
-      <w:pPr>
-        <w:pStyle w:val="Heading2"/>
-      </w:pPr>
-      <w:r>
-        <w:t>11.8 Troubleshooting: espeak-ng on macOS</w:t>
+        <w:t xml:space="preserve">11.8 Troubleshooting: </w:t>
+      </w:r>
+      <w:proofErr w:type="spellStart"/>
+      <w:r>
+        <w:t>espeak</w:t>
+      </w:r>
+      <w:proofErr w:type="spellEnd"/>
+      <w:r>
+        <w:t>-ng on macOS</w:t>
       </w:r>
     </w:p>
     <w:p>
@@ -7417,6 +7695,7 @@
           <w:b/>
           <w:bCs/>
         </w:rPr>
+        <w:lastRenderedPageBreak/>
         <w:t>Symptom:</w:t>
       </w:r>
       <w:r>
@@ -8702,11 +8981,6 @@
       <w:pPr>
         <w:spacing w:after="120"/>
       </w:pPr>
-    </w:p>
-    <w:p>
-      <w:pPr>
-        <w:spacing w:after="120"/>
-      </w:pPr>
       <w:r>
         <w:t>For voice cloning (XTTS v2):</w:t>
       </w:r>
@@ -8755,6 +9029,7 @@
           <w:sz w:val="20"/>
           <w:szCs w:val="20"/>
         </w:rPr>
+        <w:lastRenderedPageBreak/>
         <w:t xml:space="preserve">  "voice": "clone:myspeaker",</w:t>
       </w:r>
     </w:p>
@@ -9749,9 +10024,656 @@
     </w:p>
     <w:p>
       <w:pPr>
+        <w:pStyle w:val="Heading1"/>
+      </w:pPr>
+      <w:r>
+        <w:t>15. Project Structure</w:t>
+      </w:r>
+    </w:p>
+    <w:p>
+      <w:pPr>
+        <w:spacing w:after="80"/>
+      </w:pPr>
+    </w:p>
+    <w:p>
+      <w:pPr>
+        <w:shd w:val="clear" w:color="auto" w:fill="F5F5F5"/>
+        <w:ind w:left="360"/>
+      </w:pPr>
+      <w:r>
+        <w:rPr>
+          <w:rFonts w:ascii="Courier New" w:eastAsia="Courier New" w:hAnsi="Courier New" w:cs="Courier New"/>
+          <w:sz w:val="20"/>
+          <w:szCs w:val="20"/>
+        </w:rPr>
+        <w:t>Custom_TTS_Model/</w:t>
+      </w:r>
+    </w:p>
+    <w:p>
+      <w:pPr>
+        <w:shd w:val="clear" w:color="auto" w:fill="F5F5F5"/>
+        <w:ind w:left="360"/>
+      </w:pPr>
+      <w:r>
+        <w:rPr>
+          <w:rFonts w:ascii="Courier New" w:eastAsia="Courier New" w:hAnsi="Courier New" w:cs="Courier New"/>
+          <w:sz w:val="20"/>
+          <w:szCs w:val="20"/>
+        </w:rPr>
+        <w:lastRenderedPageBreak/>
+        <w:t>├── docs/</w:t>
+      </w:r>
+    </w:p>
+    <w:p>
+      <w:pPr>
+        <w:shd w:val="clear" w:color="auto" w:fill="F5F5F5"/>
+        <w:ind w:left="360"/>
+      </w:pPr>
+      <w:r>
+        <w:rPr>
+          <w:rFonts w:ascii="Courier New" w:eastAsia="Courier New" w:hAnsi="Courier New" w:cs="Courier New"/>
+          <w:sz w:val="20"/>
+          <w:szCs w:val="20"/>
+        </w:rPr>
+        <w:t>│   └── TTS_Agent_Solution_Design.docx</w:t>
+      </w:r>
+    </w:p>
+    <w:p>
+      <w:pPr>
+        <w:shd w:val="clear" w:color="auto" w:fill="F5F5F5"/>
+        <w:ind w:left="360"/>
+      </w:pPr>
+      <w:r>
+        <w:rPr>
+          <w:rFonts w:ascii="Courier New" w:eastAsia="Courier New" w:hAnsi="Courier New" w:cs="Courier New"/>
+          <w:sz w:val="20"/>
+          <w:szCs w:val="20"/>
+        </w:rPr>
+        <w:t>└── tts-agent/</w:t>
+      </w:r>
+    </w:p>
+    <w:p>
+      <w:pPr>
+        <w:shd w:val="clear" w:color="auto" w:fill="F5F5F5"/>
+        <w:ind w:left="360"/>
+      </w:pPr>
+      <w:r>
+        <w:rPr>
+          <w:rFonts w:ascii="Courier New" w:eastAsia="Courier New" w:hAnsi="Courier New" w:cs="Courier New"/>
+          <w:sz w:val="20"/>
+          <w:szCs w:val="20"/>
+        </w:rPr>
+        <w:t xml:space="preserve">    ├── backend/</w:t>
+      </w:r>
+    </w:p>
+    <w:p>
+      <w:pPr>
+        <w:shd w:val="clear" w:color="auto" w:fill="F5F5F5"/>
+        <w:ind w:left="360"/>
+      </w:pPr>
+      <w:r>
+        <w:rPr>
+          <w:rFonts w:ascii="Courier New" w:eastAsia="Courier New" w:hAnsi="Courier New" w:cs="Courier New"/>
+          <w:sz w:val="20"/>
+          <w:szCs w:val="20"/>
+        </w:rPr>
+        <w:t xml:space="preserve">    │   ├── app.py                   # FastAPI factory (v3.0.0)</w:t>
+      </w:r>
+    </w:p>
+    <w:p>
+      <w:pPr>
+        <w:shd w:val="clear" w:color="auto" w:fill="F5F5F5"/>
+        <w:ind w:left="360"/>
+      </w:pPr>
+      <w:r>
+        <w:rPr>
+          <w:rFonts w:ascii="Courier New" w:eastAsia="Courier New" w:hAnsi="Courier New" w:cs="Courier New"/>
+          <w:sz w:val="20"/>
+          <w:szCs w:val="20"/>
+        </w:rPr>
+        <w:t xml:space="preserve">    │   ├── api/</w:t>
+      </w:r>
+    </w:p>
+    <w:p>
+      <w:pPr>
+        <w:shd w:val="clear" w:color="auto" w:fill="F5F5F5"/>
+        <w:ind w:left="360"/>
+      </w:pPr>
+      <w:r>
+        <w:rPr>
+          <w:rFonts w:ascii="Courier New" w:eastAsia="Courier New" w:hAnsi="Courier New" w:cs="Courier New"/>
+          <w:sz w:val="20"/>
+          <w:szCs w:val="20"/>
+        </w:rPr>
+        <w:t xml:space="preserve">    │   │   ├── routes.py            # All route handlers</w:t>
+      </w:r>
+    </w:p>
+    <w:p>
+      <w:pPr>
+        <w:shd w:val="clear" w:color="auto" w:fill="F5F5F5"/>
+        <w:ind w:left="360"/>
+      </w:pPr>
+      <w:r>
+        <w:rPr>
+          <w:rFonts w:ascii="Courier New" w:eastAsia="Courier New" w:hAnsi="Courier New" w:cs="Courier New"/>
+          <w:sz w:val="20"/>
+          <w:szCs w:val="20"/>
+        </w:rPr>
+        <w:t xml:space="preserve">    │   │   └── schemas.py           # Pydantic request/response models</w:t>
+      </w:r>
+    </w:p>
+    <w:p>
+      <w:pPr>
+        <w:shd w:val="clear" w:color="auto" w:fill="F5F5F5"/>
+        <w:ind w:left="360"/>
+      </w:pPr>
+      <w:r>
+        <w:rPr>
+          <w:rFonts w:ascii="Courier New" w:eastAsia="Courier New" w:hAnsi="Courier New" w:cs="Courier New"/>
+          <w:sz w:val="20"/>
+          <w:szCs w:val="20"/>
+        </w:rPr>
+        <w:t xml:space="preserve">    │   ├── engines/</w:t>
+      </w:r>
+    </w:p>
+    <w:p>
+      <w:pPr>
+        <w:shd w:val="clear" w:color="auto" w:fill="F5F5F5"/>
+        <w:ind w:left="360"/>
+      </w:pPr>
+      <w:r>
+        <w:rPr>
+          <w:rFonts w:ascii="Courier New" w:eastAsia="Courier New" w:hAnsi="Courier New" w:cs="Courier New"/>
+          <w:sz w:val="20"/>
+          <w:szCs w:val="20"/>
+        </w:rPr>
+        <w:t xml:space="preserve">    │   │   ├── base.py              # Abstract TTSEngine contract</w:t>
+      </w:r>
+    </w:p>
+    <w:p>
+      <w:pPr>
+        <w:shd w:val="clear" w:color="auto" w:fill="F5F5F5"/>
+        <w:ind w:left="360"/>
+      </w:pPr>
+      <w:r>
+        <w:rPr>
+          <w:rFonts w:ascii="Courier New" w:eastAsia="Courier New" w:hAnsi="Courier New" w:cs="Courier New"/>
+          <w:sz w:val="20"/>
+          <w:szCs w:val="20"/>
+        </w:rPr>
+        <w:t xml:space="preserve">    │   │   ├── kokoro_engine.py     # Kokoro-82M wrapper (54 voices, 9 languages)</w:t>
+      </w:r>
+    </w:p>
+    <w:p>
+      <w:pPr>
+        <w:shd w:val="clear" w:color="auto" w:fill="F5F5F5"/>
+        <w:ind w:left="360"/>
+      </w:pPr>
+      <w:r>
+        <w:rPr>
+          <w:rFonts w:ascii="Courier New" w:eastAsia="Courier New" w:hAnsi="Courier New" w:cs="Courier New"/>
+          <w:sz w:val="20"/>
+          <w:szCs w:val="20"/>
+        </w:rPr>
+        <w:t xml:space="preserve">    │   │   └── xtts_engine.py       # XTTS v2 zero-shot cloning wrapper (17 languages)</w:t>
+      </w:r>
+    </w:p>
+    <w:p>
+      <w:pPr>
+        <w:shd w:val="clear" w:color="auto" w:fill="F5F5F5"/>
+        <w:ind w:left="360"/>
+      </w:pPr>
+      <w:r>
+        <w:rPr>
+          <w:rFonts w:ascii="Courier New" w:eastAsia="Courier New" w:hAnsi="Courier New" w:cs="Courier New"/>
+          <w:sz w:val="20"/>
+          <w:szCs w:val="20"/>
+        </w:rPr>
+        <w:t xml:space="preserve">    │   └── utils/</w:t>
+      </w:r>
+    </w:p>
+    <w:p>
+      <w:pPr>
+        <w:shd w:val="clear" w:color="auto" w:fill="F5F5F5"/>
+        <w:ind w:left="360"/>
+      </w:pPr>
+      <w:r>
+        <w:rPr>
+          <w:rFonts w:ascii="Courier New" w:eastAsia="Courier New" w:hAnsi="Courier New" w:cs="Courier New"/>
+          <w:sz w:val="20"/>
+          <w:szCs w:val="20"/>
+        </w:rPr>
+        <w:t xml:space="preserve">    │       ├── audio.py             # Resample, normalise, trim</w:t>
+      </w:r>
+    </w:p>
+    <w:p>
+      <w:pPr>
+        <w:shd w:val="clear" w:color="auto" w:fill="F5F5F5"/>
+        <w:ind w:left="360"/>
+      </w:pPr>
+      <w:r>
+        <w:rPr>
+          <w:rFonts w:ascii="Courier New" w:eastAsia="Courier New" w:hAnsi="Courier New" w:cs="Courier New"/>
+          <w:sz w:val="20"/>
+          <w:szCs w:val="20"/>
+        </w:rPr>
+        <w:t xml:space="preserve">    │       ├── broadcast.py         # EBU R128, noise reduction, EQ, 44.1 kHz</w:t>
+      </w:r>
+    </w:p>
+    <w:p>
+      <w:pPr>
+        <w:shd w:val="clear" w:color="auto" w:fill="F5F5F5"/>
+        <w:ind w:left="360"/>
+      </w:pPr>
+      <w:r>
+        <w:rPr>
+          <w:rFonts w:ascii="Courier New" w:eastAsia="Courier New" w:hAnsi="Courier New" w:cs="Courier New"/>
+          <w:sz w:val="20"/>
+          <w:szCs w:val="20"/>
+        </w:rPr>
+        <w:t xml:space="preserve">    │       ├── ssml.py              # SSML parser</w:t>
+      </w:r>
+    </w:p>
+    <w:p>
+      <w:pPr>
+        <w:shd w:val="clear" w:color="auto" w:fill="F5F5F5"/>
+        <w:ind w:left="360"/>
+      </w:pPr>
+      <w:r>
+        <w:rPr>
+          <w:rFonts w:ascii="Courier New" w:eastAsia="Courier New" w:hAnsi="Courier New" w:cs="Courier New"/>
+          <w:sz w:val="20"/>
+          <w:szCs w:val="20"/>
+        </w:rPr>
+        <w:t xml:space="preserve">    │       ├── batch.py             # Async batch synthesis</w:t>
+      </w:r>
+    </w:p>
+    <w:p>
+      <w:pPr>
+        <w:shd w:val="clear" w:color="auto" w:fill="F5F5F5"/>
+        <w:ind w:left="360"/>
+      </w:pPr>
+      <w:r>
+        <w:rPr>
+          <w:rFonts w:ascii="Courier New" w:eastAsia="Courier New" w:hAnsi="Courier New" w:cs="Courier New"/>
+          <w:sz w:val="20"/>
+          <w:szCs w:val="20"/>
+        </w:rPr>
+        <w:t xml:space="preserve">    │       ├── device.py            # CUDA / MPS / CPU detection</w:t>
+      </w:r>
+    </w:p>
+    <w:p>
+      <w:pPr>
+        <w:shd w:val="clear" w:color="auto" w:fill="F5F5F5"/>
+        <w:ind w:left="360"/>
+      </w:pPr>
+      <w:r>
+        <w:rPr>
+          <w:rFonts w:ascii="Courier New" w:eastAsia="Courier New" w:hAnsi="Courier New" w:cs="Courier New"/>
+          <w:sz w:val="20"/>
+          <w:szCs w:val="20"/>
+        </w:rPr>
+        <w:t xml:space="preserve">    │       └── logger.py</w:t>
+      </w:r>
+    </w:p>
+    <w:p>
+      <w:pPr>
+        <w:shd w:val="clear" w:color="auto" w:fill="F5F5F5"/>
+        <w:ind w:left="360"/>
+      </w:pPr>
+      <w:r>
+        <w:rPr>
+          <w:rFonts w:ascii="Courier New" w:eastAsia="Courier New" w:hAnsi="Courier New" w:cs="Courier New"/>
+          <w:sz w:val="20"/>
+          <w:szCs w:val="20"/>
+        </w:rPr>
+        <w:t xml:space="preserve">    ├── frontend/</w:t>
+      </w:r>
+    </w:p>
+    <w:p>
+      <w:pPr>
+        <w:shd w:val="clear" w:color="auto" w:fill="F5F5F5"/>
+        <w:ind w:left="360"/>
+      </w:pPr>
+      <w:r>
+        <w:rPr>
+          <w:rFonts w:ascii="Courier New" w:eastAsia="Courier New" w:hAnsi="Courier New" w:cs="Courier New"/>
+          <w:sz w:val="20"/>
+          <w:szCs w:val="20"/>
+        </w:rPr>
+        <w:t xml:space="preserve">    │   ├── templates/index.html     # 3-tab browser UI</w:t>
+      </w:r>
+    </w:p>
+    <w:p>
+      <w:pPr>
+        <w:shd w:val="clear" w:color="auto" w:fill="F5F5F5"/>
+        <w:ind w:left="360"/>
+      </w:pPr>
+      <w:r>
+        <w:rPr>
+          <w:rFonts w:ascii="Courier New" w:eastAsia="Courier New" w:hAnsi="Courier New" w:cs="Courier New"/>
+          <w:sz w:val="20"/>
+          <w:szCs w:val="20"/>
+        </w:rPr>
+        <w:t xml:space="preserve">    │   └── static/{css,js}/</w:t>
+      </w:r>
+    </w:p>
+    <w:p>
+      <w:pPr>
+        <w:shd w:val="clear" w:color="auto" w:fill="F5F5F5"/>
+        <w:ind w:left="360"/>
+      </w:pPr>
+      <w:r>
+        <w:rPr>
+          <w:rFonts w:ascii="Courier New" w:eastAsia="Courier New" w:hAnsi="Courier New" w:cs="Courier New"/>
+          <w:sz w:val="20"/>
+          <w:szCs w:val="20"/>
+        </w:rPr>
+        <w:t xml:space="preserve">    ├── configs/settings.py          # Pydantic settings from .env</w:t>
+      </w:r>
+    </w:p>
+    <w:p>
+      <w:pPr>
+        <w:shd w:val="clear" w:color="auto" w:fill="F5F5F5"/>
+        <w:ind w:left="360"/>
+      </w:pPr>
+      <w:r>
+        <w:rPr>
+          <w:rFonts w:ascii="Courier New" w:eastAsia="Courier New" w:hAnsi="Courier New" w:cs="Courier New"/>
+          <w:sz w:val="20"/>
+          <w:szCs w:val="20"/>
+        </w:rPr>
+        <w:t xml:space="preserve">    ├── input_samples/               # Pre-packaged test reference clips (version-controlled)</w:t>
+      </w:r>
+    </w:p>
+    <w:p>
+      <w:pPr>
+        <w:shd w:val="clear" w:color="auto" w:fill="F5F5F5"/>
+        <w:ind w:left="360"/>
+      </w:pPr>
+      <w:r>
+        <w:rPr>
+          <w:rFonts w:ascii="Courier New" w:eastAsia="Courier New" w:hAnsi="Courier New" w:cs="Courier New"/>
+          <w:sz w:val="20"/>
+          <w:szCs w:val="20"/>
+        </w:rPr>
+        <w:t xml:space="preserve">    │   └── README.md</w:t>
+      </w:r>
+    </w:p>
+    <w:p>
+      <w:pPr>
+        <w:shd w:val="clear" w:color="auto" w:fill="F5F5F5"/>
+        <w:ind w:left="360"/>
+      </w:pPr>
+      <w:r>
+        <w:rPr>
+          <w:rFonts w:ascii="Courier New" w:eastAsia="Courier New" w:hAnsi="Courier New" w:cs="Courier New"/>
+          <w:sz w:val="20"/>
+          <w:szCs w:val="20"/>
+        </w:rPr>
+        <w:t xml:space="preserve">    ├── tests/</w:t>
+      </w:r>
+    </w:p>
+    <w:p>
+      <w:pPr>
+        <w:shd w:val="clear" w:color="auto" w:fill="F5F5F5"/>
+        <w:ind w:left="360"/>
+      </w:pPr>
+      <w:r>
+        <w:rPr>
+          <w:rFonts w:ascii="Courier New" w:eastAsia="Courier New" w:hAnsi="Courier New" w:cs="Courier New"/>
+          <w:sz w:val="20"/>
+          <w:szCs w:val="20"/>
+        </w:rPr>
+        <w:t xml:space="preserve">    ├── docker/</w:t>
+      </w:r>
+    </w:p>
+    <w:p>
+      <w:pPr>
+        <w:shd w:val="clear" w:color="auto" w:fill="F5F5F5"/>
+        <w:ind w:left="360"/>
+      </w:pPr>
+      <w:r>
+        <w:rPr>
+          <w:rFonts w:ascii="Courier New" w:eastAsia="Courier New" w:hAnsi="Courier New" w:cs="Courier New"/>
+          <w:sz w:val="20"/>
+          <w:szCs w:val="20"/>
+        </w:rPr>
+        <w:t xml:space="preserve">    ├── scripts/</w:t>
+      </w:r>
+    </w:p>
+    <w:p>
+      <w:pPr>
+        <w:shd w:val="clear" w:color="auto" w:fill="F5F5F5"/>
+        <w:ind w:left="360"/>
+      </w:pPr>
+      <w:r>
+        <w:rPr>
+          <w:rFonts w:ascii="Courier New" w:eastAsia="Courier New" w:hAnsi="Courier New" w:cs="Courier New"/>
+          <w:sz w:val="20"/>
+          <w:szCs w:val="20"/>
+        </w:rPr>
+        <w:t xml:space="preserve">    │   ├── setup.sh                 # One-command setup (macOS / Linux / WSL2)</w:t>
+      </w:r>
+    </w:p>
+    <w:p>
+      <w:pPr>
+        <w:shd w:val="clear" w:color="auto" w:fill="F5F5F5"/>
+        <w:ind w:left="360"/>
+      </w:pPr>
+      <w:r>
+        <w:rPr>
+          <w:rFonts w:ascii="Courier New" w:eastAsia="Courier New" w:hAnsi="Courier New" w:cs="Courier New"/>
+          <w:sz w:val="20"/>
+          <w:szCs w:val="20"/>
+        </w:rPr>
+        <w:t xml:space="preserve">    │   ├── setup.bat                # One-command setup (Windows native)</w:t>
+      </w:r>
+    </w:p>
+    <w:p>
+      <w:pPr>
+        <w:shd w:val="clear" w:color="auto" w:fill="F5F5F5"/>
+        <w:ind w:left="360"/>
+      </w:pPr>
+      <w:r>
+        <w:rPr>
+          <w:rFonts w:ascii="Courier New" w:eastAsia="Courier New" w:hAnsi="Courier New" w:cs="Courier New"/>
+          <w:sz w:val="20"/>
+          <w:szCs w:val="20"/>
+        </w:rPr>
+        <w:t xml:space="preserve">    │   └── download_models.py       # Pre-download model weights</w:t>
+      </w:r>
+    </w:p>
+    <w:p>
+      <w:pPr>
+        <w:shd w:val="clear" w:color="auto" w:fill="F5F5F5"/>
+        <w:ind w:left="360"/>
+      </w:pPr>
+      <w:r>
+        <w:rPr>
+          <w:rFonts w:ascii="Courier New" w:eastAsia="Courier New" w:hAnsi="Courier New" w:cs="Courier New"/>
+          <w:sz w:val="20"/>
+          <w:szCs w:val="20"/>
+        </w:rPr>
+        <w:t xml:space="preserve">    ├── Makefile</w:t>
+      </w:r>
+    </w:p>
+    <w:p>
+      <w:pPr>
+        <w:shd w:val="clear" w:color="auto" w:fill="F5F5F5"/>
+        <w:ind w:left="360"/>
+      </w:pPr>
+      <w:r>
+        <w:rPr>
+          <w:rFonts w:ascii="Courier New" w:eastAsia="Courier New" w:hAnsi="Courier New" w:cs="Courier New"/>
+          <w:sz w:val="20"/>
+          <w:szCs w:val="20"/>
+        </w:rPr>
+        <w:t xml:space="preserve">    ├── requirements.txt</w:t>
+      </w:r>
+    </w:p>
+    <w:p>
+      <w:pPr>
+        <w:shd w:val="clear" w:color="auto" w:fill="F5F5F5"/>
+        <w:ind w:left="360"/>
+      </w:pPr>
+      <w:r>
+        <w:rPr>
+          <w:rFonts w:ascii="Courier New" w:eastAsia="Courier New" w:hAnsi="Courier New" w:cs="Courier New"/>
+          <w:sz w:val="20"/>
+          <w:szCs w:val="20"/>
+        </w:rPr>
+        <w:t xml:space="preserve">    └── .env.example</w:t>
+      </w:r>
+    </w:p>
+    <w:p>
+      <w:pPr>
         <w:spacing w:after="200"/>
       </w:pPr>
     </w:p>
+    <w:p/>
+    <w:p/>
+    <w:p/>
+    <w:p/>
+    <w:p/>
+    <w:p/>
+    <w:p/>
+    <w:p/>
+    <w:p/>
+    <w:p/>
+    <w:p>
+      <w:pPr>
+        <w:pStyle w:val="Heading1"/>
+      </w:pPr>
+      <w:r>
+        <w:t>16. Key Configuration</w:t>
+      </w:r>
+    </w:p>
+    <w:p>
+      <w:pPr>
+        <w:spacing w:after="120"/>
+      </w:pPr>
+      <w:r>
+        <w:t>All settings override-able via environment variables or .env file:</w:t>
+      </w:r>
+    </w:p>
+    <w:p>
+      <w:pPr>
+        <w:spacing w:after="80"/>
+      </w:pPr>
+    </w:p>
+    <w:p>
+      <w:pPr>
+        <w:shd w:val="clear" w:color="auto" w:fill="F5F5F5"/>
+        <w:ind w:left="360"/>
+      </w:pPr>
+      <w:r>
+        <w:rPr>
+          <w:rFonts w:ascii="Courier New" w:eastAsia="Courier New" w:hAnsi="Courier New" w:cs="Courier New"/>
+          <w:sz w:val="20"/>
+          <w:szCs w:val="20"/>
+        </w:rPr>
+        <w:t>HF_TOKEN=hf_xxx                    # HuggingFace token (optional, removes rate limits)</w:t>
+      </w:r>
+    </w:p>
+    <w:p>
+      <w:pPr>
+        <w:shd w:val="clear" w:color="auto" w:fill="F5F5F5"/>
+        <w:ind w:left="360"/>
+      </w:pPr>
+      <w:r>
+        <w:rPr>
+          <w:rFonts w:ascii="Courier New" w:eastAsia="Courier New" w:hAnsi="Courier New" w:cs="Courier New"/>
+          <w:sz w:val="20"/>
+          <w:szCs w:val="20"/>
+        </w:rPr>
+        <w:t>DEVICE=auto                        # auto | cuda | mps | cpu</w:t>
+      </w:r>
+    </w:p>
+    <w:p>
+      <w:pPr>
+        <w:shd w:val="clear" w:color="auto" w:fill="F5F5F5"/>
+        <w:ind w:left="360"/>
+      </w:pPr>
+      <w:r>
+        <w:rPr>
+          <w:rFonts w:ascii="Courier New" w:eastAsia="Courier New" w:hAnsi="Courier New" w:cs="Courier New"/>
+          <w:sz w:val="20"/>
+          <w:szCs w:val="20"/>
+        </w:rPr>
+        <w:t>XTTS_MODEL_NAME=tts_models/multilingual/multi-dataset/xtts_v2</w:t>
+      </w:r>
+    </w:p>
+    <w:p>
+      <w:pPr>
+        <w:shd w:val="clear" w:color="auto" w:fill="F5F5F5"/>
+        <w:ind w:left="360"/>
+      </w:pPr>
+      <w:r>
+        <w:rPr>
+          <w:rFonts w:ascii="Courier New" w:eastAsia="Courier New" w:hAnsi="Courier New" w:cs="Courier New"/>
+          <w:sz w:val="20"/>
+          <w:szCs w:val="20"/>
+        </w:rPr>
+        <w:t>TARGET_SAMPLE_RATE=24000</w:t>
+      </w:r>
+    </w:p>
+    <w:p>
+      <w:pPr>
+        <w:shd w:val="clear" w:color="auto" w:fill="F5F5F5"/>
+        <w:ind w:left="360"/>
+      </w:pPr>
+      <w:r>
+        <w:rPr>
+          <w:rFonts w:ascii="Courier New" w:eastAsia="Courier New" w:hAnsi="Courier New" w:cs="Courier New"/>
+          <w:sz w:val="20"/>
+          <w:szCs w:val="20"/>
+        </w:rPr>
+        <w:t>TARGET_LOUDNESS_DB=-20.0</w:t>
+      </w:r>
+    </w:p>
+    <w:p>
+      <w:pPr>
+        <w:shd w:val="clear" w:color="auto" w:fill="F5F5F5"/>
+        <w:ind w:left="360"/>
+      </w:pPr>
+      <w:r>
+        <w:rPr>
+          <w:rFonts w:ascii="Courier New" w:eastAsia="Courier New" w:hAnsi="Courier New" w:cs="Courier New"/>
+          <w:sz w:val="20"/>
+          <w:szCs w:val="20"/>
+        </w:rPr>
+        <w:t>HOST=0.0.0.0</w:t>
+      </w:r>
+    </w:p>
+    <w:p>
+      <w:pPr>
+        <w:shd w:val="clear" w:color="auto" w:fill="F5F5F5"/>
+        <w:ind w:left="360"/>
+      </w:pPr>
+      <w:r>
+        <w:rPr>
+          <w:rFonts w:ascii="Courier New" w:eastAsia="Courier New" w:hAnsi="Courier New" w:cs="Courier New"/>
+          <w:sz w:val="20"/>
+          <w:szCs w:val="20"/>
+        </w:rPr>
+        <w:t>PORT=8000</w:t>
+      </w:r>
+    </w:p>
+    <w:p>
+      <w:pPr>
+        <w:shd w:val="clear" w:color="auto" w:fill="F5F5F5"/>
+        <w:ind w:left="360"/>
+      </w:pPr>
+      <w:r>
+        <w:rPr>
+          <w:rFonts w:ascii="Courier New" w:eastAsia="Courier New" w:hAnsi="Courier New" w:cs="Courier New"/>
+          <w:sz w:val="20"/>
+          <w:szCs w:val="20"/>
+        </w:rPr>
+        <w:t>LOG_LEVEL=info</w:t>
+      </w:r>
+    </w:p>
     <w:p>
       <w:pPr>
         <w:spacing w:after="200"/>
@@ -9759,543 +10681,10 @@
     </w:p>
     <w:p>
       <w:pPr>
-        <w:spacing w:after="200"/>
-      </w:pPr>
-    </w:p>
-    <w:p>
-      <w:pPr>
         <w:pStyle w:val="Heading1"/>
       </w:pPr>
       <w:r>
-        <w:t>15. Project Structure</w:t>
-      </w:r>
-    </w:p>
-    <w:p>
-      <w:pPr>
-        <w:spacing w:after="80"/>
-      </w:pPr>
-    </w:p>
-    <w:p>
-      <w:pPr>
-        <w:shd w:val="clear" w:color="auto" w:fill="F5F5F5"/>
-        <w:ind w:left="360"/>
-      </w:pPr>
-      <w:r>
-        <w:rPr>
-          <w:rFonts w:ascii="Courier New" w:eastAsia="Courier New" w:hAnsi="Courier New" w:cs="Courier New"/>
-          <w:sz w:val="20"/>
-          <w:szCs w:val="20"/>
-        </w:rPr>
-        <w:t>Custom_TTS_Model/</w:t>
-      </w:r>
-    </w:p>
-    <w:p>
-      <w:pPr>
-        <w:shd w:val="clear" w:color="auto" w:fill="F5F5F5"/>
-        <w:ind w:left="360"/>
-      </w:pPr>
-      <w:r>
-        <w:rPr>
-          <w:rFonts w:ascii="Courier New" w:eastAsia="Courier New" w:hAnsi="Courier New" w:cs="Courier New"/>
-          <w:sz w:val="20"/>
-          <w:szCs w:val="20"/>
-        </w:rPr>
-        <w:t>├── docs/</w:t>
-      </w:r>
-    </w:p>
-    <w:p>
-      <w:pPr>
-        <w:shd w:val="clear" w:color="auto" w:fill="F5F5F5"/>
-        <w:ind w:left="360"/>
-      </w:pPr>
-      <w:r>
-        <w:rPr>
-          <w:rFonts w:ascii="Courier New" w:eastAsia="Courier New" w:hAnsi="Courier New" w:cs="Courier New"/>
-          <w:sz w:val="20"/>
-          <w:szCs w:val="20"/>
-        </w:rPr>
-        <w:t>│   └── TTS_Agent_Solution_Design.docx</w:t>
-      </w:r>
-    </w:p>
-    <w:p>
-      <w:pPr>
-        <w:shd w:val="clear" w:color="auto" w:fill="F5F5F5"/>
-        <w:ind w:left="360"/>
-      </w:pPr>
-      <w:r>
-        <w:rPr>
-          <w:rFonts w:ascii="Courier New" w:eastAsia="Courier New" w:hAnsi="Courier New" w:cs="Courier New"/>
-          <w:sz w:val="20"/>
-          <w:szCs w:val="20"/>
-        </w:rPr>
-        <w:t>└── tts-agent/</w:t>
-      </w:r>
-    </w:p>
-    <w:p>
-      <w:pPr>
-        <w:shd w:val="clear" w:color="auto" w:fill="F5F5F5"/>
-        <w:ind w:left="360"/>
-      </w:pPr>
-      <w:r>
-        <w:rPr>
-          <w:rFonts w:ascii="Courier New" w:eastAsia="Courier New" w:hAnsi="Courier New" w:cs="Courier New"/>
-          <w:sz w:val="20"/>
-          <w:szCs w:val="20"/>
-        </w:rPr>
-        <w:t xml:space="preserve">    ├── backend/</w:t>
-      </w:r>
-    </w:p>
-    <w:p>
-      <w:pPr>
-        <w:shd w:val="clear" w:color="auto" w:fill="F5F5F5"/>
-        <w:ind w:left="360"/>
-      </w:pPr>
-      <w:r>
-        <w:rPr>
-          <w:rFonts w:ascii="Courier New" w:eastAsia="Courier New" w:hAnsi="Courier New" w:cs="Courier New"/>
-          <w:sz w:val="20"/>
-          <w:szCs w:val="20"/>
-        </w:rPr>
-        <w:t xml:space="preserve">    │   ├── app.py                   # FastAPI factory (v3.0.0)</w:t>
-      </w:r>
-    </w:p>
-    <w:p>
-      <w:pPr>
-        <w:shd w:val="clear" w:color="auto" w:fill="F5F5F5"/>
-        <w:ind w:left="360"/>
-      </w:pPr>
-      <w:r>
-        <w:rPr>
-          <w:rFonts w:ascii="Courier New" w:eastAsia="Courier New" w:hAnsi="Courier New" w:cs="Courier New"/>
-          <w:sz w:val="20"/>
-          <w:szCs w:val="20"/>
-        </w:rPr>
-        <w:t xml:space="preserve">    │   ├── api/</w:t>
-      </w:r>
-    </w:p>
-    <w:p>
-      <w:pPr>
-        <w:shd w:val="clear" w:color="auto" w:fill="F5F5F5"/>
-        <w:ind w:left="360"/>
-      </w:pPr>
-      <w:r>
-        <w:rPr>
-          <w:rFonts w:ascii="Courier New" w:eastAsia="Courier New" w:hAnsi="Courier New" w:cs="Courier New"/>
-          <w:sz w:val="20"/>
-          <w:szCs w:val="20"/>
-        </w:rPr>
-        <w:t xml:space="preserve">    │   │   ├── routes.py            # All route handlers</w:t>
-      </w:r>
-    </w:p>
-    <w:p>
-      <w:pPr>
-        <w:shd w:val="clear" w:color="auto" w:fill="F5F5F5"/>
-        <w:ind w:left="360"/>
-      </w:pPr>
-      <w:r>
-        <w:rPr>
-          <w:rFonts w:ascii="Courier New" w:eastAsia="Courier New" w:hAnsi="Courier New" w:cs="Courier New"/>
-          <w:sz w:val="20"/>
-          <w:szCs w:val="20"/>
-        </w:rPr>
-        <w:t xml:space="preserve">    │   │   └── schemas.py           # Pydantic request/response models</w:t>
-      </w:r>
-    </w:p>
-    <w:p>
-      <w:pPr>
-        <w:shd w:val="clear" w:color="auto" w:fill="F5F5F5"/>
-        <w:ind w:left="360"/>
-      </w:pPr>
-      <w:r>
-        <w:rPr>
-          <w:rFonts w:ascii="Courier New" w:eastAsia="Courier New" w:hAnsi="Courier New" w:cs="Courier New"/>
-          <w:sz w:val="20"/>
-          <w:szCs w:val="20"/>
-        </w:rPr>
-        <w:t xml:space="preserve">    │   ├── engines/</w:t>
-      </w:r>
-    </w:p>
-    <w:p>
-      <w:pPr>
-        <w:shd w:val="clear" w:color="auto" w:fill="F5F5F5"/>
-        <w:ind w:left="360"/>
-      </w:pPr>
-      <w:r>
-        <w:rPr>
-          <w:rFonts w:ascii="Courier New" w:eastAsia="Courier New" w:hAnsi="Courier New" w:cs="Courier New"/>
-          <w:sz w:val="20"/>
-          <w:szCs w:val="20"/>
-        </w:rPr>
-        <w:t xml:space="preserve">    │   │   ├── base.py              # Abstract TTSEngine contract</w:t>
-      </w:r>
-    </w:p>
-    <w:p>
-      <w:pPr>
-        <w:shd w:val="clear" w:color="auto" w:fill="F5F5F5"/>
-        <w:ind w:left="360"/>
-      </w:pPr>
-      <w:r>
-        <w:rPr>
-          <w:rFonts w:ascii="Courier New" w:eastAsia="Courier New" w:hAnsi="Courier New" w:cs="Courier New"/>
-          <w:sz w:val="20"/>
-          <w:szCs w:val="20"/>
-        </w:rPr>
-        <w:t xml:space="preserve">    │   │   ├── kokoro_engine.py     # Kokoro-82M wrapper (54 voices, 9 languages)</w:t>
-      </w:r>
-    </w:p>
-    <w:p>
-      <w:pPr>
-        <w:shd w:val="clear" w:color="auto" w:fill="F5F5F5"/>
-        <w:ind w:left="360"/>
-      </w:pPr>
-      <w:r>
-        <w:rPr>
-          <w:rFonts w:ascii="Courier New" w:eastAsia="Courier New" w:hAnsi="Courier New" w:cs="Courier New"/>
-          <w:sz w:val="20"/>
-          <w:szCs w:val="20"/>
-        </w:rPr>
-        <w:t xml:space="preserve">    │   │   └── xtts_engine.py       # XTTS v2 zero-shot cloning wrapper (17 languages)</w:t>
-      </w:r>
-    </w:p>
-    <w:p>
-      <w:pPr>
-        <w:shd w:val="clear" w:color="auto" w:fill="F5F5F5"/>
-        <w:ind w:left="360"/>
-      </w:pPr>
-      <w:r>
-        <w:rPr>
-          <w:rFonts w:ascii="Courier New" w:eastAsia="Courier New" w:hAnsi="Courier New" w:cs="Courier New"/>
-          <w:sz w:val="20"/>
-          <w:szCs w:val="20"/>
-        </w:rPr>
-        <w:t xml:space="preserve">    │   └── utils/</w:t>
-      </w:r>
-    </w:p>
-    <w:p>
-      <w:pPr>
-        <w:shd w:val="clear" w:color="auto" w:fill="F5F5F5"/>
-        <w:ind w:left="360"/>
-      </w:pPr>
-      <w:r>
-        <w:rPr>
-          <w:rFonts w:ascii="Courier New" w:eastAsia="Courier New" w:hAnsi="Courier New" w:cs="Courier New"/>
-          <w:sz w:val="20"/>
-          <w:szCs w:val="20"/>
-        </w:rPr>
-        <w:t xml:space="preserve">    │       ├── audio.py             # Resample, normalise, trim</w:t>
-      </w:r>
-    </w:p>
-    <w:p>
-      <w:pPr>
-        <w:shd w:val="clear" w:color="auto" w:fill="F5F5F5"/>
-        <w:ind w:left="360"/>
-      </w:pPr>
-      <w:r>
-        <w:rPr>
-          <w:rFonts w:ascii="Courier New" w:eastAsia="Courier New" w:hAnsi="Courier New" w:cs="Courier New"/>
-          <w:sz w:val="20"/>
-          <w:szCs w:val="20"/>
-        </w:rPr>
-        <w:t xml:space="preserve">    │       ├── broadcast.py         # EBU R128, noise reduction, EQ, 44.1 kHz</w:t>
-      </w:r>
-    </w:p>
-    <w:p>
-      <w:pPr>
-        <w:shd w:val="clear" w:color="auto" w:fill="F5F5F5"/>
-        <w:ind w:left="360"/>
-      </w:pPr>
-      <w:r>
-        <w:rPr>
-          <w:rFonts w:ascii="Courier New" w:eastAsia="Courier New" w:hAnsi="Courier New" w:cs="Courier New"/>
-          <w:sz w:val="20"/>
-          <w:szCs w:val="20"/>
-        </w:rPr>
-        <w:t xml:space="preserve">    │       ├── ssml.py              # SSML parser</w:t>
-      </w:r>
-    </w:p>
-    <w:p>
-      <w:pPr>
-        <w:shd w:val="clear" w:color="auto" w:fill="F5F5F5"/>
-        <w:ind w:left="360"/>
-      </w:pPr>
-      <w:r>
-        <w:rPr>
-          <w:rFonts w:ascii="Courier New" w:eastAsia="Courier New" w:hAnsi="Courier New" w:cs="Courier New"/>
-          <w:sz w:val="20"/>
-          <w:szCs w:val="20"/>
-        </w:rPr>
-        <w:t xml:space="preserve">    │       ├── batch.py             # Async batch synthesis</w:t>
-      </w:r>
-    </w:p>
-    <w:p>
-      <w:pPr>
-        <w:shd w:val="clear" w:color="auto" w:fill="F5F5F5"/>
-        <w:ind w:left="360"/>
-      </w:pPr>
-      <w:r>
-        <w:rPr>
-          <w:rFonts w:ascii="Courier New" w:eastAsia="Courier New" w:hAnsi="Courier New" w:cs="Courier New"/>
-          <w:sz w:val="20"/>
-          <w:szCs w:val="20"/>
-        </w:rPr>
-        <w:t xml:space="preserve">    │       ├── device.py            # CUDA / MPS / CPU detection</w:t>
-      </w:r>
-    </w:p>
-    <w:p>
-      <w:pPr>
-        <w:shd w:val="clear" w:color="auto" w:fill="F5F5F5"/>
-        <w:ind w:left="360"/>
-      </w:pPr>
-      <w:r>
-        <w:rPr>
-          <w:rFonts w:ascii="Courier New" w:eastAsia="Courier New" w:hAnsi="Courier New" w:cs="Courier New"/>
-          <w:sz w:val="20"/>
-          <w:szCs w:val="20"/>
-        </w:rPr>
-        <w:t xml:space="preserve">    │       └── logger.py</w:t>
-      </w:r>
-    </w:p>
-    <w:p>
-      <w:pPr>
-        <w:shd w:val="clear" w:color="auto" w:fill="F5F5F5"/>
-        <w:ind w:left="360"/>
-      </w:pPr>
-      <w:r>
-        <w:rPr>
-          <w:rFonts w:ascii="Courier New" w:eastAsia="Courier New" w:hAnsi="Courier New" w:cs="Courier New"/>
-          <w:sz w:val="20"/>
-          <w:szCs w:val="20"/>
-        </w:rPr>
-        <w:t xml:space="preserve">    ├── frontend/</w:t>
-      </w:r>
-    </w:p>
-    <w:p>
-      <w:pPr>
-        <w:shd w:val="clear" w:color="auto" w:fill="F5F5F5"/>
-        <w:ind w:left="360"/>
-      </w:pPr>
-      <w:r>
-        <w:rPr>
-          <w:rFonts w:ascii="Courier New" w:eastAsia="Courier New" w:hAnsi="Courier New" w:cs="Courier New"/>
-          <w:sz w:val="20"/>
-          <w:szCs w:val="20"/>
-        </w:rPr>
-        <w:t xml:space="preserve">    │   ├── templates/index.html     # 3-tab browser UI</w:t>
-      </w:r>
-    </w:p>
-    <w:p>
-      <w:pPr>
-        <w:shd w:val="clear" w:color="auto" w:fill="F5F5F5"/>
-        <w:ind w:left="360"/>
-      </w:pPr>
-      <w:r>
-        <w:rPr>
-          <w:rFonts w:ascii="Courier New" w:eastAsia="Courier New" w:hAnsi="Courier New" w:cs="Courier New"/>
-          <w:sz w:val="20"/>
-          <w:szCs w:val="20"/>
-        </w:rPr>
-        <w:t xml:space="preserve">    │   └── static/{css,js}/</w:t>
-      </w:r>
-    </w:p>
-    <w:p>
-      <w:pPr>
-        <w:shd w:val="clear" w:color="auto" w:fill="F5F5F5"/>
-        <w:ind w:left="360"/>
-      </w:pPr>
-      <w:r>
-        <w:rPr>
-          <w:rFonts w:ascii="Courier New" w:eastAsia="Courier New" w:hAnsi="Courier New" w:cs="Courier New"/>
-          <w:sz w:val="20"/>
-          <w:szCs w:val="20"/>
-        </w:rPr>
-        <w:t xml:space="preserve">    ├── configs/settings.py          # Pydantic settings from .env</w:t>
-      </w:r>
-    </w:p>
-    <w:p>
-      <w:pPr>
-        <w:shd w:val="clear" w:color="auto" w:fill="F5F5F5"/>
-        <w:ind w:left="360"/>
-      </w:pPr>
-      <w:r>
-        <w:rPr>
-          <w:rFonts w:ascii="Courier New" w:eastAsia="Courier New" w:hAnsi="Courier New" w:cs="Courier New"/>
-          <w:sz w:val="20"/>
-          <w:szCs w:val="20"/>
-        </w:rPr>
-        <w:t xml:space="preserve">    ├── input_samples/               # Pre-packaged test reference clips (version-controlled)</w:t>
-      </w:r>
-    </w:p>
-    <w:p>
-      <w:pPr>
-        <w:shd w:val="clear" w:color="auto" w:fill="F5F5F5"/>
-        <w:ind w:left="360"/>
-      </w:pPr>
-      <w:r>
-        <w:rPr>
-          <w:rFonts w:ascii="Courier New" w:eastAsia="Courier New" w:hAnsi="Courier New" w:cs="Courier New"/>
-          <w:sz w:val="20"/>
-          <w:szCs w:val="20"/>
-        </w:rPr>
-        <w:t xml:space="preserve">    │   └── README.md</w:t>
-      </w:r>
-    </w:p>
-    <w:p>
-      <w:pPr>
-        <w:shd w:val="clear" w:color="auto" w:fill="F5F5F5"/>
-        <w:ind w:left="360"/>
-      </w:pPr>
-      <w:r>
-        <w:rPr>
-          <w:rFonts w:ascii="Courier New" w:eastAsia="Courier New" w:hAnsi="Courier New" w:cs="Courier New"/>
-          <w:sz w:val="20"/>
-          <w:szCs w:val="20"/>
-        </w:rPr>
-        <w:t xml:space="preserve">    ├── tests/</w:t>
-      </w:r>
-    </w:p>
-    <w:p>
-      <w:pPr>
-        <w:shd w:val="clear" w:color="auto" w:fill="F5F5F5"/>
-        <w:ind w:left="360"/>
-      </w:pPr>
-      <w:r>
-        <w:rPr>
-          <w:rFonts w:ascii="Courier New" w:eastAsia="Courier New" w:hAnsi="Courier New" w:cs="Courier New"/>
-          <w:sz w:val="20"/>
-          <w:szCs w:val="20"/>
-        </w:rPr>
-        <w:t xml:space="preserve">    ├── docker/</w:t>
-      </w:r>
-    </w:p>
-    <w:p>
-      <w:pPr>
-        <w:shd w:val="clear" w:color="auto" w:fill="F5F5F5"/>
-        <w:ind w:left="360"/>
-      </w:pPr>
-      <w:r>
-        <w:rPr>
-          <w:rFonts w:ascii="Courier New" w:eastAsia="Courier New" w:hAnsi="Courier New" w:cs="Courier New"/>
-          <w:sz w:val="20"/>
-          <w:szCs w:val="20"/>
-        </w:rPr>
-        <w:t xml:space="preserve">    ├── scripts/</w:t>
-      </w:r>
-    </w:p>
-    <w:p>
-      <w:pPr>
-        <w:shd w:val="clear" w:color="auto" w:fill="F5F5F5"/>
-        <w:ind w:left="360"/>
-      </w:pPr>
-      <w:r>
-        <w:rPr>
-          <w:rFonts w:ascii="Courier New" w:eastAsia="Courier New" w:hAnsi="Courier New" w:cs="Courier New"/>
-          <w:sz w:val="20"/>
-          <w:szCs w:val="20"/>
-        </w:rPr>
-        <w:t xml:space="preserve">    │   ├── setup.sh                 # One-command setup (macOS / Linux / WSL2)</w:t>
-      </w:r>
-    </w:p>
-    <w:p>
-      <w:pPr>
-        <w:shd w:val="clear" w:color="auto" w:fill="F5F5F5"/>
-        <w:ind w:left="360"/>
-      </w:pPr>
-      <w:r>
-        <w:rPr>
-          <w:rFonts w:ascii="Courier New" w:eastAsia="Courier New" w:hAnsi="Courier New" w:cs="Courier New"/>
-          <w:sz w:val="20"/>
-          <w:szCs w:val="20"/>
-        </w:rPr>
-        <w:t xml:space="preserve">    │   ├── setup.bat                # One-command setup (Windows native)</w:t>
-      </w:r>
-    </w:p>
-    <w:p>
-      <w:pPr>
-        <w:shd w:val="clear" w:color="auto" w:fill="F5F5F5"/>
-        <w:ind w:left="360"/>
-      </w:pPr>
-      <w:r>
-        <w:rPr>
-          <w:rFonts w:ascii="Courier New" w:eastAsia="Courier New" w:hAnsi="Courier New" w:cs="Courier New"/>
-          <w:sz w:val="20"/>
-          <w:szCs w:val="20"/>
-        </w:rPr>
-        <w:t xml:space="preserve">    │   └── download_models.py       # Pre-download model weights</w:t>
-      </w:r>
-    </w:p>
-    <w:p>
-      <w:pPr>
-        <w:shd w:val="clear" w:color="auto" w:fill="F5F5F5"/>
-        <w:ind w:left="360"/>
-      </w:pPr>
-      <w:r>
-        <w:rPr>
-          <w:rFonts w:ascii="Courier New" w:eastAsia="Courier New" w:hAnsi="Courier New" w:cs="Courier New"/>
-          <w:sz w:val="20"/>
-          <w:szCs w:val="20"/>
-        </w:rPr>
-        <w:t xml:space="preserve">    ├── Makefile</w:t>
-      </w:r>
-    </w:p>
-    <w:p>
-      <w:pPr>
-        <w:shd w:val="clear" w:color="auto" w:fill="F5F5F5"/>
-        <w:ind w:left="360"/>
-      </w:pPr>
-      <w:r>
-        <w:rPr>
-          <w:rFonts w:ascii="Courier New" w:eastAsia="Courier New" w:hAnsi="Courier New" w:cs="Courier New"/>
-          <w:sz w:val="20"/>
-          <w:szCs w:val="20"/>
-        </w:rPr>
-        <w:t xml:space="preserve">    ├── requirements.txt</w:t>
-      </w:r>
-    </w:p>
-    <w:p>
-      <w:pPr>
-        <w:shd w:val="clear" w:color="auto" w:fill="F5F5F5"/>
-        <w:ind w:left="360"/>
-      </w:pPr>
-      <w:r>
-        <w:rPr>
-          <w:rFonts w:ascii="Courier New" w:eastAsia="Courier New" w:hAnsi="Courier New" w:cs="Courier New"/>
-          <w:sz w:val="20"/>
-          <w:szCs w:val="20"/>
-        </w:rPr>
-        <w:t xml:space="preserve">    └── .env.example</w:t>
-      </w:r>
-    </w:p>
-    <w:p>
-      <w:pPr>
-        <w:spacing w:after="200"/>
-      </w:pPr>
-    </w:p>
-    <w:p>
-      <w:pPr>
-        <w:pStyle w:val="Heading1"/>
-      </w:pPr>
-    </w:p>
-    <w:p>
-      <w:pPr>
-        <w:pStyle w:val="Heading1"/>
-      </w:pPr>
-    </w:p>
-    <w:p>
-      <w:pPr>
-        <w:pStyle w:val="Heading1"/>
-      </w:pPr>
-    </w:p>
-    <w:p>
-      <w:pPr>
-        <w:pStyle w:val="Heading1"/>
-      </w:pPr>
-    </w:p>
-    <w:p>
-      <w:pPr>
-        <w:pStyle w:val="Heading1"/>
-      </w:pPr>
-      <w:r>
-        <w:t>16. Key Configuration</w:t>
+        <w:t>17. Conclusion</w:t>
       </w:r>
     </w:p>
     <w:p>
@@ -10303,137 +10692,7 @@
         <w:spacing w:after="120"/>
       </w:pPr>
       <w:r>
-        <w:t>All settings override-able via environment variables or .env file:</w:t>
-      </w:r>
-    </w:p>
-    <w:p>
-      <w:pPr>
-        <w:spacing w:after="80"/>
-      </w:pPr>
-    </w:p>
-    <w:p>
-      <w:pPr>
-        <w:shd w:val="clear" w:color="auto" w:fill="F5F5F5"/>
-        <w:ind w:left="360"/>
-      </w:pPr>
-      <w:r>
-        <w:rPr>
-          <w:rFonts w:ascii="Courier New" w:eastAsia="Courier New" w:hAnsi="Courier New" w:cs="Courier New"/>
-          <w:sz w:val="20"/>
-          <w:szCs w:val="20"/>
-        </w:rPr>
-        <w:t>HF_TOKEN=hf_xxx                    # HuggingFace token (optional, removes rate limits)</w:t>
-      </w:r>
-    </w:p>
-    <w:p>
-      <w:pPr>
-        <w:shd w:val="clear" w:color="auto" w:fill="F5F5F5"/>
-        <w:ind w:left="360"/>
-      </w:pPr>
-      <w:r>
-        <w:rPr>
-          <w:rFonts w:ascii="Courier New" w:eastAsia="Courier New" w:hAnsi="Courier New" w:cs="Courier New"/>
-          <w:sz w:val="20"/>
-          <w:szCs w:val="20"/>
-        </w:rPr>
-        <w:t>DEVICE=auto                        # auto | cuda | mps | cpu</w:t>
-      </w:r>
-    </w:p>
-    <w:p>
-      <w:pPr>
-        <w:shd w:val="clear" w:color="auto" w:fill="F5F5F5"/>
-        <w:ind w:left="360"/>
-      </w:pPr>
-      <w:r>
-        <w:rPr>
-          <w:rFonts w:ascii="Courier New" w:eastAsia="Courier New" w:hAnsi="Courier New" w:cs="Courier New"/>
-          <w:sz w:val="20"/>
-          <w:szCs w:val="20"/>
-        </w:rPr>
-        <w:t>XTTS_MODEL_NAME=tts_models/multilingual/multi-dataset/xtts_v2</w:t>
-      </w:r>
-    </w:p>
-    <w:p>
-      <w:pPr>
-        <w:shd w:val="clear" w:color="auto" w:fill="F5F5F5"/>
-        <w:ind w:left="360"/>
-      </w:pPr>
-      <w:r>
-        <w:rPr>
-          <w:rFonts w:ascii="Courier New" w:eastAsia="Courier New" w:hAnsi="Courier New" w:cs="Courier New"/>
-          <w:sz w:val="20"/>
-          <w:szCs w:val="20"/>
-        </w:rPr>
-        <w:t>TARGET_SAMPLE_RATE=24000</w:t>
-      </w:r>
-    </w:p>
-    <w:p>
-      <w:pPr>
-        <w:shd w:val="clear" w:color="auto" w:fill="F5F5F5"/>
-        <w:ind w:left="360"/>
-      </w:pPr>
-      <w:r>
-        <w:rPr>
-          <w:rFonts w:ascii="Courier New" w:eastAsia="Courier New" w:hAnsi="Courier New" w:cs="Courier New"/>
-          <w:sz w:val="20"/>
-          <w:szCs w:val="20"/>
-        </w:rPr>
-        <w:t>TARGET_LOUDNESS_DB=-20.0</w:t>
-      </w:r>
-    </w:p>
-    <w:p>
-      <w:pPr>
-        <w:shd w:val="clear" w:color="auto" w:fill="F5F5F5"/>
-        <w:ind w:left="360"/>
-      </w:pPr>
-      <w:r>
-        <w:rPr>
-          <w:rFonts w:ascii="Courier New" w:eastAsia="Courier New" w:hAnsi="Courier New" w:cs="Courier New"/>
-          <w:sz w:val="20"/>
-          <w:szCs w:val="20"/>
-        </w:rPr>
-        <w:t>HOST=0.0.0.0</w:t>
-      </w:r>
-    </w:p>
-    <w:p>
-      <w:pPr>
-        <w:shd w:val="clear" w:color="auto" w:fill="F5F5F5"/>
-        <w:ind w:left="360"/>
-      </w:pPr>
-      <w:r>
-        <w:rPr>
-          <w:rFonts w:ascii="Courier New" w:eastAsia="Courier New" w:hAnsi="Courier New" w:cs="Courier New"/>
-          <w:sz w:val="20"/>
-          <w:szCs w:val="20"/>
-        </w:rPr>
-        <w:t>PORT=8000</w:t>
-      </w:r>
-    </w:p>
-    <w:p>
-      <w:pPr>
-        <w:shd w:val="clear" w:color="auto" w:fill="F5F5F5"/>
-        <w:ind w:left="360"/>
-      </w:pPr>
-      <w:r>
-        <w:rPr>
-          <w:rFonts w:ascii="Courier New" w:eastAsia="Courier New" w:hAnsi="Courier New" w:cs="Courier New"/>
-          <w:sz w:val="20"/>
-          <w:szCs w:val="20"/>
-        </w:rPr>
-        <w:t>LOG_LEVEL=info</w:t>
-      </w:r>
-    </w:p>
-    <w:p>
-      <w:pPr>
-        <w:spacing w:after="200"/>
-      </w:pPr>
-    </w:p>
-    <w:p>
-      <w:pPr>
-        <w:pStyle w:val="Heading1"/>
-      </w:pPr>
-      <w:r>
-        <w:t>17. Conclusion</w:t>
+        <w:t>TTS Agent v3.0.0 is a production-grade, commercially oriented local TTS system designed for professional narration, custom voice replication, and broadcast media production. It ships two complementary synthesis engines: Kokoro-82M for consistent, high-quality built-in voices, and XTTS v2 for zero-shot voice cloning across 17 languages.</w:t>
       </w:r>
     </w:p>
     <w:p>
@@ -10441,20 +10700,12 @@
         <w:spacing w:after="120"/>
       </w:pPr>
       <w:r>
-        <w:t>TTS Agent v3.0.0 is a production-grade, commercially oriented local TTS system designed for professional narration, custom voice replication, and broadcast media production. It ships two complementary synthesis engines: Kokoro-82M for consistent, high-quality built-in voices, and XTTS v2 for zero-shot voice cloning across 17 languages.</w:t>
-      </w:r>
-    </w:p>
-    <w:p>
-      <w:pPr>
-        <w:spacing w:after="120"/>
-      </w:pPr>
-      <w:r>
         <w:t>The architecture is locally deployed, GPU-accelerated (CUDA / MPS / CPU), and privacy-preserving. All voice samples and generated audio remain on the host machine.</w:t>
       </w:r>
     </w:p>
     <w:sectPr>
-      <w:headerReference w:type="default" r:id="rId7"/>
-      <w:footerReference w:type="default" r:id="rId8"/>
+      <w:headerReference w:type="default" r:id="rId8"/>
+      <w:footerReference w:type="default" r:id="rId9"/>
       <w:pgSz w:w="12240" w:h="15840"/>
       <w:pgMar w:top="1440" w:right="1440" w:bottom="1440" w:left="1440" w:header="708" w:footer="708" w:gutter="0"/>
       <w:cols w:space="720"/>
@@ -11275,6 +11526,7 @@
   </w:style>
   <w:style w:type="paragraph" w:styleId="Heading2">
     <w:name w:val="heading 2"/>
+    <w:link w:val="Heading2Char"/>
     <w:uiPriority w:val="9"/>
     <w:unhideWhenUsed/>
     <w:qFormat/>
@@ -11352,7 +11604,6 @@
   <w:style w:type="character" w:default="1" w:styleId="DefaultParagraphFont">
     <w:name w:val="Default Paragraph Font"/>
     <w:uiPriority w:val="1"/>
-    <w:semiHidden/>
     <w:unhideWhenUsed/>
   </w:style>
   <w:style w:type="table" w:default="1" w:styleId="TableNormal">
@@ -11466,6 +11717,32 @@
     <w:rPr>
       <w:sz w:val="20"/>
       <w:szCs w:val="20"/>
+    </w:rPr>
+  </w:style>
+  <w:style w:type="character" w:customStyle="1" w:styleId="Heading2Char">
+    <w:name w:val="Heading 2 Char"/>
+    <w:basedOn w:val="DefaultParagraphFont"/>
+    <w:link w:val="Heading2"/>
+    <w:uiPriority w:val="9"/>
+    <w:rsid w:val="00652A6D"/>
+    <w:rPr>
+      <w:b/>
+      <w:bCs/>
+      <w:color w:val="2E5094"/>
+      <w:sz w:val="26"/>
+      <w:szCs w:val="26"/>
+    </w:rPr>
+  </w:style>
+  <w:style w:type="character" w:styleId="UnresolvedMention">
+    <w:name w:val="Unresolved Mention"/>
+    <w:basedOn w:val="DefaultParagraphFont"/>
+    <w:uiPriority w:val="99"/>
+    <w:semiHidden/>
+    <w:unhideWhenUsed/>
+    <w:rsid w:val="00652A6D"/>
+    <w:rPr>
+      <w:color w:val="605E5C"/>
+      <w:shd w:val="clear" w:color="auto" w:fill="E1DFDD"/>
     </w:rPr>
   </w:style>
 </w:styles>

</xml_diff>